<commit_message>
Paper: sharpen abstract and contributions (gap-first framing, three contributions)
</commit_message>
<xml_diff>
--- a/paper/draft_v1.docx
+++ b/paper/draft_v1.docx
@@ -53,7 +53,7 @@
         <w:jc w:val="both"/>
       </w:pPr>
       <w:r>
-        <w:t>Multi-view RGB-D world models such as Geo4D (Liu et al., 2025) let a robot plan in 3D, but their iterative samplers are too slow for closed-loop control: the released Geo4D checkpoint needs 25 UNet evaluations and 21.8 s per prediction on an RTX 5090. Few-step distillation is the standard remedy for single-view video diffusion, yet it has not been evaluated on a multi-view RGB-D model, and pixel metrics alone cannot tell whether geometry survives. We first show that cutting the Geo4D sampler to one to four steps without training raises PSNR while seed diversity, LPIPS and sharpness degrade, so pixel metrics hide the collapse. We then distill the teacher into a three-step generator with distribution matching distillation in EDM sigma space, sample by re-noising x₀ predictions, and correct a global depth scale shift with a per-view scale anchored to the conditioning pointmap, which needs no ground truth. Two negative results, ODE-regression initialization and a ground-truth-supervised cross-view depth loss, are reported as such. With bf16 inference and the per-view input anchor, the student runs in 1.64 s on one RTX 5090 (13.3x faster than the 21.8 s teacher), its sharpness and seed diversity are statistically indistinguishable from the teacher's, and it loses a small but significant amount of depth accuracy (AbsRel +0.015) and perceptual quality (LPIPS +0.018).</w:t>
+        <w:t>Multi-view RGB-D world models such as Geo4D (Liu et al., 2025) predict future pointmaps and images for several cameras but are too slow for closed-loop control: Geo4D needs 25 UNet evaluations and 21.8 s per prediction on an RTX 5090. Few-step distillation is the standard remedy for single-view video diffusion; on a multi-view RGB-D model we identify two failure modes. A training-free three-step sampler keeps depth accuracy and raises PSNR, yet seed diversity drops by 47% and four seeds produce the same image: a collapse toward the conditional mean that pixel metrics hide. Distribution matching distillation in EDM sigma space, with a re-noising three-step sampler and no classifier-free guidance, restores sharpness and diversity, but the student predicts depth about 9% too far, a global per-view scale shift; an affine fit explains 97% of the gap. Since the conditioning pointmap is a model input, we align the predicted first frame to it with a per-view scale at inference, using camera extrinsics for the second view and no ground truth. This reduces the student's AbsRel from 0.175 to 0.082 and also improves the teacher (0.072 to 0.060). In bf16 the student runs in 1.64 s (13.3x faster than the teacher) with teacher-level sharpness (p=0.95) and seed diversity (p=0.84); AbsRel rises by 0.015 and LPIPS by 0.018, both significant. We report ODE-regression initialization and a ground-truth-supervised cross-view depth loss as negative results.</w:t>
       </w:r>
     </w:p>
     <w:p>
@@ -175,7 +175,31 @@
         <w:jc w:val="both"/>
       </w:pPr>
       <w:r>
-        <w:t>In summary, our contributions are: (1) the first geometry-aware evaluation of few-step distillation for a multi-view RGB-D world model, with a protocol that measures per-view depth accuracy, perceptual quality, sharpness, seed diversity and cross-view consistency jointly and tests each difference against the teacher with paired statistics; (2) a set of evaluation findings and pitfalls: pixel metrics hide few-step collapse, the metrics collapse in a fixed order, a cross-view chamfer distance rewards consistent errors, and on average 53% (35-55% per sample) of the right-view ground-truth pixels produced by the released dataset transform are transformed invalid pixels that distort depth metrics unless masked; (3) an input-anchored per-view depth calibration that requires no ground truth, reduces the student's AbsRel from 0.175 to 0.082 against a teacher value of 0.066, and also improves the teacher; (4) two negative results, ODE-regression initialization and ground-truth-supervised cross-view geometry loss under DMD, together with a three-step student that is 13.3x faster than Geo4D with teacher-level sharpness and diversity.</w:t>
+        <w:t>In summary, our contributions are:</w:t>
+      </w:r>
+    </w:p>
+    <w:p>
+      <w:pPr>
+        <w:jc w:val="both"/>
+      </w:pPr>
+      <w:r>
+        <w:t>(1) We identify what few-step sampling costs a multi-view RGB-D world model and show that pixel metrics hide it. Reducing the Geo4D sampler to three steps without training raises PSNR and keeps AbsRel while seed diversity drops by 47% and four seeds yield the same image; the metrics collapse in a fixed order (diversity, then LPIPS, then geometry, never PSNR); a cross-view chamfer distance rewards two views that are wrong in the same way; and on average 53% of the right-view ground-truth pixels produced by the released dataset transform are transformed invalid pixels that must be masked. We therefore evaluate per-view depth AbsRel, LPIPS, sharpness, seed diversity and cross-view chamfer jointly, with paired Wilcoxon signed-rank tests over 40 view-samples and a training-free few-step teacher as a control row.</w:t>
+      </w:r>
+    </w:p>
+    <w:p>
+      <w:pPr>
+        <w:jc w:val="both"/>
+      </w:pPr>
+      <w:r>
+        <w:t>(2) A distillation recipe for the Geo4D generator: distribution matching distillation moved to EDM sigma space with DMD2 backward simulation, a three-sigma student sampled by predicting x₀ and re-noising to the next sigma, no classifier-free guidance (halving the cost of each UNet call), and checkpoint selection by the ratio of student to teacher latent standard deviation. In bf16 the student runs in 1.64 s on one RTX 5090, 13.3x faster than the 21.8 s teacher, with sharpness (p=0.95) and seed diversity (p=0.84) statistically indistinguishable from the teacher's and small but significant losses in AbsRel (+0.015) and LPIPS (+0.018). Two negative results are reported as such: initializing the student by regressing teacher ODE trajectories converges to the mean even with true intermediate states, and adding a cross-view depth-ratio loss to DMD (targeting the teacher's ratio in one run and the ground-truth ratio in two) reduced sharpness in all three configurations we tried.</w:t>
+      </w:r>
+    </w:p>
+    <w:p>
+      <w:pPr>
+        <w:jc w:val="both"/>
+      </w:pPr>
+      <w:r>
+        <w:t>(3) A per-view input-anchored depth calibration that corrects the depth-scale drift of the distilled Geo4D student without ground truth. We identify that the student's residual depth error is a global per-view scale shift of about 9%, of which an affine fit explains 97%; because the conditioning pointmap is an input to the model, a per-view scale that aligns the predicted first frame to it is available at test time, with the camera extrinsics bringing the right view's conditioning pointmap into the reference frame. The anchor reduces the student's AbsRel from 0.175 to 0.082 and also improves the teacher (0.072 to 0.060).</w:t>
       </w:r>
     </w:p>
     <w:p>

</xml_diff>

<commit_message>
Paper: self-anchor, longer-training, policy-proxy results and equivalence margins
</commit_message>
<xml_diff>
--- a/paper/draft_v1.docx
+++ b/paper/draft_v1.docx
@@ -167,7 +167,7 @@
         <w:jc w:val="both"/>
       </w:pPr>
       <w:r>
-        <w:t>On 20 samples (40 view-samples) of the PlaceAppleFromBowlIntoBin task, the three-step student runs in 1.64 s on one RTX 5090, 13.3x faster than the 21.8 s teacher, and meets the 2 s quasi-static budget (1.18 s with torch.compile, timed on 5 samples). Its sharpness (p=0.95) and seed diversity (p=0.84) are statistically indistinguishable from the teacher's, while AbsRel is higher by 0.015 (p&lt;0.001) and LPIPS by 0.018 (p&lt;0.001). The training-free three-step teacher is also fast (2.81 s in fp32) and keeps the teacher's AbsRel, but loses 47% of its seed diversity, and the one-step student halves diversity and raises LPIPS to 0.177; neither meets the quality bar. The humanoid and dynamic budgets remain open, because even with the compiled decoder 0.63 s of conditioner and decoder cost (0.98 s in the bf16 headline configuration) is independent of the number of steps.</w:t>
+        <w:t>On 20 samples (40 view-samples) of the PlaceAppleFromBowlIntoBin task, the three-step student runs in 1.64 s on one RTX 5090, 13.3x faster than the 21.8 s teacher, and meets the 2 s quasi-static budget (1.18 s with torch.compile, timed on 5 samples). Its sharpness (p=0.95) and seed diversity (p=0.84) are statistically indistinguishable from the teacher's, while AbsRel is higher by 0.015 (p&lt;0.001) and LPIPS by 0.018 (p&lt;0.001). The training-free three-step teacher is also fast (2.81 s in fp32) and keeps the teacher's AbsRel, but loses 47% of its seed diversity, and the one-step student halves diversity and raises LPIPS to 0.177; neither meets the quality bar. The humanoid and dynamic budgets remain open, because even with the compiled decoder 0.63 s of conditioner and decoder cost (0.98 s in the bf16 headline configuration) is independent of the number of steps. A self-anchored training loss that applies the same calibration during training removes most of the raw scale shift (0.175 to 0.102 without inference-time correction) but has not yet recovered teacher sharpness (Section 4.5).</w:t>
       </w:r>
     </w:p>
     <w:p>
@@ -1198,6 +1198,29 @@
         <w:rPr>
           <w:b/>
         </w:rPr>
+        <w:t>Equivalence margins.</w:t>
+      </w:r>
+      <w:r>
+        <w:t xml:space="preserve"> A non-significant Wilcoxon test does not show that two methods are equal, so besides p-values we report the 90% confidence interval of the paired difference and call a metric preserved only if the interval lies inside a pre-set margin </w:t>
+      </w:r>
+      <w:r>
+        <w:rPr>
+          <w:i/>
+        </w:rPr>
+        <w:t>[-δ, +δ]</w:t>
+      </w:r>
+      <w:r>
+        <w:t xml:space="preserve"> (two one-sided tests, TOST). The margins are our choice, grounded as follows: PSNR 0.5 dB (a common significance threshold, about half of one just-noticeable difference); AbsRel 0.005 strict (about one generation of progress on KITTI and NYU in Depth Anything V2; Yang et al., 2024) and 0.010 practical (half of the ±2% specification of a RealSense D435, about 1 cm at 1 m, the depth noise a closed-loop grasp tolerates); LPIPS 0.05 perceptual (a difference below 0.05 gives about 52% human agreement; Hou et al., 2022) and 0.01 strict; sharpness ±5% (half of the 11% loss of the training-free 3-step teacher); diversity ±10%; CV-Chamfer one-sided, not worse; gripper centroid error +1 cm strict (the 3 to 10 mm noise of current 6-DoF pose trackers) and +2 cm practical (a pose error above 2 cm fails a grasp with a 4 cm stroke; Tremblay et al., 2020). With 40 view-samples the minimal detectable paired effects are 0.26 dB PSNR, 0.010 AbsRel, 0.004 LPIPS, 0.0004 sharpness, 0.0042 diversity (n=6 view-samples), and 0.034 CV-Chamfer (n=20 samples). Under these margins the main 3-step student passes PSNR, sharpness, CV-Chamfer, and the perceptual LPIPS margin, fails AbsRel and the strict LPIPS margin, passes diversity only provisionally because its interval is wider than the margin, and is borderline on the practical gripper-centroid margin (Section 4.3, Appendix A.6).</w:t>
+      </w:r>
+    </w:p>
+    <w:p>
+      <w:pPr>
+        <w:jc w:val="both"/>
+      </w:pPr>
+      <w:r>
+        <w:rPr>
+          <w:b/>
+        </w:rPr>
         <w:t>Metrics.</w:t>
       </w:r>
       <w:r>
@@ -4204,7 +4227,7 @@
         <w:t>Anchored student versus teacher.</w:t>
       </w:r>
       <w:r>
-        <w:t xml:space="preserve"> Paired over the 40 view-samples, the 3-step student differs from the 25-step teacher by −0.19 dB PSNR (p=0.026), +0.015 AbsRel (p&lt;0.001; left +0.008, right +0.022), and +0.018 LPIPS (p&lt;0.001). Sharpness (+0.0001, p=0.95) and diversity (−0.0004, p=0.84) are indistinguishable from the teacher, and CV-Chamfer is lower by 0.034 (p=0.006).</w:t>
+        <w:t xml:space="preserve"> Paired over the 40 view-samples, the 3-step student differs from the 25-step teacher by −0.19 dB PSNR (p=0.026), +0.015 AbsRel (p&lt;0.001; left +0.008, right +0.022), and +0.018 LPIPS (p&lt;0.001). Sharpness (+0.0001, p=0.95) and diversity (−0.0004, p=0.84) are indistinguishable from the teacher, and CV-Chamfer is lower by 0.034 (p=0.006). The 90% confidence intervals of the paired differences are AbsRel +0.0155 [+0.010, +0.021], LPIPS +0.018 [+0.015, +0.020], PSNR −0.19 dB [−0.34, −0.04], sharpness +0.0002 [−0.0000, +0.0005], and diversity −0.0003 [−0.0027, +0.0021], which under the margins of Section 4.1 means that AbsRel is not preserved, LPIPS is preserved only at the perceptual margin, and PSNR and sharpness are preserved.</w:t>
       </w:r>
     </w:p>
     <w:p>
@@ -6733,7 +6756,7 @@
         <w:t>λ = 1</w:t>
       </w:r>
       <w:r>
-        <w:t xml:space="preserve"> made the cross-view gradient 500 times the DMD gradient and erased distillation. Table 5 summarizes the three runs; all lost sharpness. A supervision signal that contradicts the teacher distribution fights the distillation objective, whereas the input-only anchor, which never enters training, does not. The target in 6b2 and 6b3 was the contaminated right-view ground truth of Section 4.1, so whether a clean target also conflicts is unverified. A self-anchor loss that matches predicted frame-0 depth to the conditioning depth without ground truth is implemented and training is in progress at the time of writing; we report no result for it.</w:t>
+        <w:t xml:space="preserve"> made the cross-view gradient 500 times the DMD gradient and erased distillation. Table 5 summarizes the three runs; all lost sharpness. A supervision signal that contradicts the teacher distribution fights the distillation objective, whereas the input-only anchor, which never enters training, does not. The target in 6b2 and 6b3 was the contaminated right-view ground truth of Section 4.1, so whether a clean target also conflicts is unverified.</w:t>
       </w:r>
     </w:p>
     <w:p>
@@ -7222,6 +7245,1847 @@
         <w:rPr>
           <w:b/>
         </w:rPr>
+        <w:t>Self-anchored training loss (preliminary).</w:t>
+      </w:r>
+      <w:r>
+        <w:t xml:space="preserve"> The anchor of Section 3.4 can also be applied during training, again without ground truth. In run 6d we add to DMD a log-L1 loss between the decoded depth of predicted frame 0 of each view and the depth of that view's conditioning frame: the left view is matched to its conditioning pointmap directly, and the right view to its conditioning pointmap transformed into the reference frame with </w:t>
+      </w:r>
+      <w:r>
+        <w:rPr>
+          <w:i/>
+        </w:rPr>
+        <w:t>E_L⁻¹ E_R</w:t>
+      </w:r>
+      <w:r>
+        <w:t xml:space="preserve">. The weight is balanced at the </w:t>
+      </w:r>
+      <w:r>
+        <w:rPr>
+          <w:i/>
+        </w:rPr>
+        <w:t>x₀</w:t>
+      </w:r>
+      <w:r>
+        <w:t>-gradient level as for the cross-view loss (</w:t>
+      </w:r>
+      <w:r>
+        <w:rPr>
+          <w:i/>
+        </w:rPr>
+        <w:t>β = 1</w:t>
+      </w:r>
+      <w:r>
+        <w:t>), and the recipe is otherwise that of the main student (v2 initialization, 2000 steps, 1 h, peak 27.3 GB). Predicted frame 0 lies 5 dataset steps after the conditioning frame, so the 2 to 3% of pixels on the moving robot are also pulled toward the conditioning depth; a flag that excludes robot pixels exists but was not used. The training diagnostic rises more slowly than for the main student (0.79 at step 0, 0.889 at 800, 0.951 at 1300, 0.980 at 1600, and 0.998 at 1900, where the main student reached 0.99 at step 1000) and does not overshoot by step 2000; the anchor loss falls from 0.41 to 0.08 and the final anchor scales are 0.987 (left) and 0.966 (right). Table 6 reports the 20-sample evaluation. The loss removes most of the raw scale shift, from 0.175 to 0.102 without any inference-time anchor, and closes the left/right gap after anchoring (0.081/0.082 against 0.076/0.088 for the main student), but at step 2000 sharpness is 18% below the teacher's and LPIPS is 0.030 higher (paired over 40 view-samples: sharpness −0.0024, p&lt;0.001; LPIPS +0.030, p&lt;0.001; AbsRel +0.015, p&lt;0.001; PSNR −0.21 dB, p=0.034; diversity −0.0001, p=1.00). Both sharpness and LPIPS improve from step 1600 to step 2000, so the run is not converged; an extension to 4000 steps is running at the time of writing and is not reported.</w:t>
+      </w:r>
+    </w:p>
+    <w:p>
+      <w:pPr>
+        <w:jc w:val="both"/>
+      </w:pPr>
+      <w:r>
+        <w:t>Table 6: Self-anchored training loss (run 6d), 20 samples, fake pixels excluded. Raw AbsRel is measured without the inference-time anchor, anchored AbsRel with the per-view anchor; sharpness is given relative to the teacher in parentheses. The loss removes most of the raw scale shift and equalizes the two views, but sharpness and LPIPS have not recovered by step 2000.</w:t>
+      </w:r>
+    </w:p>
+    <w:p>
+      <w:pPr>
+        <w:jc w:val="center"/>
+      </w:pPr>
+    </w:p>
+    <w:tbl>
+      <w:tblPr>
+        <w:tblStyle w:val="TableGrid"/>
+        <w:tblW w:type="auto" w:w="0"/>
+        <w:jc w:val="center"/>
+        <w:tblLook w:firstColumn="1" w:firstRow="1" w:lastColumn="0" w:lastRow="0" w:noHBand="0" w:noVBand="1" w:val="04A0"/>
+        <w:tblBorders>
+          <w:top w:val="nil"/>
+          <w:left w:val="nil"/>
+          <w:bottom w:val="nil"/>
+          <w:right w:val="nil"/>
+          <w:insideH w:val="nil"/>
+          <w:insideV w:val="nil"/>
+        </w:tblBorders>
+      </w:tblPr>
+      <w:tblGrid>
+        <w:gridCol w:w="1337"/>
+        <w:gridCol w:w="1337"/>
+        <w:gridCol w:w="1337"/>
+        <w:gridCol w:w="1337"/>
+        <w:gridCol w:w="1337"/>
+        <w:gridCol w:w="1337"/>
+        <w:gridCol w:w="1337"/>
+      </w:tblGrid>
+      <w:tr>
+        <w:tc>
+          <w:tcPr>
+            <w:tcW w:type="dxa" w:w="1337"/>
+            <w:tcBorders>
+              <w:top w:val="single" w:sz="8" w:color="000000"/>
+              <w:bottom w:val="single" w:sz="4" w:color="000000"/>
+            </w:tcBorders>
+          </w:tcPr>
+          <w:p>
+            <w:pPr>
+              <w:spacing w:after="0" w:before="0"/>
+              <w:jc w:val="left"/>
+            </w:pPr>
+            <w:r>
+              <w:rPr>
+                <w:b/>
+                <w:sz w:val="17"/>
+              </w:rPr>
+            </w:r>
+            <w:r>
+              <w:rPr>
+                <w:b/>
+                <w:sz w:val="17"/>
+              </w:rPr>
+              <w:t>ckpt</w:t>
+            </w:r>
+          </w:p>
+        </w:tc>
+        <w:tc>
+          <w:tcPr>
+            <w:tcW w:type="dxa" w:w="1337"/>
+            <w:tcBorders>
+              <w:top w:val="single" w:sz="8" w:color="000000"/>
+              <w:bottom w:val="single" w:sz="4" w:color="000000"/>
+            </w:tcBorders>
+          </w:tcPr>
+          <w:p>
+            <w:pPr>
+              <w:spacing w:after="0" w:before="0"/>
+              <w:jc w:val="center"/>
+            </w:pPr>
+            <w:r>
+              <w:rPr>
+                <w:b/>
+                <w:sz w:val="17"/>
+              </w:rPr>
+            </w:r>
+            <w:r>
+              <w:rPr>
+                <w:b/>
+                <w:sz w:val="17"/>
+              </w:rPr>
+              <w:t>raw AbsRel (no anchor)</w:t>
+            </w:r>
+          </w:p>
+        </w:tc>
+        <w:tc>
+          <w:tcPr>
+            <w:tcW w:type="dxa" w:w="1337"/>
+            <w:tcBorders>
+              <w:top w:val="single" w:sz="8" w:color="000000"/>
+              <w:bottom w:val="single" w:sz="4" w:color="000000"/>
+            </w:tcBorders>
+          </w:tcPr>
+          <w:p>
+            <w:pPr>
+              <w:spacing w:after="0" w:before="0"/>
+              <w:jc w:val="center"/>
+            </w:pPr>
+            <w:r>
+              <w:rPr>
+                <w:b/>
+                <w:sz w:val="17"/>
+              </w:rPr>
+            </w:r>
+            <w:r>
+              <w:rPr>
+                <w:b/>
+                <w:sz w:val="17"/>
+              </w:rPr>
+              <w:t>anchored AbsRel (L/R)</w:t>
+            </w:r>
+          </w:p>
+        </w:tc>
+        <w:tc>
+          <w:tcPr>
+            <w:tcW w:type="dxa" w:w="1337"/>
+            <w:tcBorders>
+              <w:top w:val="single" w:sz="8" w:color="000000"/>
+              <w:bottom w:val="single" w:sz="4" w:color="000000"/>
+            </w:tcBorders>
+          </w:tcPr>
+          <w:p>
+            <w:pPr>
+              <w:spacing w:after="0" w:before="0"/>
+              <w:jc w:val="center"/>
+            </w:pPr>
+            <w:r>
+              <w:rPr>
+                <w:b/>
+                <w:sz w:val="17"/>
+              </w:rPr>
+            </w:r>
+            <w:r>
+              <w:rPr>
+                <w:b/>
+                <w:sz w:val="17"/>
+              </w:rPr>
+              <w:t>LPIPS ↓</w:t>
+            </w:r>
+          </w:p>
+        </w:tc>
+        <w:tc>
+          <w:tcPr>
+            <w:tcW w:type="dxa" w:w="1337"/>
+            <w:tcBorders>
+              <w:top w:val="single" w:sz="8" w:color="000000"/>
+              <w:bottom w:val="single" w:sz="4" w:color="000000"/>
+            </w:tcBorders>
+          </w:tcPr>
+          <w:p>
+            <w:pPr>
+              <w:spacing w:after="0" w:before="0"/>
+              <w:jc w:val="center"/>
+            </w:pPr>
+            <w:r>
+              <w:rPr>
+                <w:b/>
+                <w:sz w:val="17"/>
+              </w:rPr>
+            </w:r>
+            <w:r>
+              <w:rPr>
+                <w:b/>
+                <w:sz w:val="17"/>
+              </w:rPr>
+              <w:t>sharpness</w:t>
+            </w:r>
+          </w:p>
+        </w:tc>
+        <w:tc>
+          <w:tcPr>
+            <w:tcW w:type="dxa" w:w="1337"/>
+            <w:tcBorders>
+              <w:top w:val="single" w:sz="8" w:color="000000"/>
+              <w:bottom w:val="single" w:sz="4" w:color="000000"/>
+            </w:tcBorders>
+          </w:tcPr>
+          <w:p>
+            <w:pPr>
+              <w:spacing w:after="0" w:before="0"/>
+              <w:jc w:val="center"/>
+            </w:pPr>
+            <w:r>
+              <w:rPr>
+                <w:b/>
+                <w:sz w:val="17"/>
+              </w:rPr>
+            </w:r>
+            <w:r>
+              <w:rPr>
+                <w:b/>
+                <w:sz w:val="17"/>
+              </w:rPr>
+              <w:t>PSNR ↑</w:t>
+            </w:r>
+          </w:p>
+        </w:tc>
+        <w:tc>
+          <w:tcPr>
+            <w:tcW w:type="dxa" w:w="1337"/>
+            <w:tcBorders>
+              <w:top w:val="single" w:sz="8" w:color="000000"/>
+              <w:bottom w:val="single" w:sz="4" w:color="000000"/>
+            </w:tcBorders>
+          </w:tcPr>
+          <w:p>
+            <w:pPr>
+              <w:spacing w:after="0" w:before="0"/>
+              <w:jc w:val="center"/>
+            </w:pPr>
+            <w:r>
+              <w:rPr>
+                <w:b/>
+                <w:sz w:val="17"/>
+              </w:rPr>
+            </w:r>
+            <w:r>
+              <w:rPr>
+                <w:b/>
+                <w:sz w:val="17"/>
+              </w:rPr>
+              <w:t>diversity</w:t>
+            </w:r>
+          </w:p>
+        </w:tc>
+      </w:tr>
+      <w:tr>
+        <w:tc>
+          <w:tcPr>
+            <w:tcW w:type="dxa" w:w="1337"/>
+          </w:tcPr>
+          <w:p>
+            <w:pPr>
+              <w:spacing w:after="0" w:before="0"/>
+              <w:jc w:val="left"/>
+            </w:pPr>
+            <w:r>
+              <w:rPr>
+                <w:sz w:val="17"/>
+              </w:rPr>
+            </w:r>
+            <w:r>
+              <w:rPr>
+                <w:sz w:val="17"/>
+              </w:rPr>
+              <w:t>teacher (25 steps)</w:t>
+            </w:r>
+          </w:p>
+        </w:tc>
+        <w:tc>
+          <w:tcPr>
+            <w:tcW w:type="dxa" w:w="1337"/>
+          </w:tcPr>
+          <w:p>
+            <w:pPr>
+              <w:spacing w:after="0" w:before="0"/>
+              <w:jc w:val="center"/>
+            </w:pPr>
+            <w:r>
+              <w:rPr>
+                <w:sz w:val="17"/>
+              </w:rPr>
+            </w:r>
+            <w:r>
+              <w:rPr>
+                <w:sz w:val="17"/>
+              </w:rPr>
+              <w:t>0.066 (0.067/0.066)</w:t>
+            </w:r>
+          </w:p>
+        </w:tc>
+        <w:tc>
+          <w:tcPr>
+            <w:tcW w:type="dxa" w:w="1337"/>
+          </w:tcPr>
+          <w:p>
+            <w:pPr>
+              <w:spacing w:after="0" w:before="0"/>
+              <w:jc w:val="center"/>
+            </w:pPr>
+            <w:r>
+              <w:rPr>
+                <w:sz w:val="17"/>
+              </w:rPr>
+            </w:r>
+            <w:r>
+              <w:rPr>
+                <w:sz w:val="17"/>
+              </w:rPr>
+              <w:t>—</w:t>
+            </w:r>
+          </w:p>
+        </w:tc>
+        <w:tc>
+          <w:tcPr>
+            <w:tcW w:type="dxa" w:w="1337"/>
+          </w:tcPr>
+          <w:p>
+            <w:pPr>
+              <w:spacing w:after="0" w:before="0"/>
+              <w:jc w:val="center"/>
+            </w:pPr>
+            <w:r>
+              <w:rPr>
+                <w:sz w:val="17"/>
+              </w:rPr>
+            </w:r>
+            <w:r>
+              <w:rPr>
+                <w:sz w:val="17"/>
+              </w:rPr>
+              <w:t>0.118</w:t>
+            </w:r>
+          </w:p>
+        </w:tc>
+        <w:tc>
+          <w:tcPr>
+            <w:tcW w:type="dxa" w:w="1337"/>
+          </w:tcPr>
+          <w:p>
+            <w:pPr>
+              <w:spacing w:after="0" w:before="0"/>
+              <w:jc w:val="center"/>
+            </w:pPr>
+            <w:r>
+              <w:rPr>
+                <w:sz w:val="17"/>
+              </w:rPr>
+            </w:r>
+            <w:r>
+              <w:rPr>
+                <w:sz w:val="17"/>
+              </w:rPr>
+              <w:t>0.0134</w:t>
+            </w:r>
+          </w:p>
+        </w:tc>
+        <w:tc>
+          <w:tcPr>
+            <w:tcW w:type="dxa" w:w="1337"/>
+          </w:tcPr>
+          <w:p>
+            <w:pPr>
+              <w:spacing w:after="0" w:before="0"/>
+              <w:jc w:val="center"/>
+            </w:pPr>
+            <w:r>
+              <w:rPr>
+                <w:sz w:val="17"/>
+              </w:rPr>
+            </w:r>
+            <w:r>
+              <w:rPr>
+                <w:sz w:val="17"/>
+              </w:rPr>
+              <w:t>20.62</w:t>
+            </w:r>
+          </w:p>
+        </w:tc>
+        <w:tc>
+          <w:tcPr>
+            <w:tcW w:type="dxa" w:w="1337"/>
+          </w:tcPr>
+          <w:p>
+            <w:pPr>
+              <w:spacing w:after="0" w:before="0"/>
+              <w:jc w:val="center"/>
+            </w:pPr>
+            <w:r>
+              <w:rPr>
+                <w:sz w:val="17"/>
+              </w:rPr>
+            </w:r>
+            <w:r>
+              <w:rPr>
+                <w:sz w:val="17"/>
+              </w:rPr>
+              <w:t>0.0227</w:t>
+            </w:r>
+          </w:p>
+        </w:tc>
+      </w:tr>
+      <w:tr>
+        <w:tc>
+          <w:tcPr>
+            <w:tcW w:type="dxa" w:w="1337"/>
+          </w:tcPr>
+          <w:p>
+            <w:pPr>
+              <w:spacing w:after="0" w:before="0"/>
+              <w:jc w:val="left"/>
+            </w:pPr>
+            <w:r>
+              <w:rPr>
+                <w:sz w:val="17"/>
+              </w:rPr>
+            </w:r>
+            <w:r>
+              <w:rPr>
+                <w:sz w:val="17"/>
+              </w:rPr>
+              <w:t>6a step 1600 (main student)</w:t>
+            </w:r>
+          </w:p>
+        </w:tc>
+        <w:tc>
+          <w:tcPr>
+            <w:tcW w:type="dxa" w:w="1337"/>
+          </w:tcPr>
+          <w:p>
+            <w:pPr>
+              <w:spacing w:after="0" w:before="0"/>
+              <w:jc w:val="center"/>
+            </w:pPr>
+            <w:r>
+              <w:rPr>
+                <w:sz w:val="17"/>
+              </w:rPr>
+            </w:r>
+            <w:r>
+              <w:rPr>
+                <w:sz w:val="17"/>
+              </w:rPr>
+              <w:t>0.175</w:t>
+            </w:r>
+          </w:p>
+        </w:tc>
+        <w:tc>
+          <w:tcPr>
+            <w:tcW w:type="dxa" w:w="1337"/>
+          </w:tcPr>
+          <w:p>
+            <w:pPr>
+              <w:spacing w:after="0" w:before="0"/>
+              <w:jc w:val="center"/>
+            </w:pPr>
+            <w:r>
+              <w:rPr>
+                <w:sz w:val="17"/>
+              </w:rPr>
+            </w:r>
+            <w:r>
+              <w:rPr>
+                <w:sz w:val="17"/>
+              </w:rPr>
+              <w:t>0.082 (0.076/0.088)</w:t>
+            </w:r>
+          </w:p>
+        </w:tc>
+        <w:tc>
+          <w:tcPr>
+            <w:tcW w:type="dxa" w:w="1337"/>
+          </w:tcPr>
+          <w:p>
+            <w:pPr>
+              <w:spacing w:after="0" w:before="0"/>
+              <w:jc w:val="center"/>
+            </w:pPr>
+            <w:r>
+              <w:rPr>
+                <w:sz w:val="17"/>
+              </w:rPr>
+            </w:r>
+            <w:r>
+              <w:rPr>
+                <w:sz w:val="17"/>
+              </w:rPr>
+              <w:t>0.136</w:t>
+            </w:r>
+          </w:p>
+        </w:tc>
+        <w:tc>
+          <w:tcPr>
+            <w:tcW w:type="dxa" w:w="1337"/>
+          </w:tcPr>
+          <w:p>
+            <w:pPr>
+              <w:spacing w:after="0" w:before="0"/>
+              <w:jc w:val="center"/>
+            </w:pPr>
+            <w:r>
+              <w:rPr>
+                <w:sz w:val="17"/>
+              </w:rPr>
+            </w:r>
+            <w:r>
+              <w:rPr>
+                <w:sz w:val="17"/>
+              </w:rPr>
+              <w:t>0.0136</w:t>
+            </w:r>
+          </w:p>
+        </w:tc>
+        <w:tc>
+          <w:tcPr>
+            <w:tcW w:type="dxa" w:w="1337"/>
+          </w:tcPr>
+          <w:p>
+            <w:pPr>
+              <w:spacing w:after="0" w:before="0"/>
+              <w:jc w:val="center"/>
+            </w:pPr>
+            <w:r>
+              <w:rPr>
+                <w:sz w:val="17"/>
+              </w:rPr>
+            </w:r>
+            <w:r>
+              <w:rPr>
+                <w:sz w:val="17"/>
+              </w:rPr>
+              <w:t>20.43</w:t>
+            </w:r>
+          </w:p>
+        </w:tc>
+        <w:tc>
+          <w:tcPr>
+            <w:tcW w:type="dxa" w:w="1337"/>
+          </w:tcPr>
+          <w:p>
+            <w:pPr>
+              <w:spacing w:after="0" w:before="0"/>
+              <w:jc w:val="center"/>
+            </w:pPr>
+            <w:r>
+              <w:rPr>
+                <w:sz w:val="17"/>
+              </w:rPr>
+            </w:r>
+            <w:r>
+              <w:rPr>
+                <w:sz w:val="17"/>
+              </w:rPr>
+              <w:t>0.0224</w:t>
+            </w:r>
+          </w:p>
+        </w:tc>
+      </w:tr>
+      <w:tr>
+        <w:tc>
+          <w:tcPr>
+            <w:tcW w:type="dxa" w:w="1337"/>
+          </w:tcPr>
+          <w:p>
+            <w:pPr>
+              <w:spacing w:after="0" w:before="0"/>
+              <w:jc w:val="left"/>
+            </w:pPr>
+            <w:r>
+              <w:rPr>
+                <w:sz w:val="17"/>
+              </w:rPr>
+            </w:r>
+            <w:r>
+              <w:rPr>
+                <w:sz w:val="17"/>
+              </w:rPr>
+              <w:t>6d step 1600</w:t>
+            </w:r>
+          </w:p>
+        </w:tc>
+        <w:tc>
+          <w:tcPr>
+            <w:tcW w:type="dxa" w:w="1337"/>
+          </w:tcPr>
+          <w:p>
+            <w:pPr>
+              <w:spacing w:after="0" w:before="0"/>
+              <w:jc w:val="center"/>
+            </w:pPr>
+            <w:r>
+              <w:rPr>
+                <w:sz w:val="17"/>
+              </w:rPr>
+            </w:r>
+            <w:r>
+              <w:rPr>
+                <w:sz w:val="17"/>
+              </w:rPr>
+              <w:t>0.118 (0.099/0.136)</w:t>
+            </w:r>
+          </w:p>
+        </w:tc>
+        <w:tc>
+          <w:tcPr>
+            <w:tcW w:type="dxa" w:w="1337"/>
+          </w:tcPr>
+          <w:p>
+            <w:pPr>
+              <w:spacing w:after="0" w:before="0"/>
+              <w:jc w:val="center"/>
+            </w:pPr>
+            <w:r>
+              <w:rPr>
+                <w:sz w:val="17"/>
+              </w:rPr>
+            </w:r>
+            <w:r>
+              <w:rPr>
+                <w:sz w:val="17"/>
+              </w:rPr>
+              <w:t>0.090 (0.086/0.093)</w:t>
+            </w:r>
+          </w:p>
+        </w:tc>
+        <w:tc>
+          <w:tcPr>
+            <w:tcW w:type="dxa" w:w="1337"/>
+          </w:tcPr>
+          <w:p>
+            <w:pPr>
+              <w:spacing w:after="0" w:before="0"/>
+              <w:jc w:val="center"/>
+            </w:pPr>
+            <w:r>
+              <w:rPr>
+                <w:sz w:val="17"/>
+              </w:rPr>
+            </w:r>
+            <w:r>
+              <w:rPr>
+                <w:sz w:val="17"/>
+              </w:rPr>
+              <w:t>0.162</w:t>
+            </w:r>
+          </w:p>
+        </w:tc>
+        <w:tc>
+          <w:tcPr>
+            <w:tcW w:type="dxa" w:w="1337"/>
+          </w:tcPr>
+          <w:p>
+            <w:pPr>
+              <w:spacing w:after="0" w:before="0"/>
+              <w:jc w:val="center"/>
+            </w:pPr>
+            <w:r>
+              <w:rPr>
+                <w:sz w:val="17"/>
+              </w:rPr>
+            </w:r>
+            <w:r>
+              <w:rPr>
+                <w:sz w:val="17"/>
+              </w:rPr>
+              <w:t>0.0096 (−28%)</w:t>
+            </w:r>
+          </w:p>
+        </w:tc>
+        <w:tc>
+          <w:tcPr>
+            <w:tcW w:type="dxa" w:w="1337"/>
+          </w:tcPr>
+          <w:p>
+            <w:pPr>
+              <w:spacing w:after="0" w:before="0"/>
+              <w:jc w:val="center"/>
+            </w:pPr>
+            <w:r>
+              <w:rPr>
+                <w:sz w:val="17"/>
+              </w:rPr>
+            </w:r>
+            <w:r>
+              <w:rPr>
+                <w:sz w:val="17"/>
+              </w:rPr>
+              <w:t>20.25</w:t>
+            </w:r>
+          </w:p>
+        </w:tc>
+        <w:tc>
+          <w:tcPr>
+            <w:tcW w:type="dxa" w:w="1337"/>
+          </w:tcPr>
+          <w:p>
+            <w:pPr>
+              <w:spacing w:after="0" w:before="0"/>
+              <w:jc w:val="center"/>
+            </w:pPr>
+            <w:r>
+              <w:rPr>
+                <w:sz w:val="17"/>
+              </w:rPr>
+            </w:r>
+            <w:r>
+              <w:rPr>
+                <w:sz w:val="17"/>
+              </w:rPr>
+              <w:t>0.0250</w:t>
+            </w:r>
+          </w:p>
+        </w:tc>
+      </w:tr>
+      <w:tr>
+        <w:tc>
+          <w:tcPr>
+            <w:tcW w:type="dxa" w:w="1337"/>
+            <w:tcBorders>
+              <w:bottom w:val="single" w:sz="8" w:color="000000"/>
+            </w:tcBorders>
+          </w:tcPr>
+          <w:p>
+            <w:pPr>
+              <w:spacing w:after="0" w:before="0"/>
+              <w:jc w:val="left"/>
+            </w:pPr>
+            <w:r>
+              <w:rPr>
+                <w:sz w:val="17"/>
+              </w:rPr>
+            </w:r>
+            <w:r>
+              <w:rPr>
+                <w:sz w:val="17"/>
+              </w:rPr>
+              <w:t>6d step 2000</w:t>
+            </w:r>
+          </w:p>
+        </w:tc>
+        <w:tc>
+          <w:tcPr>
+            <w:tcW w:type="dxa" w:w="1337"/>
+            <w:tcBorders>
+              <w:bottom w:val="single" w:sz="8" w:color="000000"/>
+            </w:tcBorders>
+          </w:tcPr>
+          <w:p>
+            <w:pPr>
+              <w:spacing w:after="0" w:before="0"/>
+              <w:jc w:val="center"/>
+            </w:pPr>
+            <w:r>
+              <w:rPr>
+                <w:sz w:val="17"/>
+              </w:rPr>
+            </w:r>
+            <w:r>
+              <w:rPr>
+                <w:sz w:val="17"/>
+              </w:rPr>
+              <w:t>0.102 (0.091/0.113)</w:t>
+            </w:r>
+          </w:p>
+        </w:tc>
+        <w:tc>
+          <w:tcPr>
+            <w:tcW w:type="dxa" w:w="1337"/>
+            <w:tcBorders>
+              <w:bottom w:val="single" w:sz="8" w:color="000000"/>
+            </w:tcBorders>
+          </w:tcPr>
+          <w:p>
+            <w:pPr>
+              <w:spacing w:after="0" w:before="0"/>
+              <w:jc w:val="center"/>
+            </w:pPr>
+            <w:r>
+              <w:rPr>
+                <w:sz w:val="17"/>
+              </w:rPr>
+            </w:r>
+            <w:r>
+              <w:rPr>
+                <w:sz w:val="17"/>
+              </w:rPr>
+              <w:t>0.081 (0.081/0.082)</w:t>
+            </w:r>
+          </w:p>
+        </w:tc>
+        <w:tc>
+          <w:tcPr>
+            <w:tcW w:type="dxa" w:w="1337"/>
+            <w:tcBorders>
+              <w:bottom w:val="single" w:sz="8" w:color="000000"/>
+            </w:tcBorders>
+          </w:tcPr>
+          <w:p>
+            <w:pPr>
+              <w:spacing w:after="0" w:before="0"/>
+              <w:jc w:val="center"/>
+            </w:pPr>
+            <w:r>
+              <w:rPr>
+                <w:sz w:val="17"/>
+              </w:rPr>
+            </w:r>
+            <w:r>
+              <w:rPr>
+                <w:sz w:val="17"/>
+              </w:rPr>
+              <w:t>0.148</w:t>
+            </w:r>
+          </w:p>
+        </w:tc>
+        <w:tc>
+          <w:tcPr>
+            <w:tcW w:type="dxa" w:w="1337"/>
+            <w:tcBorders>
+              <w:bottom w:val="single" w:sz="8" w:color="000000"/>
+            </w:tcBorders>
+          </w:tcPr>
+          <w:p>
+            <w:pPr>
+              <w:spacing w:after="0" w:before="0"/>
+              <w:jc w:val="center"/>
+            </w:pPr>
+            <w:r>
+              <w:rPr>
+                <w:sz w:val="17"/>
+              </w:rPr>
+            </w:r>
+            <w:r>
+              <w:rPr>
+                <w:sz w:val="17"/>
+              </w:rPr>
+              <w:t>0.0110 (−18%)</w:t>
+            </w:r>
+          </w:p>
+        </w:tc>
+        <w:tc>
+          <w:tcPr>
+            <w:tcW w:type="dxa" w:w="1337"/>
+            <w:tcBorders>
+              <w:bottom w:val="single" w:sz="8" w:color="000000"/>
+            </w:tcBorders>
+          </w:tcPr>
+          <w:p>
+            <w:pPr>
+              <w:spacing w:after="0" w:before="0"/>
+              <w:jc w:val="center"/>
+            </w:pPr>
+            <w:r>
+              <w:rPr>
+                <w:sz w:val="17"/>
+              </w:rPr>
+            </w:r>
+            <w:r>
+              <w:rPr>
+                <w:sz w:val="17"/>
+              </w:rPr>
+              <w:t>20.41</w:t>
+            </w:r>
+          </w:p>
+        </w:tc>
+        <w:tc>
+          <w:tcPr>
+            <w:tcW w:type="dxa" w:w="1337"/>
+            <w:tcBorders>
+              <w:bottom w:val="single" w:sz="8" w:color="000000"/>
+            </w:tcBorders>
+          </w:tcPr>
+          <w:p>
+            <w:pPr>
+              <w:spacing w:after="0" w:before="0"/>
+              <w:jc w:val="center"/>
+            </w:pPr>
+            <w:r>
+              <w:rPr>
+                <w:sz w:val="17"/>
+              </w:rPr>
+            </w:r>
+            <w:r>
+              <w:rPr>
+                <w:sz w:val="17"/>
+              </w:rPr>
+              <w:t>0.0226</w:t>
+            </w:r>
+          </w:p>
+        </w:tc>
+      </w:tr>
+    </w:tbl>
+    <w:p>
+      <w:pPr>
+        <w:spacing w:after="40"/>
+      </w:pPr>
+    </w:p>
+    <w:p>
+      <w:pPr>
+        <w:jc w:val="both"/>
+      </w:pPr>
+      <w:r>
+        <w:rPr>
+          <w:b/>
+        </w:rPr>
+        <w:t>Longer training.</w:t>
+      </w:r>
+      <w:r>
+        <w:t xml:space="preserve"> To test whether the main student is limited by its 2000-step budget, we trained the 6a recipe for 4000 steps (1.8 s per step, peak 24.1 GB) and evaluated every 800 steps with the per-view anchor in bf16 on the 20-sample protocol (Table 7). Step 1600 of this run closely reproduces the main student (AbsRel 0.082 on both, LPIPS 0.137 against 0.136, PSNR 20.45 against 20.43 dB). Longer training is not monotone: steps 2400 and 3200 are over-sharpened, 25% and 17% above the teacher (p&lt;0.001), with PSNR 0.72 and 0.60 dB lower (p&lt;0.001); step 4000 returns to teacher-level sharpness (+0.0003, p=0.053), improves LPIPS to +0.014 (p&lt;0.001) and the right view to 0.079, but its PSNR is 0.42 dB lower (p&lt;0.001) and its diversity 6% lower (not significant). The training diagnostic tracks this: the std ratio exceeds 1.1 in the middle of the run (1.126 at step 3000) and returns to 1.072 at step 3900 and 1.068 at step 4000, and the checkpoints taken while it was above 1.1 are the over-sharpened ones. No checkpoint passes every criterion of Section 4.1.</w:t>
+      </w:r>
+    </w:p>
+    <w:p>
+      <w:pPr>
+        <w:jc w:val="both"/>
+      </w:pPr>
+      <w:r>
+        <w:t>Table 7: DMD training length (6a recipe, 4000 steps), 20 samples, per-view anchor, bf16, fake pixels excluded. Step 1600 reproduces the main student; steps 2400 and 3200 are over-sharpened with lower PSNR; step 4000 recovers teacher-level sharpness and improves LPIPS but loses 0.42 dB of PSNR.</w:t>
+      </w:r>
+    </w:p>
+    <w:p>
+      <w:pPr>
+        <w:jc w:val="center"/>
+      </w:pPr>
+    </w:p>
+    <w:tbl>
+      <w:tblPr>
+        <w:tblStyle w:val="TableGrid"/>
+        <w:tblW w:type="auto" w:w="0"/>
+        <w:jc w:val="center"/>
+        <w:tblLook w:firstColumn="1" w:firstRow="1" w:lastColumn="0" w:lastRow="0" w:noHBand="0" w:noVBand="1" w:val="04A0"/>
+        <w:tblBorders>
+          <w:top w:val="nil"/>
+          <w:left w:val="nil"/>
+          <w:bottom w:val="nil"/>
+          <w:right w:val="nil"/>
+          <w:insideH w:val="nil"/>
+          <w:insideV w:val="nil"/>
+        </w:tblBorders>
+      </w:tblPr>
+      <w:tblGrid>
+        <w:gridCol w:w="1560"/>
+        <w:gridCol w:w="1560"/>
+        <w:gridCol w:w="1560"/>
+        <w:gridCol w:w="1560"/>
+        <w:gridCol w:w="1560"/>
+        <w:gridCol w:w="1560"/>
+      </w:tblGrid>
+      <w:tr>
+        <w:tc>
+          <w:tcPr>
+            <w:tcW w:type="dxa" w:w="1560"/>
+            <w:tcBorders>
+              <w:top w:val="single" w:sz="8" w:color="000000"/>
+              <w:bottom w:val="single" w:sz="4" w:color="000000"/>
+            </w:tcBorders>
+          </w:tcPr>
+          <w:p>
+            <w:pPr>
+              <w:spacing w:after="0" w:before="0"/>
+              <w:jc w:val="left"/>
+            </w:pPr>
+            <w:r>
+              <w:rPr>
+                <w:b/>
+                <w:sz w:val="17"/>
+              </w:rPr>
+            </w:r>
+            <w:r>
+              <w:rPr>
+                <w:b/>
+                <w:sz w:val="17"/>
+              </w:rPr>
+              <w:t>step</w:t>
+            </w:r>
+          </w:p>
+        </w:tc>
+        <w:tc>
+          <w:tcPr>
+            <w:tcW w:type="dxa" w:w="1560"/>
+            <w:tcBorders>
+              <w:top w:val="single" w:sz="8" w:color="000000"/>
+              <w:bottom w:val="single" w:sz="4" w:color="000000"/>
+            </w:tcBorders>
+          </w:tcPr>
+          <w:p>
+            <w:pPr>
+              <w:spacing w:after="0" w:before="0"/>
+              <w:jc w:val="center"/>
+            </w:pPr>
+            <w:r>
+              <w:rPr>
+                <w:b/>
+                <w:sz w:val="17"/>
+              </w:rPr>
+            </w:r>
+            <w:r>
+              <w:rPr>
+                <w:b/>
+                <w:sz w:val="17"/>
+              </w:rPr>
+              <w:t>AbsRel ↓ (L/R)</w:t>
+            </w:r>
+          </w:p>
+        </w:tc>
+        <w:tc>
+          <w:tcPr>
+            <w:tcW w:type="dxa" w:w="1560"/>
+            <w:tcBorders>
+              <w:top w:val="single" w:sz="8" w:color="000000"/>
+              <w:bottom w:val="single" w:sz="4" w:color="000000"/>
+            </w:tcBorders>
+          </w:tcPr>
+          <w:p>
+            <w:pPr>
+              <w:spacing w:after="0" w:before="0"/>
+              <w:jc w:val="center"/>
+            </w:pPr>
+            <w:r>
+              <w:rPr>
+                <w:b/>
+                <w:sz w:val="17"/>
+              </w:rPr>
+            </w:r>
+            <w:r>
+              <w:rPr>
+                <w:b/>
+                <w:sz w:val="17"/>
+              </w:rPr>
+              <w:t>LPIPS ↓</w:t>
+            </w:r>
+          </w:p>
+        </w:tc>
+        <w:tc>
+          <w:tcPr>
+            <w:tcW w:type="dxa" w:w="1560"/>
+            <w:tcBorders>
+              <w:top w:val="single" w:sz="8" w:color="000000"/>
+              <w:bottom w:val="single" w:sz="4" w:color="000000"/>
+            </w:tcBorders>
+          </w:tcPr>
+          <w:p>
+            <w:pPr>
+              <w:spacing w:after="0" w:before="0"/>
+              <w:jc w:val="center"/>
+            </w:pPr>
+            <w:r>
+              <w:rPr>
+                <w:b/>
+                <w:sz w:val="17"/>
+              </w:rPr>
+            </w:r>
+            <w:r>
+              <w:rPr>
+                <w:b/>
+                <w:sz w:val="17"/>
+              </w:rPr>
+              <w:t>sharpness</w:t>
+            </w:r>
+          </w:p>
+        </w:tc>
+        <w:tc>
+          <w:tcPr>
+            <w:tcW w:type="dxa" w:w="1560"/>
+            <w:tcBorders>
+              <w:top w:val="single" w:sz="8" w:color="000000"/>
+              <w:bottom w:val="single" w:sz="4" w:color="000000"/>
+            </w:tcBorders>
+          </w:tcPr>
+          <w:p>
+            <w:pPr>
+              <w:spacing w:after="0" w:before="0"/>
+              <w:jc w:val="center"/>
+            </w:pPr>
+            <w:r>
+              <w:rPr>
+                <w:b/>
+                <w:sz w:val="17"/>
+              </w:rPr>
+            </w:r>
+            <w:r>
+              <w:rPr>
+                <w:b/>
+                <w:sz w:val="17"/>
+              </w:rPr>
+              <w:t>PSNR ↑</w:t>
+            </w:r>
+          </w:p>
+        </w:tc>
+        <w:tc>
+          <w:tcPr>
+            <w:tcW w:type="dxa" w:w="1560"/>
+            <w:tcBorders>
+              <w:top w:val="single" w:sz="8" w:color="000000"/>
+              <w:bottom w:val="single" w:sz="4" w:color="000000"/>
+            </w:tcBorders>
+          </w:tcPr>
+          <w:p>
+            <w:pPr>
+              <w:spacing w:after="0" w:before="0"/>
+              <w:jc w:val="center"/>
+            </w:pPr>
+            <w:r>
+              <w:rPr>
+                <w:b/>
+                <w:sz w:val="17"/>
+              </w:rPr>
+            </w:r>
+            <w:r>
+              <w:rPr>
+                <w:b/>
+                <w:sz w:val="17"/>
+              </w:rPr>
+              <w:t>diversity</w:t>
+            </w:r>
+          </w:p>
+        </w:tc>
+      </w:tr>
+      <w:tr>
+        <w:tc>
+          <w:tcPr>
+            <w:tcW w:type="dxa" w:w="1560"/>
+          </w:tcPr>
+          <w:p>
+            <w:pPr>
+              <w:spacing w:after="0" w:before="0"/>
+              <w:jc w:val="left"/>
+            </w:pPr>
+            <w:r>
+              <w:rPr>
+                <w:sz w:val="17"/>
+              </w:rPr>
+            </w:r>
+            <w:r>
+              <w:rPr>
+                <w:sz w:val="17"/>
+              </w:rPr>
+              <w:t>teacher (25 steps)</w:t>
+            </w:r>
+          </w:p>
+        </w:tc>
+        <w:tc>
+          <w:tcPr>
+            <w:tcW w:type="dxa" w:w="1560"/>
+          </w:tcPr>
+          <w:p>
+            <w:pPr>
+              <w:spacing w:after="0" w:before="0"/>
+              <w:jc w:val="center"/>
+            </w:pPr>
+            <w:r>
+              <w:rPr>
+                <w:sz w:val="17"/>
+              </w:rPr>
+            </w:r>
+            <w:r>
+              <w:rPr>
+                <w:sz w:val="17"/>
+              </w:rPr>
+              <w:t>0.066 (0.067/0.066)</w:t>
+            </w:r>
+          </w:p>
+        </w:tc>
+        <w:tc>
+          <w:tcPr>
+            <w:tcW w:type="dxa" w:w="1560"/>
+          </w:tcPr>
+          <w:p>
+            <w:pPr>
+              <w:spacing w:after="0" w:before="0"/>
+              <w:jc w:val="center"/>
+            </w:pPr>
+            <w:r>
+              <w:rPr>
+                <w:sz w:val="17"/>
+              </w:rPr>
+            </w:r>
+            <w:r>
+              <w:rPr>
+                <w:sz w:val="17"/>
+              </w:rPr>
+              <w:t>0.118</w:t>
+            </w:r>
+          </w:p>
+        </w:tc>
+        <w:tc>
+          <w:tcPr>
+            <w:tcW w:type="dxa" w:w="1560"/>
+          </w:tcPr>
+          <w:p>
+            <w:pPr>
+              <w:spacing w:after="0" w:before="0"/>
+              <w:jc w:val="center"/>
+            </w:pPr>
+            <w:r>
+              <w:rPr>
+                <w:sz w:val="17"/>
+              </w:rPr>
+            </w:r>
+            <w:r>
+              <w:rPr>
+                <w:sz w:val="17"/>
+              </w:rPr>
+              <w:t>0.0134</w:t>
+            </w:r>
+          </w:p>
+        </w:tc>
+        <w:tc>
+          <w:tcPr>
+            <w:tcW w:type="dxa" w:w="1560"/>
+          </w:tcPr>
+          <w:p>
+            <w:pPr>
+              <w:spacing w:after="0" w:before="0"/>
+              <w:jc w:val="center"/>
+            </w:pPr>
+            <w:r>
+              <w:rPr>
+                <w:sz w:val="17"/>
+              </w:rPr>
+            </w:r>
+            <w:r>
+              <w:rPr>
+                <w:sz w:val="17"/>
+              </w:rPr>
+              <w:t>20.62</w:t>
+            </w:r>
+          </w:p>
+        </w:tc>
+        <w:tc>
+          <w:tcPr>
+            <w:tcW w:type="dxa" w:w="1560"/>
+          </w:tcPr>
+          <w:p>
+            <w:pPr>
+              <w:spacing w:after="0" w:before="0"/>
+              <w:jc w:val="center"/>
+            </w:pPr>
+            <w:r>
+              <w:rPr>
+                <w:sz w:val="17"/>
+              </w:rPr>
+            </w:r>
+            <w:r>
+              <w:rPr>
+                <w:sz w:val="17"/>
+              </w:rPr>
+              <w:t>0.0227</w:t>
+            </w:r>
+          </w:p>
+        </w:tc>
+      </w:tr>
+      <w:tr>
+        <w:tc>
+          <w:tcPr>
+            <w:tcW w:type="dxa" w:w="1560"/>
+          </w:tcPr>
+          <w:p>
+            <w:pPr>
+              <w:spacing w:after="0" w:before="0"/>
+              <w:jc w:val="left"/>
+            </w:pPr>
+            <w:r>
+              <w:rPr>
+                <w:sz w:val="17"/>
+              </w:rPr>
+            </w:r>
+            <w:r>
+              <w:rPr>
+                <w:sz w:val="17"/>
+              </w:rPr>
+              <w:t>1600</w:t>
+            </w:r>
+          </w:p>
+        </w:tc>
+        <w:tc>
+          <w:tcPr>
+            <w:tcW w:type="dxa" w:w="1560"/>
+          </w:tcPr>
+          <w:p>
+            <w:pPr>
+              <w:spacing w:after="0" w:before="0"/>
+              <w:jc w:val="center"/>
+            </w:pPr>
+            <w:r>
+              <w:rPr>
+                <w:sz w:val="17"/>
+              </w:rPr>
+            </w:r>
+            <w:r>
+              <w:rPr>
+                <w:sz w:val="17"/>
+              </w:rPr>
+              <w:t>0.082 (0.076/0.088)</w:t>
+            </w:r>
+          </w:p>
+        </w:tc>
+        <w:tc>
+          <w:tcPr>
+            <w:tcW w:type="dxa" w:w="1560"/>
+          </w:tcPr>
+          <w:p>
+            <w:pPr>
+              <w:spacing w:after="0" w:before="0"/>
+              <w:jc w:val="center"/>
+            </w:pPr>
+            <w:r>
+              <w:rPr>
+                <w:sz w:val="17"/>
+              </w:rPr>
+            </w:r>
+            <w:r>
+              <w:rPr>
+                <w:sz w:val="17"/>
+              </w:rPr>
+              <w:t>0.137</w:t>
+            </w:r>
+          </w:p>
+        </w:tc>
+        <w:tc>
+          <w:tcPr>
+            <w:tcW w:type="dxa" w:w="1560"/>
+          </w:tcPr>
+          <w:p>
+            <w:pPr>
+              <w:spacing w:after="0" w:before="0"/>
+              <w:jc w:val="center"/>
+            </w:pPr>
+            <w:r>
+              <w:rPr>
+                <w:sz w:val="17"/>
+              </w:rPr>
+            </w:r>
+            <w:r>
+              <w:rPr>
+                <w:sz w:val="17"/>
+              </w:rPr>
+              <w:t>0.0132</w:t>
+            </w:r>
+          </w:p>
+        </w:tc>
+        <w:tc>
+          <w:tcPr>
+            <w:tcW w:type="dxa" w:w="1560"/>
+          </w:tcPr>
+          <w:p>
+            <w:pPr>
+              <w:spacing w:after="0" w:before="0"/>
+              <w:jc w:val="center"/>
+            </w:pPr>
+            <w:r>
+              <w:rPr>
+                <w:sz w:val="17"/>
+              </w:rPr>
+            </w:r>
+            <w:r>
+              <w:rPr>
+                <w:sz w:val="17"/>
+              </w:rPr>
+              <w:t>20.45</w:t>
+            </w:r>
+          </w:p>
+        </w:tc>
+        <w:tc>
+          <w:tcPr>
+            <w:tcW w:type="dxa" w:w="1560"/>
+          </w:tcPr>
+          <w:p>
+            <w:pPr>
+              <w:spacing w:after="0" w:before="0"/>
+              <w:jc w:val="center"/>
+            </w:pPr>
+            <w:r>
+              <w:rPr>
+                <w:sz w:val="17"/>
+              </w:rPr>
+            </w:r>
+            <w:r>
+              <w:rPr>
+                <w:sz w:val="17"/>
+              </w:rPr>
+              <w:t>0.0228</w:t>
+            </w:r>
+          </w:p>
+        </w:tc>
+      </w:tr>
+      <w:tr>
+        <w:tc>
+          <w:tcPr>
+            <w:tcW w:type="dxa" w:w="1560"/>
+          </w:tcPr>
+          <w:p>
+            <w:pPr>
+              <w:spacing w:after="0" w:before="0"/>
+              <w:jc w:val="left"/>
+            </w:pPr>
+            <w:r>
+              <w:rPr>
+                <w:sz w:val="17"/>
+              </w:rPr>
+            </w:r>
+            <w:r>
+              <w:rPr>
+                <w:sz w:val="17"/>
+              </w:rPr>
+              <w:t>2400</w:t>
+            </w:r>
+          </w:p>
+        </w:tc>
+        <w:tc>
+          <w:tcPr>
+            <w:tcW w:type="dxa" w:w="1560"/>
+          </w:tcPr>
+          <w:p>
+            <w:pPr>
+              <w:spacing w:after="0" w:before="0"/>
+              <w:jc w:val="center"/>
+            </w:pPr>
+            <w:r>
+              <w:rPr>
+                <w:sz w:val="17"/>
+              </w:rPr>
+            </w:r>
+            <w:r>
+              <w:rPr>
+                <w:sz w:val="17"/>
+              </w:rPr>
+              <w:t>0.084 (0.067/0.100)</w:t>
+            </w:r>
+          </w:p>
+        </w:tc>
+        <w:tc>
+          <w:tcPr>
+            <w:tcW w:type="dxa" w:w="1560"/>
+          </w:tcPr>
+          <w:p>
+            <w:pPr>
+              <w:spacing w:after="0" w:before="0"/>
+              <w:jc w:val="center"/>
+            </w:pPr>
+            <w:r>
+              <w:rPr>
+                <w:sz w:val="17"/>
+              </w:rPr>
+            </w:r>
+            <w:r>
+              <w:rPr>
+                <w:sz w:val="17"/>
+              </w:rPr>
+              <w:t>0.142</w:t>
+            </w:r>
+          </w:p>
+        </w:tc>
+        <w:tc>
+          <w:tcPr>
+            <w:tcW w:type="dxa" w:w="1560"/>
+          </w:tcPr>
+          <w:p>
+            <w:pPr>
+              <w:spacing w:after="0" w:before="0"/>
+              <w:jc w:val="center"/>
+            </w:pPr>
+            <w:r>
+              <w:rPr>
+                <w:sz w:val="17"/>
+              </w:rPr>
+            </w:r>
+            <w:r>
+              <w:rPr>
+                <w:sz w:val="17"/>
+              </w:rPr>
+              <w:t>0.0167 (+25%)</w:t>
+            </w:r>
+          </w:p>
+        </w:tc>
+        <w:tc>
+          <w:tcPr>
+            <w:tcW w:type="dxa" w:w="1560"/>
+          </w:tcPr>
+          <w:p>
+            <w:pPr>
+              <w:spacing w:after="0" w:before="0"/>
+              <w:jc w:val="center"/>
+            </w:pPr>
+            <w:r>
+              <w:rPr>
+                <w:sz w:val="17"/>
+              </w:rPr>
+            </w:r>
+            <w:r>
+              <w:rPr>
+                <w:sz w:val="17"/>
+              </w:rPr>
+              <w:t>19.90</w:t>
+            </w:r>
+          </w:p>
+        </w:tc>
+        <w:tc>
+          <w:tcPr>
+            <w:tcW w:type="dxa" w:w="1560"/>
+          </w:tcPr>
+          <w:p>
+            <w:pPr>
+              <w:spacing w:after="0" w:before="0"/>
+              <w:jc w:val="center"/>
+            </w:pPr>
+            <w:r>
+              <w:rPr>
+                <w:sz w:val="17"/>
+              </w:rPr>
+            </w:r>
+            <w:r>
+              <w:rPr>
+                <w:sz w:val="17"/>
+              </w:rPr>
+              <w:t>0.0242</w:t>
+            </w:r>
+          </w:p>
+        </w:tc>
+      </w:tr>
+      <w:tr>
+        <w:tc>
+          <w:tcPr>
+            <w:tcW w:type="dxa" w:w="1560"/>
+          </w:tcPr>
+          <w:p>
+            <w:pPr>
+              <w:spacing w:after="0" w:before="0"/>
+              <w:jc w:val="left"/>
+            </w:pPr>
+            <w:r>
+              <w:rPr>
+                <w:sz w:val="17"/>
+              </w:rPr>
+            </w:r>
+            <w:r>
+              <w:rPr>
+                <w:sz w:val="17"/>
+              </w:rPr>
+              <w:t>3200</w:t>
+            </w:r>
+          </w:p>
+        </w:tc>
+        <w:tc>
+          <w:tcPr>
+            <w:tcW w:type="dxa" w:w="1560"/>
+          </w:tcPr>
+          <w:p>
+            <w:pPr>
+              <w:spacing w:after="0" w:before="0"/>
+              <w:jc w:val="center"/>
+            </w:pPr>
+            <w:r>
+              <w:rPr>
+                <w:sz w:val="17"/>
+              </w:rPr>
+            </w:r>
+            <w:r>
+              <w:rPr>
+                <w:sz w:val="17"/>
+              </w:rPr>
+              <w:t>0.073 (0.065/0.081)</w:t>
+            </w:r>
+          </w:p>
+        </w:tc>
+        <w:tc>
+          <w:tcPr>
+            <w:tcW w:type="dxa" w:w="1560"/>
+          </w:tcPr>
+          <w:p>
+            <w:pPr>
+              <w:spacing w:after="0" w:before="0"/>
+              <w:jc w:val="center"/>
+            </w:pPr>
+            <w:r>
+              <w:rPr>
+                <w:sz w:val="17"/>
+              </w:rPr>
+            </w:r>
+            <w:r>
+              <w:rPr>
+                <w:sz w:val="17"/>
+              </w:rPr>
+              <w:t>0.138</w:t>
+            </w:r>
+          </w:p>
+        </w:tc>
+        <w:tc>
+          <w:tcPr>
+            <w:tcW w:type="dxa" w:w="1560"/>
+          </w:tcPr>
+          <w:p>
+            <w:pPr>
+              <w:spacing w:after="0" w:before="0"/>
+              <w:jc w:val="center"/>
+            </w:pPr>
+            <w:r>
+              <w:rPr>
+                <w:sz w:val="17"/>
+              </w:rPr>
+            </w:r>
+            <w:r>
+              <w:rPr>
+                <w:sz w:val="17"/>
+              </w:rPr>
+              <w:t>0.0157 (+17%)</w:t>
+            </w:r>
+          </w:p>
+        </w:tc>
+        <w:tc>
+          <w:tcPr>
+            <w:tcW w:type="dxa" w:w="1560"/>
+          </w:tcPr>
+          <w:p>
+            <w:pPr>
+              <w:spacing w:after="0" w:before="0"/>
+              <w:jc w:val="center"/>
+            </w:pPr>
+            <w:r>
+              <w:rPr>
+                <w:sz w:val="17"/>
+              </w:rPr>
+            </w:r>
+            <w:r>
+              <w:rPr>
+                <w:sz w:val="17"/>
+              </w:rPr>
+              <w:t>20.01</w:t>
+            </w:r>
+          </w:p>
+        </w:tc>
+        <w:tc>
+          <w:tcPr>
+            <w:tcW w:type="dxa" w:w="1560"/>
+          </w:tcPr>
+          <w:p>
+            <w:pPr>
+              <w:spacing w:after="0" w:before="0"/>
+              <w:jc w:val="center"/>
+            </w:pPr>
+            <w:r>
+              <w:rPr>
+                <w:sz w:val="17"/>
+              </w:rPr>
+            </w:r>
+            <w:r>
+              <w:rPr>
+                <w:sz w:val="17"/>
+              </w:rPr>
+              <w:t>0.0230</w:t>
+            </w:r>
+          </w:p>
+        </w:tc>
+      </w:tr>
+      <w:tr>
+        <w:tc>
+          <w:tcPr>
+            <w:tcW w:type="dxa" w:w="1560"/>
+            <w:tcBorders>
+              <w:bottom w:val="single" w:sz="8" w:color="000000"/>
+            </w:tcBorders>
+          </w:tcPr>
+          <w:p>
+            <w:pPr>
+              <w:spacing w:after="0" w:before="0"/>
+              <w:jc w:val="left"/>
+            </w:pPr>
+            <w:r>
+              <w:rPr>
+                <w:sz w:val="17"/>
+              </w:rPr>
+            </w:r>
+            <w:r>
+              <w:rPr>
+                <w:sz w:val="17"/>
+              </w:rPr>
+              <w:t>4000</w:t>
+            </w:r>
+          </w:p>
+        </w:tc>
+        <w:tc>
+          <w:tcPr>
+            <w:tcW w:type="dxa" w:w="1560"/>
+            <w:tcBorders>
+              <w:bottom w:val="single" w:sz="8" w:color="000000"/>
+            </w:tcBorders>
+          </w:tcPr>
+          <w:p>
+            <w:pPr>
+              <w:spacing w:after="0" w:before="0"/>
+              <w:jc w:val="center"/>
+            </w:pPr>
+            <w:r>
+              <w:rPr>
+                <w:sz w:val="17"/>
+              </w:rPr>
+            </w:r>
+            <w:r>
+              <w:rPr>
+                <w:sz w:val="17"/>
+              </w:rPr>
+              <w:t>0.078 (0.077/0.079)</w:t>
+            </w:r>
+          </w:p>
+        </w:tc>
+        <w:tc>
+          <w:tcPr>
+            <w:tcW w:type="dxa" w:w="1560"/>
+            <w:tcBorders>
+              <w:bottom w:val="single" w:sz="8" w:color="000000"/>
+            </w:tcBorders>
+          </w:tcPr>
+          <w:p>
+            <w:pPr>
+              <w:spacing w:after="0" w:before="0"/>
+              <w:jc w:val="center"/>
+            </w:pPr>
+            <w:r>
+              <w:rPr>
+                <w:sz w:val="17"/>
+              </w:rPr>
+            </w:r>
+            <w:r>
+              <w:rPr>
+                <w:sz w:val="17"/>
+              </w:rPr>
+              <w:t>0.132</w:t>
+            </w:r>
+          </w:p>
+        </w:tc>
+        <w:tc>
+          <w:tcPr>
+            <w:tcW w:type="dxa" w:w="1560"/>
+            <w:tcBorders>
+              <w:bottom w:val="single" w:sz="8" w:color="000000"/>
+            </w:tcBorders>
+          </w:tcPr>
+          <w:p>
+            <w:pPr>
+              <w:spacing w:after="0" w:before="0"/>
+              <w:jc w:val="center"/>
+            </w:pPr>
+            <w:r>
+              <w:rPr>
+                <w:sz w:val="17"/>
+              </w:rPr>
+            </w:r>
+            <w:r>
+              <w:rPr>
+                <w:sz w:val="17"/>
+              </w:rPr>
+              <w:t>0.0137</w:t>
+            </w:r>
+          </w:p>
+        </w:tc>
+        <w:tc>
+          <w:tcPr>
+            <w:tcW w:type="dxa" w:w="1560"/>
+            <w:tcBorders>
+              <w:bottom w:val="single" w:sz="8" w:color="000000"/>
+            </w:tcBorders>
+          </w:tcPr>
+          <w:p>
+            <w:pPr>
+              <w:spacing w:after="0" w:before="0"/>
+              <w:jc w:val="center"/>
+            </w:pPr>
+            <w:r>
+              <w:rPr>
+                <w:sz w:val="17"/>
+              </w:rPr>
+            </w:r>
+            <w:r>
+              <w:rPr>
+                <w:sz w:val="17"/>
+              </w:rPr>
+              <w:t>20.20</w:t>
+            </w:r>
+          </w:p>
+        </w:tc>
+        <w:tc>
+          <w:tcPr>
+            <w:tcW w:type="dxa" w:w="1560"/>
+            <w:tcBorders>
+              <w:bottom w:val="single" w:sz="8" w:color="000000"/>
+            </w:tcBorders>
+          </w:tcPr>
+          <w:p>
+            <w:pPr>
+              <w:spacing w:after="0" w:before="0"/>
+              <w:jc w:val="center"/>
+            </w:pPr>
+            <w:r>
+              <w:rPr>
+                <w:sz w:val="17"/>
+              </w:rPr>
+            </w:r>
+            <w:r>
+              <w:rPr>
+                <w:sz w:val="17"/>
+              </w:rPr>
+              <w:t>0.0214</w:t>
+            </w:r>
+          </w:p>
+        </w:tc>
+      </w:tr>
+    </w:tbl>
+    <w:p>
+      <w:pPr>
+        <w:spacing w:after="40"/>
+      </w:pPr>
+    </w:p>
+    <w:p>
+      <w:pPr>
+        <w:jc w:val="both"/>
+      </w:pPr>
+      <w:r>
+        <w:rPr>
+          <w:b/>
+        </w:rPr>
         <w:t>One-step student.</w:t>
       </w:r>
       <w:r>
@@ -7241,7 +9105,7 @@
         <w:jc w:val="both"/>
       </w:pPr>
       <w:r>
-        <w:t>All measurements come from one task (PlaceAppleFromBowlIntoBin), four inference episodes, 20 samples (40 view-samples), and one RTX 5090; the absolute numbers may not transfer to other tasks or to real robot data. The 3-step student is not equal to the teacher: AbsRel is 0.015 higher (p&lt;0.001; 0.022 on the right view) and LPIPS 0.018 higher (p&lt;0.001), and the per-view anchor reduces but does not remove the right-view gap. The 1-step student halves diversity (0.0117) and raises LPIPS to 0.177, so it does not meet our quality bar. Only the quasi-static budget of 2 s is met. The humanoid (0.3-0.5 s) and dynamic (0.1 s) budgets are not, because the conditioner (0.30 s) and VAE decoders (0.33 s) form a fixed cost of 0.63 s that step reduction cannot touch, and the three UNet calls still take 0.55 s; reducing these requires quantization such as SVDQuant (Li et al., 2025) or a lower resolution, which we did not try. We have no policy-level evaluation: Geo4D's closed-loop success rates (Liu et al., 2025, Table 2) require the LBM simulator, a pose tracker, and a policy interface that are not in the released code, so the claim that a faster model enables closed-loop planning remains untested (Appendix A.6). The components we use, DMD (Yin et al., 2024a; 2024b), re-noising few-step sampling, bf16, and torch.compile, are existing techniques; what is new is the geometry-aware measurement and the anchor. Finally, a self-anchor loss that applies the calibration during training is implemented but still training, and we report no results for it.</w:t>
+        <w:t>All measurements come from one task (PlaceAppleFromBowlIntoBin), four inference episodes, 20 samples (40 view-samples), and one RTX 5090; the absolute numbers may not transfer to other tasks or to real robot data. The 3-step student is not equal to the teacher: AbsRel is 0.015 higher (p&lt;0.001; 0.022 on the right view) and LPIPS 0.018 higher (p&lt;0.001), and the per-view anchor reduces but does not remove the right-view gap. The 1-step student halves diversity (0.0117) and raises LPIPS to 0.177, so it does not meet our quality bar. Only the quasi-static budget of 2 s is met. The humanoid (0.3-0.5 s) and dynamic (0.1 s) budgets are not, because the conditioner (0.30 s) and VAE decoders (0.33 s) form a fixed cost of 0.63 s that step reduction cannot touch, and the three UNet calls still take 0.55 s; reducing these requires quantization such as SVDQuant (Li et al., 2025) or a lower resolution, which we did not try. We have no policy-level evaluation: Geo4D's closed-loop success rates (Liu et al., 2025, Table 2) require the LBM simulator, a pose tracker, and a policy interface that are not in the released code, so the claim that a faster model enables closed-loop planning remains untested (Appendix A.6). The components we use, DMD (Yin et al., 2024a; 2024b), re-noising few-step sampling, bf16, and torch.compile, are existing techniques; what is new is the geometry-aware measurement and the anchor. A self-anchored training loss that applies the same calibration during training (run 6d, Section 4.5) removes most of the raw scale shift (0.175 to 0.102 without inference-time correction) and closes the left/right gap after anchoring, but its sharpness has not recovered at 2000 steps (18% below the teacher) and a 4000-step extension is still running. Finally, with 40 view-samples the minimal detectable AbsRel difference is 0.010, so showing equivalence at the strict 0.005 margin of Section 4.1 would need about 60 samples, which we have not run.</w:t>
       </w:r>
     </w:p>
     <w:p>
@@ -7401,20 +9265,20 @@
         <w:rPr>
           <w:sz w:val="19"/>
         </w:rPr>
-        <w:t xml:space="preserve">Xun Huang, Zhengqi Li, Guande He, Mingyuan Zhou, and Eli Shechtman. Self Forcing: Bridging the train-test gap in autoregressive video diffusion. In </w:t>
+        <w:t xml:space="preserve">Qiqi Hou, Abhijay Ghildyal, and Feng Liu. A perceptual quality metric for video frame interpolation. In </w:t>
       </w:r>
       <w:r>
         <w:rPr>
           <w:i/>
           <w:sz w:val="19"/>
         </w:rPr>
-        <w:t>Advances in Neural Information Processing Systems (NeurIPS)</w:t>
+        <w:t>European Conference on Computer Vision (ECCV)</w:t>
       </w:r>
       <w:r>
         <w:rPr>
           <w:sz w:val="19"/>
         </w:rPr>
-        <w:t>, 2025. arXiv:2506.08009.</w:t>
+        <w:t>, 2022. https://www.ecva.net/papers/eccv_2022/papers_ECCV/papers/136750231.pdf</w:t>
       </w:r>
     </w:p>
     <w:p>
@@ -7427,7 +9291,20 @@
         <w:rPr>
           <w:sz w:val="19"/>
         </w:rPr>
-        <w:t>Byeongguk Jeon, Seonghyeon Ye, JaeHyeok Doo, Sungdong Kim, Minjoon Seo, Hyungmok Son, and Kimin Lee. RoboWorld: Fast and reliable neural simulators for generalist robot policy evaluation. arXiv preprint, 2026. arXiv:2607.01060.</w:t>
+        <w:t xml:space="preserve">Xun Huang, Zhengqi Li, Guande He, Mingyuan Zhou, and Eli Shechtman. Self Forcing: Bridging the train-test gap in autoregressive video diffusion. In </w:t>
+      </w:r>
+      <w:r>
+        <w:rPr>
+          <w:i/>
+          <w:sz w:val="19"/>
+        </w:rPr>
+        <w:t>Advances in Neural Information Processing Systems (NeurIPS)</w:t>
+      </w:r>
+      <w:r>
+        <w:rPr>
+          <w:sz w:val="19"/>
+        </w:rPr>
+        <w:t>, 2025. arXiv:2506.08009.</w:t>
       </w:r>
     </w:p>
     <w:p>
@@ -7440,20 +9317,7 @@
         <w:rPr>
           <w:sz w:val="19"/>
         </w:rPr>
-        <w:t xml:space="preserve">Tero Karras, Miika Aittala, Timo Aila, and Samuli Laine. Elucidating the design space of diffusion-based generative models. In </w:t>
-      </w:r>
-      <w:r>
-        <w:rPr>
-          <w:i/>
-          <w:sz w:val="19"/>
-        </w:rPr>
-        <w:t>Advances in Neural Information Processing Systems (NeurIPS)</w:t>
-      </w:r>
-      <w:r>
-        <w:rPr>
-          <w:sz w:val="19"/>
-        </w:rPr>
-        <w:t>, 2022. arXiv:2206.00364.</w:t>
+        <w:t>Byeongguk Jeon, Seonghyeon Ye, JaeHyeok Doo, Sungdong Kim, Minjoon Seo, Hyungmok Son, and Kimin Lee. RoboWorld: Fast and reliable neural simulators for generalist robot policy evaluation. arXiv preprint, 2026. arXiv:2607.01060.</w:t>
       </w:r>
     </w:p>
     <w:p>
@@ -7466,7 +9330,20 @@
         <w:rPr>
           <w:sz w:val="19"/>
         </w:rPr>
-        <w:t>Akio Kodaira, Tingbo Hou, Ji Hou, Markos Georgopoulos, Felix Juefei-Xu, Masayoshi Tomizuka, and Yue Zhao. StreamDiT: Real-time streaming text-to-video generation. arXiv preprint, 2025. arXiv:2507.03745.</w:t>
+        <w:t xml:space="preserve">Tero Karras, Miika Aittala, Timo Aila, and Samuli Laine. Elucidating the design space of diffusion-based generative models. In </w:t>
+      </w:r>
+      <w:r>
+        <w:rPr>
+          <w:i/>
+          <w:sz w:val="19"/>
+        </w:rPr>
+        <w:t>Advances in Neural Information Processing Systems (NeurIPS)</w:t>
+      </w:r>
+      <w:r>
+        <w:rPr>
+          <w:sz w:val="19"/>
+        </w:rPr>
+        <w:t>, 2022. arXiv:2206.00364.</w:t>
       </w:r>
     </w:p>
     <w:p>
@@ -7479,20 +9356,7 @@
         <w:rPr>
           <w:sz w:val="19"/>
         </w:rPr>
-        <w:t xml:space="preserve">Muyang Li, Yujun Lin, Zhekai Zhang, Tianle Cai, Xiuyu Li, Junxian Guo, Enze Xie, Chenlin Meng, Jun-Yan Zhu, and Song Han. SVDQuant: Absorbing outliers by low-rank components for 4-bit diffusion models. In </w:t>
-      </w:r>
-      <w:r>
-        <w:rPr>
-          <w:i/>
-          <w:sz w:val="19"/>
-        </w:rPr>
-        <w:t>International Conference on Learning Representations (ICLR)</w:t>
-      </w:r>
-      <w:r>
-        <w:rPr>
-          <w:sz w:val="19"/>
-        </w:rPr>
-        <w:t>, 2025. arXiv:2411.05007.</w:t>
+        <w:t>Akio Kodaira, Tingbo Hou, Ji Hou, Markos Georgopoulos, Felix Juefei-Xu, Masayoshi Tomizuka, and Yue Zhao. StreamDiT: Real-time streaming text-to-video generation. arXiv preprint, 2025. arXiv:2507.03745.</w:t>
       </w:r>
     </w:p>
     <w:p>
@@ -7505,7 +9369,20 @@
         <w:rPr>
           <w:sz w:val="19"/>
         </w:rPr>
-        <w:t>Junbang Liang, Ruoshi Liu, Ege Ozguroglu, Sruthi Sudhakar, Achal Dave, Pavel Tokmakov, Shuran Song, and Carl Vondrick. Dreamitate: Real-world visuomotor policy learning via video generation. arXiv preprint, 2024. arXiv:2406.16862.</w:t>
+        <w:t xml:space="preserve">Muyang Li, Yujun Lin, Zhekai Zhang, Tianle Cai, Xiuyu Li, Junxian Guo, Enze Xie, Chenlin Meng, Jun-Yan Zhu, and Song Han. SVDQuant: Absorbing outliers by low-rank components for 4-bit diffusion models. In </w:t>
+      </w:r>
+      <w:r>
+        <w:rPr>
+          <w:i/>
+          <w:sz w:val="19"/>
+        </w:rPr>
+        <w:t>International Conference on Learning Representations (ICLR)</w:t>
+      </w:r>
+      <w:r>
+        <w:rPr>
+          <w:sz w:val="19"/>
+        </w:rPr>
+        <w:t>, 2025. arXiv:2411.05007.</w:t>
       </w:r>
     </w:p>
     <w:p>
@@ -7518,20 +9395,7 @@
         <w:rPr>
           <w:sz w:val="19"/>
         </w:rPr>
-        <w:t xml:space="preserve">Shanchuan Lin, Xin Xia, Yuxi Ren, Ceyuan Yang, Xuefeng Xiao, and Lu Jiang. Diffusion adversarial post-training for one-step video generation. In </w:t>
-      </w:r>
-      <w:r>
-        <w:rPr>
-          <w:i/>
-          <w:sz w:val="19"/>
-        </w:rPr>
-        <w:t>International Conference on Machine Learning (ICML)</w:t>
-      </w:r>
-      <w:r>
-        <w:rPr>
-          <w:sz w:val="19"/>
-        </w:rPr>
-        <w:t>, 2025. arXiv:2501.08316.</w:t>
+        <w:t>Junbang Liang, Ruoshi Liu, Ege Ozguroglu, Sruthi Sudhakar, Achal Dave, Pavel Tokmakov, Shuran Song, and Carl Vondrick. Dreamitate: Real-world visuomotor policy learning via video generation. arXiv preprint, 2024. arXiv:2406.16862.</w:t>
       </w:r>
     </w:p>
     <w:p>
@@ -7544,20 +9408,20 @@
         <w:rPr>
           <w:sz w:val="19"/>
         </w:rPr>
-        <w:t xml:space="preserve">Feng Liu, Shiwei Zhang, Xiaofeng Wang, Yujie Wei, Haonan Qiu, Yuzhong Zhao, Yingya Zhang, Qixiang Ye, and Fang Wan. Timestep embedding tells: It's time to cache for video diffusion model. In </w:t>
+        <w:t xml:space="preserve">Shanchuan Lin, Xin Xia, Yuxi Ren, Ceyuan Yang, Xuefeng Xiao, and Lu Jiang. Diffusion adversarial post-training for one-step video generation. In </w:t>
       </w:r>
       <w:r>
         <w:rPr>
           <w:i/>
           <w:sz w:val="19"/>
         </w:rPr>
-        <w:t>Proceedings of the IEEE/CVF Conference on Computer Vision and Pattern Recognition (CVPR)</w:t>
+        <w:t>International Conference on Machine Learning (ICML)</w:t>
       </w:r>
       <w:r>
         <w:rPr>
           <w:sz w:val="19"/>
         </w:rPr>
-        <w:t>, 2025. arXiv:2411.19108.</w:t>
+        <w:t>, 2025. arXiv:2501.08316.</w:t>
       </w:r>
     </w:p>
     <w:p>
@@ -7570,7 +9434,20 @@
         <w:rPr>
           <w:sz w:val="19"/>
         </w:rPr>
-        <w:t>Zeyi Liu, Shuang Li, Eric Cousineau, Siyuan Feng, Benjamin Burchfiel, and Shuran Song. Geometry-aware 4D video generation for robot manipulation. arXiv preprint, 2025. arXiv:2507.01099.</w:t>
+        <w:t xml:space="preserve">Feng Liu, Shiwei Zhang, Xiaofeng Wang, Yujie Wei, Haonan Qiu, Yuzhong Zhao, Yingya Zhang, Qixiang Ye, and Fang Wan. Timestep embedding tells: It's time to cache for video diffusion model. In </w:t>
+      </w:r>
+      <w:r>
+        <w:rPr>
+          <w:i/>
+          <w:sz w:val="19"/>
+        </w:rPr>
+        <w:t>Proceedings of the IEEE/CVF Conference on Computer Vision and Pattern Recognition (CVPR)</w:t>
+      </w:r>
+      <w:r>
+        <w:rPr>
+          <w:sz w:val="19"/>
+        </w:rPr>
+        <w:t>, 2025. arXiv:2411.19108.</w:t>
       </w:r>
     </w:p>
     <w:p>
@@ -7583,20 +9460,7 @@
         <w:rPr>
           <w:sz w:val="19"/>
         </w:rPr>
-        <w:t xml:space="preserve">Zehong Ma, Longhui Wei, Feng Wang, Shiliang Zhang, and Qi Tian. MagCache: Fast video generation with magnitude-aware cache. In </w:t>
-      </w:r>
-      <w:r>
-        <w:rPr>
-          <w:i/>
-          <w:sz w:val="19"/>
-        </w:rPr>
-        <w:t>Advances in Neural Information Processing Systems (NeurIPS)</w:t>
-      </w:r>
-      <w:r>
-        <w:rPr>
-          <w:sz w:val="19"/>
-        </w:rPr>
-        <w:t>, 2025. arXiv:2506.09045.</w:t>
+        <w:t>Zeyi Liu, Shuang Li, Eric Cousineau, Siyuan Feng, Benjamin Burchfiel, and Shuran Song. Geometry-aware 4D video generation for robot manipulation. arXiv preprint, 2025. arXiv:2507.01099.</w:t>
       </w:r>
     </w:p>
     <w:p>
@@ -7609,20 +9473,20 @@
         <w:rPr>
           <w:sz w:val="19"/>
         </w:rPr>
-        <w:t xml:space="preserve">Tim Salimans and Jonathan Ho. Progressive distillation for fast sampling of diffusion models. In </w:t>
+        <w:t xml:space="preserve">Zehong Ma, Longhui Wei, Feng Wang, Shiliang Zhang, and Qi Tian. MagCache: Fast video generation with magnitude-aware cache. In </w:t>
       </w:r>
       <w:r>
         <w:rPr>
           <w:i/>
           <w:sz w:val="19"/>
         </w:rPr>
-        <w:t>International Conference on Learning Representations (ICLR)</w:t>
+        <w:t>Advances in Neural Information Processing Systems (NeurIPS)</w:t>
       </w:r>
       <w:r>
         <w:rPr>
           <w:sz w:val="19"/>
         </w:rPr>
-        <w:t>, 2022. arXiv:2202.00512.</w:t>
+        <w:t>, 2025. arXiv:2506.09045.</w:t>
       </w:r>
     </w:p>
     <w:p>
@@ -7635,7 +9499,20 @@
         <w:rPr>
           <w:sz w:val="19"/>
         </w:rPr>
-        <w:t>Sand.ai. MAGI-1: Autoregressive video generation at scale. arXiv preprint, 2025. arXiv:2505.13211.</w:t>
+        <w:t xml:space="preserve">Tim Salimans and Jonathan Ho. Progressive distillation for fast sampling of diffusion models. In </w:t>
+      </w:r>
+      <w:r>
+        <w:rPr>
+          <w:i/>
+          <w:sz w:val="19"/>
+        </w:rPr>
+        <w:t>International Conference on Learning Representations (ICLR)</w:t>
+      </w:r>
+      <w:r>
+        <w:rPr>
+          <w:sz w:val="19"/>
+        </w:rPr>
+        <w:t>, 2022. arXiv:2202.00512.</w:t>
       </w:r>
     </w:p>
     <w:p>
@@ -7648,20 +9525,7 @@
         <w:rPr>
           <w:sz w:val="19"/>
         </w:rPr>
-        <w:t xml:space="preserve">Yang Song, Prafulla Dhariwal, Mark Chen, and Ilya Sutskever. Consistency models. In </w:t>
-      </w:r>
-      <w:r>
-        <w:rPr>
-          <w:i/>
-          <w:sz w:val="19"/>
-        </w:rPr>
-        <w:t>International Conference on Machine Learning (ICML)</w:t>
-      </w:r>
-      <w:r>
-        <w:rPr>
-          <w:sz w:val="19"/>
-        </w:rPr>
-        <w:t>, 2023. arXiv:2303.01469.</w:t>
+        <w:t>Sand.ai. MAGI-1: Autoregressive video generation at scale. arXiv preprint, 2025. arXiv:2505.13211.</w:t>
       </w:r>
     </w:p>
     <w:p>
@@ -7674,7 +9538,20 @@
         <w:rPr>
           <w:sz w:val="19"/>
         </w:rPr>
-        <w:t>Toyota Research Institute (TRI LBM Team). A careful examination of large behavior models for multitask dexterous manipulation. arXiv preprint, 2025. arXiv:2507.05331.</w:t>
+        <w:t xml:space="preserve">Yang Song, Prafulla Dhariwal, Mark Chen, and Ilya Sutskever. Consistency models. In </w:t>
+      </w:r>
+      <w:r>
+        <w:rPr>
+          <w:i/>
+          <w:sz w:val="19"/>
+        </w:rPr>
+        <w:t>International Conference on Machine Learning (ICML)</w:t>
+      </w:r>
+      <w:r>
+        <w:rPr>
+          <w:sz w:val="19"/>
+        </w:rPr>
+        <w:t>, 2023. arXiv:2303.01469.</w:t>
       </w:r>
     </w:p>
     <w:p>
@@ -7687,6 +9564,45 @@
         <w:rPr>
           <w:sz w:val="19"/>
         </w:rPr>
+        <w:t>Toyota Research Institute (TRI LBM Team). A careful examination of large behavior models for multitask dexterous manipulation. arXiv preprint, 2025. arXiv:2507.05331.</w:t>
+      </w:r>
+    </w:p>
+    <w:p>
+      <w:pPr>
+        <w:spacing w:after="60"/>
+        <w:ind w:left="432" w:hanging="432"/>
+        <w:jc w:val="both"/>
+      </w:pPr>
+      <w:r>
+        <w:rPr>
+          <w:sz w:val="19"/>
+        </w:rPr>
+        <w:t xml:space="preserve">Jonathan Tremblay, Stephen Tyree, Terry Mosier, and Stan Birchfield. Indirect object-to-robot pose estimation from an external monocular RGB camera. In </w:t>
+      </w:r>
+      <w:r>
+        <w:rPr>
+          <w:i/>
+          <w:sz w:val="19"/>
+        </w:rPr>
+        <w:t>IEEE/RSJ International Conference on Intelligent Robots and Systems (IROS)</w:t>
+      </w:r>
+      <w:r>
+        <w:rPr>
+          <w:sz w:val="19"/>
+        </w:rPr>
+        <w:t>, 2020. arXiv:2008.11822.</w:t>
+      </w:r>
+    </w:p>
+    <w:p>
+      <w:pPr>
+        <w:spacing w:after="60"/>
+        <w:ind w:left="432" w:hanging="432"/>
+        <w:jc w:val="both"/>
+      </w:pPr>
+      <w:r>
+        <w:rPr>
+          <w:sz w:val="19"/>
+        </w:rPr>
         <w:t xml:space="preserve">Frank Wilcoxon. Individual comparisons by ranking methods. </w:t>
       </w:r>
       <w:r>
@@ -7701,6 +9617,32 @@
           <w:sz w:val="19"/>
         </w:rPr>
         <w:t>, 1(6):80-83, 1945.</w:t>
+      </w:r>
+    </w:p>
+    <w:p>
+      <w:pPr>
+        <w:spacing w:after="60"/>
+        <w:ind w:left="432" w:hanging="432"/>
+        <w:jc w:val="both"/>
+      </w:pPr>
+      <w:r>
+        <w:rPr>
+          <w:sz w:val="19"/>
+        </w:rPr>
+        <w:t xml:space="preserve">Lihe Yang, Bingyi Kang, Zilong Huang, Zhen Zhao, Xiaogang Xu, Jiashi Feng, and Hengshuang Zhao. Depth Anything V2. In </w:t>
+      </w:r>
+      <w:r>
+        <w:rPr>
+          <w:i/>
+          <w:sz w:val="19"/>
+        </w:rPr>
+        <w:t>Advances in Neural Information Processing Systems (NeurIPS)</w:t>
+      </w:r>
+      <w:r>
+        <w:rPr>
+          <w:sz w:val="19"/>
+        </w:rPr>
+        <w:t>, 2024. arXiv:2406.09414.</w:t>
       </w:r>
     </w:p>
     <w:p>
@@ -8079,6 +10021,30 @@
     </w:p>
     <w:p>
       <w:pPr>
+        <w:jc w:val="both"/>
+      </w:pPr>
+      <w:r>
+        <w:rPr>
+          <w:b/>
+        </w:rPr>
+        <w:t>Runs on a shared GPU.</w:t>
+      </w:r>
+      <w:r>
+        <w:t xml:space="preserve"> The GPU was shared with other users. The first attempt at the 4000-step run of Section 4.5 stopped at step 850 with a CUDA out-of-memory error because another process held 8.87 GB at the time. We added a </w:t>
+      </w:r>
+      <w:r>
+        <w:rPr>
+          <w:rFonts w:ascii="Courier New" w:hAnsi="Courier New"/>
+          <w:sz w:val="19"/>
+        </w:rPr>
+        <w:t>--resume</w:t>
+      </w:r>
+      <w:r>
+        <w:t xml:space="preserve"> flag that restarts from the periodic checkpoints written every 200 steps (the optimizer moments restart from zero) and a launcher that retries after an out-of-memory error; the second attempt completed without interruption.</w:t>
+      </w:r>
+    </w:p>
+    <w:p>
+      <w:pPr>
         <w:pStyle w:val="Heading2"/>
       </w:pPr>
       <w:r>
@@ -8168,7 +10134,1057 @@
         <w:jc w:val="both"/>
       </w:pPr>
       <w:r>
-        <w:t>As a simulator-free proxy we implemented bench_policy_proxy.py, which computes region metrics on the gripper (label ids 29-35) and the apple (label id 44): AbsRel, PSNR, and the 3D centroid error in cm between predicted and ground-truth pointmaps inside the same mask, per predicted frame 1 to 10. This proxy has not been run and we report no numbers for it.</w:t>
+        <w:t>As a simulator-free proxy we ran bench_policy_proxy.py on the main student (6a step 1600, per-view anchor), the training-free 3-step re-noising teacher, and the 25-step teacher on the same 20 samples (40 view-samples; the apple is visible in 37). Regions come from the ground-truth label maps: gripper = label ids 29 to 35 (2.35% of pixels), apple = id 44 (0.23%), background = the rest. AbsRel and PSNR are computed inside the masks dilated by 3 pixels, and the 3D centroid error is the distance in cm between the mean predicted pointmap and the mean ground-truth pointmap inside the ground-truth mask, over predicted frames 1 to 10. Table 8 gives the results.</w:t>
+      </w:r>
+    </w:p>
+    <w:p>
+      <w:pPr>
+        <w:jc w:val="both"/>
+      </w:pPr>
+      <w:r>
+        <w:t>Table 8: Region metrics on the gripper and the apple (20 samples, 40 view-samples, frames 1 to 10). The student's whole-image AbsRel gap comes from the background; on the gripper and the apple it is not distinguishable from the teacher by the Wilcoxon test, but its gripper centroid error is 2.0 cm higher with a 90% confidence interval that excludes zero.</w:t>
+      </w:r>
+    </w:p>
+    <w:p>
+      <w:pPr>
+        <w:jc w:val="center"/>
+      </w:pPr>
+    </w:p>
+    <w:tbl>
+      <w:tblPr>
+        <w:tblStyle w:val="TableGrid"/>
+        <w:tblW w:type="auto" w:w="0"/>
+        <w:jc w:val="center"/>
+        <w:tblLook w:firstColumn="1" w:firstRow="1" w:lastColumn="0" w:lastRow="0" w:noHBand="0" w:noVBand="1" w:val="04A0"/>
+        <w:tblBorders>
+          <w:top w:val="nil"/>
+          <w:left w:val="nil"/>
+          <w:bottom w:val="nil"/>
+          <w:right w:val="nil"/>
+          <w:insideH w:val="nil"/>
+          <w:insideV w:val="nil"/>
+        </w:tblBorders>
+      </w:tblPr>
+      <w:tblGrid>
+        <w:gridCol w:w="1560"/>
+        <w:gridCol w:w="1560"/>
+        <w:gridCol w:w="1560"/>
+        <w:gridCol w:w="1560"/>
+        <w:gridCol w:w="1560"/>
+        <w:gridCol w:w="1560"/>
+      </w:tblGrid>
+      <w:tr>
+        <w:tc>
+          <w:tcPr>
+            <w:tcW w:type="dxa" w:w="1560"/>
+            <w:tcBorders>
+              <w:top w:val="single" w:sz="8" w:color="000000"/>
+              <w:bottom w:val="single" w:sz="4" w:color="000000"/>
+            </w:tcBorders>
+          </w:tcPr>
+          <w:p>
+            <w:pPr>
+              <w:spacing w:after="0" w:before="0"/>
+              <w:jc w:val="left"/>
+            </w:pPr>
+            <w:r>
+              <w:rPr>
+                <w:b/>
+                <w:sz w:val="17"/>
+              </w:rPr>
+            </w:r>
+            <w:r>
+              <w:rPr>
+                <w:b/>
+                <w:sz w:val="17"/>
+              </w:rPr>
+              <w:t>metric</w:t>
+            </w:r>
+          </w:p>
+        </w:tc>
+        <w:tc>
+          <w:tcPr>
+            <w:tcW w:type="dxa" w:w="1560"/>
+            <w:tcBorders>
+              <w:top w:val="single" w:sz="8" w:color="000000"/>
+              <w:bottom w:val="single" w:sz="4" w:color="000000"/>
+            </w:tcBorders>
+          </w:tcPr>
+          <w:p>
+            <w:pPr>
+              <w:spacing w:after="0" w:before="0"/>
+              <w:jc w:val="center"/>
+            </w:pPr>
+            <w:r>
+              <w:rPr>
+                <w:b/>
+                <w:sz w:val="17"/>
+              </w:rPr>
+            </w:r>
+            <w:r>
+              <w:rPr>
+                <w:b/>
+                <w:sz w:val="17"/>
+              </w:rPr>
+              <w:t>teacher</w:t>
+            </w:r>
+          </w:p>
+        </w:tc>
+        <w:tc>
+          <w:tcPr>
+            <w:tcW w:type="dxa" w:w="1560"/>
+            <w:tcBorders>
+              <w:top w:val="single" w:sz="8" w:color="000000"/>
+              <w:bottom w:val="single" w:sz="4" w:color="000000"/>
+            </w:tcBorders>
+          </w:tcPr>
+          <w:p>
+            <w:pPr>
+              <w:spacing w:after="0" w:before="0"/>
+              <w:jc w:val="center"/>
+            </w:pPr>
+            <w:r>
+              <w:rPr>
+                <w:b/>
+                <w:sz w:val="17"/>
+              </w:rPr>
+            </w:r>
+            <w:r>
+              <w:rPr>
+                <w:b/>
+                <w:sz w:val="17"/>
+              </w:rPr>
+              <w:t>training-free 3-step</w:t>
+            </w:r>
+          </w:p>
+        </w:tc>
+        <w:tc>
+          <w:tcPr>
+            <w:tcW w:type="dxa" w:w="1560"/>
+            <w:tcBorders>
+              <w:top w:val="single" w:sz="8" w:color="000000"/>
+              <w:bottom w:val="single" w:sz="4" w:color="000000"/>
+            </w:tcBorders>
+          </w:tcPr>
+          <w:p>
+            <w:pPr>
+              <w:spacing w:after="0" w:before="0"/>
+              <w:jc w:val="center"/>
+            </w:pPr>
+            <w:r>
+              <w:rPr>
+                <w:b/>
+                <w:sz w:val="17"/>
+              </w:rPr>
+            </w:r>
+            <w:r>
+              <w:rPr>
+                <w:b/>
+                <w:sz w:val="17"/>
+              </w:rPr>
+              <w:t>student 3-step</w:t>
+            </w:r>
+          </w:p>
+        </w:tc>
+        <w:tc>
+          <w:tcPr>
+            <w:tcW w:type="dxa" w:w="1560"/>
+            <w:tcBorders>
+              <w:top w:val="single" w:sz="8" w:color="000000"/>
+              <w:bottom w:val="single" w:sz="4" w:color="000000"/>
+            </w:tcBorders>
+          </w:tcPr>
+          <w:p>
+            <w:pPr>
+              <w:spacing w:after="0" w:before="0"/>
+              <w:jc w:val="center"/>
+            </w:pPr>
+            <w:r>
+              <w:rPr>
+                <w:b/>
+                <w:sz w:val="17"/>
+              </w:rPr>
+            </w:r>
+            <w:r>
+              <w:rPr>
+                <w:b/>
+                <w:sz w:val="17"/>
+              </w:rPr>
+              <w:t>student − teacher [90% CI]</w:t>
+            </w:r>
+          </w:p>
+        </w:tc>
+        <w:tc>
+          <w:tcPr>
+            <w:tcW w:type="dxa" w:w="1560"/>
+            <w:tcBorders>
+              <w:top w:val="single" w:sz="8" w:color="000000"/>
+              <w:bottom w:val="single" w:sz="4" w:color="000000"/>
+            </w:tcBorders>
+          </w:tcPr>
+          <w:p>
+            <w:pPr>
+              <w:spacing w:after="0" w:before="0"/>
+              <w:jc w:val="center"/>
+            </w:pPr>
+            <w:r>
+              <w:rPr>
+                <w:b/>
+                <w:sz w:val="17"/>
+              </w:rPr>
+            </w:r>
+            <w:r>
+              <w:rPr>
+                <w:b/>
+                <w:sz w:val="17"/>
+              </w:rPr>
+              <w:t>p</w:t>
+            </w:r>
+          </w:p>
+        </w:tc>
+      </w:tr>
+      <w:tr>
+        <w:tc>
+          <w:tcPr>
+            <w:tcW w:type="dxa" w:w="1560"/>
+          </w:tcPr>
+          <w:p>
+            <w:pPr>
+              <w:spacing w:after="0" w:before="0"/>
+              <w:jc w:val="left"/>
+            </w:pPr>
+            <w:r>
+              <w:rPr>
+                <w:sz w:val="17"/>
+              </w:rPr>
+            </w:r>
+            <w:r>
+              <w:rPr>
+                <w:sz w:val="17"/>
+              </w:rPr>
+              <w:t>gripper AbsRel</w:t>
+            </w:r>
+          </w:p>
+        </w:tc>
+        <w:tc>
+          <w:tcPr>
+            <w:tcW w:type="dxa" w:w="1560"/>
+          </w:tcPr>
+          <w:p>
+            <w:pPr>
+              <w:spacing w:after="0" w:before="0"/>
+              <w:jc w:val="center"/>
+            </w:pPr>
+            <w:r>
+              <w:rPr>
+                <w:sz w:val="17"/>
+              </w:rPr>
+            </w:r>
+            <w:r>
+              <w:rPr>
+                <w:sz w:val="17"/>
+              </w:rPr>
+              <w:t>0.206</w:t>
+            </w:r>
+          </w:p>
+        </w:tc>
+        <w:tc>
+          <w:tcPr>
+            <w:tcW w:type="dxa" w:w="1560"/>
+          </w:tcPr>
+          <w:p>
+            <w:pPr>
+              <w:spacing w:after="0" w:before="0"/>
+              <w:jc w:val="center"/>
+            </w:pPr>
+            <w:r>
+              <w:rPr>
+                <w:sz w:val="17"/>
+              </w:rPr>
+            </w:r>
+            <w:r>
+              <w:rPr>
+                <w:sz w:val="17"/>
+              </w:rPr>
+              <w:t>0.203</w:t>
+            </w:r>
+          </w:p>
+        </w:tc>
+        <w:tc>
+          <w:tcPr>
+            <w:tcW w:type="dxa" w:w="1560"/>
+          </w:tcPr>
+          <w:p>
+            <w:pPr>
+              <w:spacing w:after="0" w:before="0"/>
+              <w:jc w:val="center"/>
+            </w:pPr>
+            <w:r>
+              <w:rPr>
+                <w:sz w:val="17"/>
+              </w:rPr>
+            </w:r>
+            <w:r>
+              <w:rPr>
+                <w:sz w:val="17"/>
+              </w:rPr>
+              <w:t>0.225</w:t>
+            </w:r>
+          </w:p>
+        </w:tc>
+        <w:tc>
+          <w:tcPr>
+            <w:tcW w:type="dxa" w:w="1560"/>
+          </w:tcPr>
+          <w:p>
+            <w:pPr>
+              <w:spacing w:after="0" w:before="0"/>
+              <w:jc w:val="center"/>
+            </w:pPr>
+            <w:r>
+              <w:rPr>
+                <w:sz w:val="17"/>
+              </w:rPr>
+            </w:r>
+            <w:r>
+              <w:rPr>
+                <w:sz w:val="17"/>
+              </w:rPr>
+              <w:t>+0.019 [−0.004, +0.042]</w:t>
+            </w:r>
+          </w:p>
+        </w:tc>
+        <w:tc>
+          <w:tcPr>
+            <w:tcW w:type="dxa" w:w="1560"/>
+          </w:tcPr>
+          <w:p>
+            <w:pPr>
+              <w:spacing w:after="0" w:before="0"/>
+              <w:jc w:val="center"/>
+            </w:pPr>
+            <w:r>
+              <w:rPr>
+                <w:sz w:val="17"/>
+              </w:rPr>
+            </w:r>
+            <w:r>
+              <w:rPr>
+                <w:sz w:val="17"/>
+              </w:rPr>
+              <w:t>0.24</w:t>
+            </w:r>
+          </w:p>
+        </w:tc>
+      </w:tr>
+      <w:tr>
+        <w:tc>
+          <w:tcPr>
+            <w:tcW w:type="dxa" w:w="1560"/>
+          </w:tcPr>
+          <w:p>
+            <w:pPr>
+              <w:spacing w:after="0" w:before="0"/>
+              <w:jc w:val="left"/>
+            </w:pPr>
+            <w:r>
+              <w:rPr>
+                <w:sz w:val="17"/>
+              </w:rPr>
+            </w:r>
+            <w:r>
+              <w:rPr>
+                <w:sz w:val="17"/>
+              </w:rPr>
+              <w:t>gripper centroid error (cm)</w:t>
+            </w:r>
+          </w:p>
+        </w:tc>
+        <w:tc>
+          <w:tcPr>
+            <w:tcW w:type="dxa" w:w="1560"/>
+          </w:tcPr>
+          <w:p>
+            <w:pPr>
+              <w:spacing w:after="0" w:before="0"/>
+              <w:jc w:val="center"/>
+            </w:pPr>
+            <w:r>
+              <w:rPr>
+                <w:sz w:val="17"/>
+              </w:rPr>
+            </w:r>
+            <w:r>
+              <w:rPr>
+                <w:sz w:val="17"/>
+              </w:rPr>
+              <w:t>12.3</w:t>
+            </w:r>
+          </w:p>
+        </w:tc>
+        <w:tc>
+          <w:tcPr>
+            <w:tcW w:type="dxa" w:w="1560"/>
+          </w:tcPr>
+          <w:p>
+            <w:pPr>
+              <w:spacing w:after="0" w:before="0"/>
+              <w:jc w:val="center"/>
+            </w:pPr>
+            <w:r>
+              <w:rPr>
+                <w:sz w:val="17"/>
+              </w:rPr>
+            </w:r>
+            <w:r>
+              <w:rPr>
+                <w:sz w:val="17"/>
+              </w:rPr>
+              <w:t>12.8</w:t>
+            </w:r>
+          </w:p>
+        </w:tc>
+        <w:tc>
+          <w:tcPr>
+            <w:tcW w:type="dxa" w:w="1560"/>
+          </w:tcPr>
+          <w:p>
+            <w:pPr>
+              <w:spacing w:after="0" w:before="0"/>
+              <w:jc w:val="center"/>
+            </w:pPr>
+            <w:r>
+              <w:rPr>
+                <w:sz w:val="17"/>
+              </w:rPr>
+            </w:r>
+            <w:r>
+              <w:rPr>
+                <w:sz w:val="17"/>
+              </w:rPr>
+              <w:t>14.3</w:t>
+            </w:r>
+          </w:p>
+        </w:tc>
+        <w:tc>
+          <w:tcPr>
+            <w:tcW w:type="dxa" w:w="1560"/>
+          </w:tcPr>
+          <w:p>
+            <w:pPr>
+              <w:spacing w:after="0" w:before="0"/>
+              <w:jc w:val="center"/>
+            </w:pPr>
+            <w:r>
+              <w:rPr>
+                <w:sz w:val="17"/>
+              </w:rPr>
+            </w:r>
+            <w:r>
+              <w:rPr>
+                <w:sz w:val="17"/>
+              </w:rPr>
+              <w:t>+2.0 [+0.3, +3.7]</w:t>
+            </w:r>
+          </w:p>
+        </w:tc>
+        <w:tc>
+          <w:tcPr>
+            <w:tcW w:type="dxa" w:w="1560"/>
+          </w:tcPr>
+          <w:p>
+            <w:pPr>
+              <w:spacing w:after="0" w:before="0"/>
+              <w:jc w:val="center"/>
+            </w:pPr>
+            <w:r>
+              <w:rPr>
+                <w:sz w:val="17"/>
+              </w:rPr>
+            </w:r>
+            <w:r>
+              <w:rPr>
+                <w:sz w:val="17"/>
+              </w:rPr>
+              <w:t>0.11</w:t>
+            </w:r>
+          </w:p>
+        </w:tc>
+      </w:tr>
+      <w:tr>
+        <w:tc>
+          <w:tcPr>
+            <w:tcW w:type="dxa" w:w="1560"/>
+          </w:tcPr>
+          <w:p>
+            <w:pPr>
+              <w:spacing w:after="0" w:before="0"/>
+              <w:jc w:val="left"/>
+            </w:pPr>
+            <w:r>
+              <w:rPr>
+                <w:sz w:val="17"/>
+              </w:rPr>
+            </w:r>
+            <w:r>
+              <w:rPr>
+                <w:sz w:val="17"/>
+              </w:rPr>
+              <w:t>gripper centroid error, last frame (cm)</w:t>
+            </w:r>
+          </w:p>
+        </w:tc>
+        <w:tc>
+          <w:tcPr>
+            <w:tcW w:type="dxa" w:w="1560"/>
+          </w:tcPr>
+          <w:p>
+            <w:pPr>
+              <w:spacing w:after="0" w:before="0"/>
+              <w:jc w:val="center"/>
+            </w:pPr>
+            <w:r>
+              <w:rPr>
+                <w:sz w:val="17"/>
+              </w:rPr>
+            </w:r>
+            <w:r>
+              <w:rPr>
+                <w:sz w:val="17"/>
+              </w:rPr>
+              <w:t>12.4</w:t>
+            </w:r>
+          </w:p>
+        </w:tc>
+        <w:tc>
+          <w:tcPr>
+            <w:tcW w:type="dxa" w:w="1560"/>
+          </w:tcPr>
+          <w:p>
+            <w:pPr>
+              <w:spacing w:after="0" w:before="0"/>
+              <w:jc w:val="center"/>
+            </w:pPr>
+            <w:r>
+              <w:rPr>
+                <w:sz w:val="17"/>
+              </w:rPr>
+            </w:r>
+            <w:r>
+              <w:rPr>
+                <w:sz w:val="17"/>
+              </w:rPr>
+              <w:t>13.6</w:t>
+            </w:r>
+          </w:p>
+        </w:tc>
+        <w:tc>
+          <w:tcPr>
+            <w:tcW w:type="dxa" w:w="1560"/>
+          </w:tcPr>
+          <w:p>
+            <w:pPr>
+              <w:spacing w:after="0" w:before="0"/>
+              <w:jc w:val="center"/>
+            </w:pPr>
+            <w:r>
+              <w:rPr>
+                <w:sz w:val="17"/>
+              </w:rPr>
+            </w:r>
+            <w:r>
+              <w:rPr>
+                <w:sz w:val="17"/>
+              </w:rPr>
+              <w:t>15.4</w:t>
+            </w:r>
+          </w:p>
+        </w:tc>
+        <w:tc>
+          <w:tcPr>
+            <w:tcW w:type="dxa" w:w="1560"/>
+          </w:tcPr>
+          <w:p>
+            <w:pPr>
+              <w:spacing w:after="0" w:before="0"/>
+              <w:jc w:val="center"/>
+            </w:pPr>
+            <w:r>
+              <w:rPr>
+                <w:sz w:val="17"/>
+              </w:rPr>
+            </w:r>
+            <w:r>
+              <w:rPr>
+                <w:sz w:val="17"/>
+              </w:rPr>
+              <w:t>+3.0 [+0.2, +5.8]</w:t>
+            </w:r>
+          </w:p>
+        </w:tc>
+        <w:tc>
+          <w:tcPr>
+            <w:tcW w:type="dxa" w:w="1560"/>
+          </w:tcPr>
+          <w:p>
+            <w:pPr>
+              <w:spacing w:after="0" w:before="0"/>
+              <w:jc w:val="center"/>
+            </w:pPr>
+            <w:r>
+              <w:rPr>
+                <w:sz w:val="17"/>
+              </w:rPr>
+            </w:r>
+            <w:r>
+              <w:rPr>
+                <w:sz w:val="17"/>
+              </w:rPr>
+              <w:t>0.064</w:t>
+            </w:r>
+          </w:p>
+        </w:tc>
+      </w:tr>
+      <w:tr>
+        <w:tc>
+          <w:tcPr>
+            <w:tcW w:type="dxa" w:w="1560"/>
+          </w:tcPr>
+          <w:p>
+            <w:pPr>
+              <w:spacing w:after="0" w:before="0"/>
+              <w:jc w:val="left"/>
+            </w:pPr>
+            <w:r>
+              <w:rPr>
+                <w:sz w:val="17"/>
+              </w:rPr>
+            </w:r>
+            <w:r>
+              <w:rPr>
+                <w:sz w:val="17"/>
+              </w:rPr>
+              <w:t>apple AbsRel</w:t>
+            </w:r>
+          </w:p>
+        </w:tc>
+        <w:tc>
+          <w:tcPr>
+            <w:tcW w:type="dxa" w:w="1560"/>
+          </w:tcPr>
+          <w:p>
+            <w:pPr>
+              <w:spacing w:after="0" w:before="0"/>
+              <w:jc w:val="center"/>
+            </w:pPr>
+            <w:r>
+              <w:rPr>
+                <w:sz w:val="17"/>
+              </w:rPr>
+            </w:r>
+            <w:r>
+              <w:rPr>
+                <w:sz w:val="17"/>
+              </w:rPr>
+              <w:t>0.127</w:t>
+            </w:r>
+          </w:p>
+        </w:tc>
+        <w:tc>
+          <w:tcPr>
+            <w:tcW w:type="dxa" w:w="1560"/>
+          </w:tcPr>
+          <w:p>
+            <w:pPr>
+              <w:spacing w:after="0" w:before="0"/>
+              <w:jc w:val="center"/>
+            </w:pPr>
+            <w:r>
+              <w:rPr>
+                <w:sz w:val="17"/>
+              </w:rPr>
+            </w:r>
+            <w:r>
+              <w:rPr>
+                <w:sz w:val="17"/>
+              </w:rPr>
+              <w:t>0.124</w:t>
+            </w:r>
+          </w:p>
+        </w:tc>
+        <w:tc>
+          <w:tcPr>
+            <w:tcW w:type="dxa" w:w="1560"/>
+          </w:tcPr>
+          <w:p>
+            <w:pPr>
+              <w:spacing w:after="0" w:before="0"/>
+              <w:jc w:val="center"/>
+            </w:pPr>
+            <w:r>
+              <w:rPr>
+                <w:sz w:val="17"/>
+              </w:rPr>
+            </w:r>
+            <w:r>
+              <w:rPr>
+                <w:sz w:val="17"/>
+              </w:rPr>
+              <w:t>0.115</w:t>
+            </w:r>
+          </w:p>
+        </w:tc>
+        <w:tc>
+          <w:tcPr>
+            <w:tcW w:type="dxa" w:w="1560"/>
+          </w:tcPr>
+          <w:p>
+            <w:pPr>
+              <w:spacing w:after="0" w:before="0"/>
+              <w:jc w:val="center"/>
+            </w:pPr>
+            <w:r>
+              <w:rPr>
+                <w:sz w:val="17"/>
+              </w:rPr>
+            </w:r>
+            <w:r>
+              <w:rPr>
+                <w:sz w:val="17"/>
+              </w:rPr>
+              <w:t>−0.012 [−0.025, +0.001]</w:t>
+            </w:r>
+          </w:p>
+        </w:tc>
+        <w:tc>
+          <w:tcPr>
+            <w:tcW w:type="dxa" w:w="1560"/>
+          </w:tcPr>
+          <w:p>
+            <w:pPr>
+              <w:spacing w:after="0" w:before="0"/>
+              <w:jc w:val="center"/>
+            </w:pPr>
+            <w:r>
+              <w:rPr>
+                <w:sz w:val="17"/>
+              </w:rPr>
+            </w:r>
+            <w:r>
+              <w:rPr>
+                <w:sz w:val="17"/>
+              </w:rPr>
+              <w:t>0.27</w:t>
+            </w:r>
+          </w:p>
+        </w:tc>
+      </w:tr>
+      <w:tr>
+        <w:tc>
+          <w:tcPr>
+            <w:tcW w:type="dxa" w:w="1560"/>
+          </w:tcPr>
+          <w:p>
+            <w:pPr>
+              <w:spacing w:after="0" w:before="0"/>
+              <w:jc w:val="left"/>
+            </w:pPr>
+            <w:r>
+              <w:rPr>
+                <w:sz w:val="17"/>
+              </w:rPr>
+            </w:r>
+            <w:r>
+              <w:rPr>
+                <w:sz w:val="17"/>
+              </w:rPr>
+              <w:t>apple centroid error (cm)</w:t>
+            </w:r>
+          </w:p>
+        </w:tc>
+        <w:tc>
+          <w:tcPr>
+            <w:tcW w:type="dxa" w:w="1560"/>
+          </w:tcPr>
+          <w:p>
+            <w:pPr>
+              <w:spacing w:after="0" w:before="0"/>
+              <w:jc w:val="center"/>
+            </w:pPr>
+            <w:r>
+              <w:rPr>
+                <w:sz w:val="17"/>
+              </w:rPr>
+            </w:r>
+            <w:r>
+              <w:rPr>
+                <w:sz w:val="17"/>
+              </w:rPr>
+              <w:t>11.4</w:t>
+            </w:r>
+          </w:p>
+        </w:tc>
+        <w:tc>
+          <w:tcPr>
+            <w:tcW w:type="dxa" w:w="1560"/>
+          </w:tcPr>
+          <w:p>
+            <w:pPr>
+              <w:spacing w:after="0" w:before="0"/>
+              <w:jc w:val="center"/>
+            </w:pPr>
+            <w:r>
+              <w:rPr>
+                <w:sz w:val="17"/>
+              </w:rPr>
+            </w:r>
+            <w:r>
+              <w:rPr>
+                <w:sz w:val="17"/>
+              </w:rPr>
+              <w:t>11.3</w:t>
+            </w:r>
+          </w:p>
+        </w:tc>
+        <w:tc>
+          <w:tcPr>
+            <w:tcW w:type="dxa" w:w="1560"/>
+          </w:tcPr>
+          <w:p>
+            <w:pPr>
+              <w:spacing w:after="0" w:before="0"/>
+              <w:jc w:val="center"/>
+            </w:pPr>
+            <w:r>
+              <w:rPr>
+                <w:sz w:val="17"/>
+              </w:rPr>
+            </w:r>
+            <w:r>
+              <w:rPr>
+                <w:sz w:val="17"/>
+              </w:rPr>
+              <w:t>12.9</w:t>
+            </w:r>
+          </w:p>
+        </w:tc>
+        <w:tc>
+          <w:tcPr>
+            <w:tcW w:type="dxa" w:w="1560"/>
+          </w:tcPr>
+          <w:p>
+            <w:pPr>
+              <w:spacing w:after="0" w:before="0"/>
+              <w:jc w:val="center"/>
+            </w:pPr>
+            <w:r>
+              <w:rPr>
+                <w:sz w:val="17"/>
+              </w:rPr>
+            </w:r>
+            <w:r>
+              <w:rPr>
+                <w:sz w:val="17"/>
+              </w:rPr>
+              <w:t>+1.6 [−0.1, +3.2]</w:t>
+            </w:r>
+          </w:p>
+        </w:tc>
+        <w:tc>
+          <w:tcPr>
+            <w:tcW w:type="dxa" w:w="1560"/>
+          </w:tcPr>
+          <w:p>
+            <w:pPr>
+              <w:spacing w:after="0" w:before="0"/>
+              <w:jc w:val="center"/>
+            </w:pPr>
+            <w:r>
+              <w:rPr>
+                <w:sz w:val="17"/>
+              </w:rPr>
+            </w:r>
+            <w:r>
+              <w:rPr>
+                <w:sz w:val="17"/>
+              </w:rPr>
+              <w:t>0.13</w:t>
+            </w:r>
+          </w:p>
+        </w:tc>
+      </w:tr>
+      <w:tr>
+        <w:tc>
+          <w:tcPr>
+            <w:tcW w:type="dxa" w:w="1560"/>
+            <w:tcBorders>
+              <w:bottom w:val="single" w:sz="8" w:color="000000"/>
+            </w:tcBorders>
+          </w:tcPr>
+          <w:p>
+            <w:pPr>
+              <w:spacing w:after="0" w:before="0"/>
+              <w:jc w:val="left"/>
+            </w:pPr>
+            <w:r>
+              <w:rPr>
+                <w:sz w:val="17"/>
+              </w:rPr>
+            </w:r>
+            <w:r>
+              <w:rPr>
+                <w:sz w:val="17"/>
+              </w:rPr>
+              <w:t>background AbsRel</w:t>
+            </w:r>
+          </w:p>
+        </w:tc>
+        <w:tc>
+          <w:tcPr>
+            <w:tcW w:type="dxa" w:w="1560"/>
+            <w:tcBorders>
+              <w:bottom w:val="single" w:sz="8" w:color="000000"/>
+            </w:tcBorders>
+          </w:tcPr>
+          <w:p>
+            <w:pPr>
+              <w:spacing w:after="0" w:before="0"/>
+              <w:jc w:val="center"/>
+            </w:pPr>
+            <w:r>
+              <w:rPr>
+                <w:sz w:val="17"/>
+              </w:rPr>
+            </w:r>
+            <w:r>
+              <w:rPr>
+                <w:sz w:val="17"/>
+              </w:rPr>
+              <w:t>0.063</w:t>
+            </w:r>
+          </w:p>
+        </w:tc>
+        <w:tc>
+          <w:tcPr>
+            <w:tcW w:type="dxa" w:w="1560"/>
+            <w:tcBorders>
+              <w:bottom w:val="single" w:sz="8" w:color="000000"/>
+            </w:tcBorders>
+          </w:tcPr>
+          <w:p>
+            <w:pPr>
+              <w:spacing w:after="0" w:before="0"/>
+              <w:jc w:val="center"/>
+            </w:pPr>
+            <w:r>
+              <w:rPr>
+                <w:sz w:val="17"/>
+              </w:rPr>
+            </w:r>
+            <w:r>
+              <w:rPr>
+                <w:sz w:val="17"/>
+              </w:rPr>
+              <w:t>0.063</w:t>
+            </w:r>
+          </w:p>
+        </w:tc>
+        <w:tc>
+          <w:tcPr>
+            <w:tcW w:type="dxa" w:w="1560"/>
+            <w:tcBorders>
+              <w:bottom w:val="single" w:sz="8" w:color="000000"/>
+            </w:tcBorders>
+          </w:tcPr>
+          <w:p>
+            <w:pPr>
+              <w:spacing w:after="0" w:before="0"/>
+              <w:jc w:val="center"/>
+            </w:pPr>
+            <w:r>
+              <w:rPr>
+                <w:sz w:val="17"/>
+              </w:rPr>
+            </w:r>
+            <w:r>
+              <w:rPr>
+                <w:sz w:val="17"/>
+              </w:rPr>
+              <w:t>0.078</w:t>
+            </w:r>
+          </w:p>
+        </w:tc>
+        <w:tc>
+          <w:tcPr>
+            <w:tcW w:type="dxa" w:w="1560"/>
+            <w:tcBorders>
+              <w:bottom w:val="single" w:sz="8" w:color="000000"/>
+            </w:tcBorders>
+          </w:tcPr>
+          <w:p>
+            <w:pPr>
+              <w:spacing w:after="0" w:before="0"/>
+              <w:jc w:val="center"/>
+            </w:pPr>
+            <w:r>
+              <w:rPr>
+                <w:sz w:val="17"/>
+              </w:rPr>
+            </w:r>
+            <w:r>
+              <w:rPr>
+                <w:sz w:val="17"/>
+              </w:rPr>
+              <w:t>+0.015 [+0.010, +0.021]</w:t>
+            </w:r>
+          </w:p>
+        </w:tc>
+        <w:tc>
+          <w:tcPr>
+            <w:tcW w:type="dxa" w:w="1560"/>
+            <w:tcBorders>
+              <w:bottom w:val="single" w:sz="8" w:color="000000"/>
+            </w:tcBorders>
+          </w:tcPr>
+          <w:p>
+            <w:pPr>
+              <w:spacing w:after="0" w:before="0"/>
+              <w:jc w:val="center"/>
+            </w:pPr>
+            <w:r>
+              <w:rPr>
+                <w:sz w:val="17"/>
+              </w:rPr>
+            </w:r>
+            <w:r>
+              <w:rPr>
+                <w:sz w:val="17"/>
+              </w:rPr>
+              <w:t>&lt;0.001</w:t>
+            </w:r>
+          </w:p>
+        </w:tc>
+      </w:tr>
+    </w:tbl>
+    <w:p>
+      <w:pPr>
+        <w:spacing w:after="40"/>
+      </w:pPr>
+    </w:p>
+    <w:p>
+      <w:pPr>
+        <w:jc w:val="both"/>
+      </w:pPr>
+      <w:r>
+        <w:t>Per frame, the gripper centroid error in cm over frames 1 to 10 is 11.0, 12.6, 13.7, 13.9, 13.2, 12.8, 11.8, 11.2, 10.8, 12.4 for the teacher and 11.9, 11.7, 16.6, 17.3, 15.4, 14.9, 14.6, 13.2, 12.5, 15.4 for the student. The training-free 3-step teacher has a higher region PSNR than the 25-step teacher (gripper +0.80 dB, p&lt;0.001; apple +0.63 dB, p&lt;0.001), so blur helps PSNR on the moving regions as well (Finding 1).</w:t>
+      </w:r>
+    </w:p>
+    <w:p>
+      <w:pPr>
+        <w:jc w:val="both"/>
+      </w:pPr>
+      <w:r>
+        <w:t>Two caveats apply. First, the ground-truth mask is applied to the prediction, so when the predicted arm is displaced the mask covers background pixels and the centroid jumps; the teacher's own error of about 12 cm is inflated by this mask mismatch and by the multimodal future, and only differences between methods are interpretable. Second, with 40 view-samples the minimal detectable effects are about 3 cm for the gripper centroid, 2.9 cm for the apple centroid, and 0.039 for gripper AbsRel. With these caveats, the whole-image AbsRel gap of +0.015 (Section 4.3) comes from the static background, where the student's difference is the same +0.015 (p&lt;0.001); on the gripper and apple regions the student is not statistically distinguishable from the teacher by the Wilcoxon test, but its gripper centroid error is 2.0 cm higher with a 90% confidence interval [+0.3, +3.7] that excludes zero, which sits at the practical 2 cm margin of Section 4.1 and should be read as a likely small degradation, not as equality.</w:t>
       </w:r>
     </w:p>
     <w:sectPr>

</xml_diff>

<commit_message>
Paper: revert to 6a-1600 main; fold 6d/6e self-anchor story as region-level analysis; add missing N7
</commit_message>
<xml_diff>
--- a/paper/draft_v1.docx
+++ b/paper/draft_v1.docx
@@ -167,7 +167,7 @@
         <w:jc w:val="both"/>
       </w:pPr>
       <w:r>
-        <w:t>On 20 samples (40 view-samples) of the PlaceAppleFromBowlIntoBin task, the three-step student runs in 1.64 s on one RTX 5090, 13.3x faster than the 21.8 s teacher, and meets the 2 s quasi-static budget (1.18 s with torch.compile, timed on 5 samples). Its sharpness (p=0.95) and seed diversity (p=0.84) are statistically indistinguishable from the teacher's, while AbsRel is higher by 0.015 (p&lt;0.001) and LPIPS by 0.018 (p&lt;0.001). The training-free three-step teacher is also fast (2.81 s in fp32) and keeps the teacher's AbsRel, but loses 47% of its seed diversity, and the one-step student halves diversity and raises LPIPS to 0.177; neither meets the quality bar. The humanoid and dynamic budgets remain open, because even with the compiled decoder 0.63 s of conditioner and decoder cost (0.98 s in the bf16 headline configuration) is independent of the number of steps. A self-anchored training loss that applies the same calibration during training removes most of the raw scale shift (0.175 to 0.102 without inference-time correction) but has not yet recovered teacher sharpness (Section 4.5).</w:t>
+        <w:t>On 20 samples (40 view-samples) of the PlaceAppleFromBowlIntoBin task, the three-step student runs in 1.64 s on one RTX 5090, 13.3x faster than the 21.8 s teacher, and meets the 2 s quasi-static budget (1.18 s with torch.compile, timed on 5 samples). Its sharpness (p=0.95) and seed diversity (p=0.84) are statistically indistinguishable from the teacher's, while AbsRel is higher by 0.015 (p&lt;0.001) and LPIPS by 0.018 (p&lt;0.001). The training-free three-step teacher is also fast (2.81 s in fp32) and keeps the teacher's AbsRel, but loses 47% of its seed diversity, and the one-step student halves diversity and raises LPIPS to 0.177; neither meets the quality bar. The humanoid and dynamic budgets remain open, because even with the compiled decoder 0.63 s of conditioner and decoder cost (0.98 s in the bf16 headline configuration) is independent of the number of steps. A self-anchored training loss removes most of the raw scale shift (0.175 to 0.098) and closes the whole-image gap to +0.011, but region-level evaluation shows the gain comes from the static background while gripper localization degrades, so we keep the plain student and report the loss as an instructive negative result (Section 4.5).</w:t>
       </w:r>
     </w:p>
     <w:p>
@@ -7245,7 +7245,7 @@
         <w:rPr>
           <w:b/>
         </w:rPr>
-        <w:t>Self-anchored training loss (preliminary).</w:t>
+        <w:t>Self-anchored training loss.</w:t>
       </w:r>
       <w:r>
         <w:t xml:space="preserve"> The anchor of Section 3.4 can also be applied during training, again without ground truth. In run 6d we add to DMD a log-L1 loss between the decoded depth of predicted frame 0 of each view and the depth of that view's conditioning frame: the left view is matched to its conditioning pointmap directly, and the right view to its conditioning pointmap transformed into the reference frame with </w:t>
@@ -7275,7 +7275,7 @@
         <w:t>β = 1</w:t>
       </w:r>
       <w:r>
-        <w:t>), and the recipe is otherwise that of the main student (v2 initialization, 2000 steps, 1 h, peak 27.3 GB). Predicted frame 0 lies 5 dataset steps after the conditioning frame, so the 2 to 3% of pixels on the moving robot are also pulled toward the conditioning depth; a flag that excludes robot pixels exists but was not used. The training diagnostic rises more slowly than for the main student (0.79 at step 0, 0.889 at 800, 0.951 at 1300, 0.980 at 1600, and 0.998 at 1900, where the main student reached 0.99 at step 1000) and does not overshoot by step 2000; the anchor loss falls from 0.41 to 0.08 and the final anchor scales are 0.987 (left) and 0.966 (right). Table 6 reports the 20-sample evaluation. The loss removes most of the raw scale shift, from 0.175 to 0.102 without any inference-time anchor, and closes the left/right gap after anchoring (0.081/0.082 against 0.076/0.088 for the main student), but at step 2000 sharpness is 18% below the teacher's and LPIPS is 0.030 higher (paired over 40 view-samples: sharpness −0.0024, p&lt;0.001; LPIPS +0.030, p&lt;0.001; AbsRel +0.015, p&lt;0.001; PSNR −0.21 dB, p=0.034; diversity −0.0001, p=1.00). Both sharpness and LPIPS improve from step 1600 to step 2000, so the run is not converged; an extension to 4000 steps is running at the time of writing and is not reported.</w:t>
+        <w:t>), and the recipe is otherwise that of the main student (v2 initialization, peak 27.3 GB), trained for 2000 steps and resumed to 4000. Predicted frame 0 lies 5 dataset steps after the conditioning frame, so the 2 to 3% of pixels on the moving robot are also pulled toward the conditioning depth; a flag that excludes robot pixels exists (evaluated below as run 6e). Table 6 reports the 20-sample evaluation across checkpoints. On whole-image metrics, step 3200 achieves what neither the plain student nor its longer training (Table 7) did: the raw scale is mostly fixed without any inference-time anchor (0.175 to 0.098), the left/right gap after anchoring is closed (0.076/0.080 against 0.076/0.088 for the main student), sharpness is exactly at teacher level (p=0.94), and the whole-image AbsRel gap against the teacher shrinks from +0.015 to +0.011 [90% CI +0.007, +0.016].</w:t>
       </w:r>
     </w:p>
     <w:p>
@@ -7283,7 +7283,15 @@
         <w:jc w:val="both"/>
       </w:pPr>
       <w:r>
-        <w:t>Table 6: Self-anchored training loss (run 6d), 20 samples, fake pixels excluded. Raw AbsRel is measured without the inference-time anchor, anchored AbsRel with the per-view anchor; sharpness is given relative to the teacher in parentheses. The loss removes most of the raw scale shift and equalizes the two views, but sharpness and LPIPS have not recovered by step 2000.</w:t>
+        <w:t>Region-level evaluation reverses this conclusion. Rerunning the region metrics of Appendix A.6 on the 6d step-3200 checkpoint shows that the whole-image gain comes from the static background, whose AbsRel difference against the teacher improves from +0.015 to +0.010, while the policy-relevant moving regions degrade: the gripper centroid error is 3.1 cm above the teacher's (p=0.009), against +2.0 cm (p=0.11) for the plain student, the apple centroid error is +2.7 cm (p&lt;0.001), and gripper AbsRel is +0.032 (p=0.006). This is the failure mode the definition invites: the loss pulls the roughly 2 to 3% of moving pixels toward their conditioning-frame depth. Excluding the robot pixels from the loss (run 6e) does not repair it: at step 3200 the gripper centroid error is +4.7 cm and the apple centroid error +4.4 cm, and the background gain disappears. The evaluated 6e checkpoint also sits in the over-sharpened region (std ratio 1.081), so the two runs are not at matched convergence points, and each variant was trained once, leaving run-to-run variance unquantified. We therefore keep the plain DMD student as the main model, and read this as the policy-level analogue of the pixel-metric finding of Section 4.2: a geometry loss can improve whole-image depth metrics while degrading exactly the regions a downstream policy reads, and only region-level evaluation exposes it.</w:t>
+      </w:r>
+    </w:p>
+    <w:p>
+      <w:pPr>
+        <w:jc w:val="both"/>
+      </w:pPr>
+      <w:r>
+        <w:t>Table 6: Self-anchored training loss (run 6d), 20 samples, fake pixels excluded. Raw AbsRel is measured without the inference-time anchor, anchored AbsRel with the per-view anchor; sharpness deviations from the teacher are given in parentheses where significant. Step 3200 fixes the raw scale and the left/right gap at teacher-level sharpness, but the region metrics of Appendix A.6 show the gain comes from the static background while gripper localization degrades, so the plain student remains the main model.</w:t>
       </w:r>
     </w:p>
     <w:p>
@@ -7985,6 +7993,474 @@
         <w:tc>
           <w:tcPr>
             <w:tcW w:type="dxa" w:w="1337"/>
+          </w:tcPr>
+          <w:p>
+            <w:pPr>
+              <w:spacing w:after="0" w:before="0"/>
+              <w:jc w:val="left"/>
+            </w:pPr>
+            <w:r>
+              <w:rPr>
+                <w:sz w:val="17"/>
+              </w:rPr>
+            </w:r>
+            <w:r>
+              <w:rPr>
+                <w:sz w:val="17"/>
+              </w:rPr>
+              <w:t>6d step 2000</w:t>
+            </w:r>
+          </w:p>
+        </w:tc>
+        <w:tc>
+          <w:tcPr>
+            <w:tcW w:type="dxa" w:w="1337"/>
+          </w:tcPr>
+          <w:p>
+            <w:pPr>
+              <w:spacing w:after="0" w:before="0"/>
+              <w:jc w:val="center"/>
+            </w:pPr>
+            <w:r>
+              <w:rPr>
+                <w:sz w:val="17"/>
+              </w:rPr>
+            </w:r>
+            <w:r>
+              <w:rPr>
+                <w:sz w:val="17"/>
+              </w:rPr>
+              <w:t>0.102 (0.091/0.113)</w:t>
+            </w:r>
+          </w:p>
+        </w:tc>
+        <w:tc>
+          <w:tcPr>
+            <w:tcW w:type="dxa" w:w="1337"/>
+          </w:tcPr>
+          <w:p>
+            <w:pPr>
+              <w:spacing w:after="0" w:before="0"/>
+              <w:jc w:val="center"/>
+            </w:pPr>
+            <w:r>
+              <w:rPr>
+                <w:sz w:val="17"/>
+              </w:rPr>
+            </w:r>
+            <w:r>
+              <w:rPr>
+                <w:sz w:val="17"/>
+              </w:rPr>
+              <w:t>0.081 (0.081/0.082)</w:t>
+            </w:r>
+          </w:p>
+        </w:tc>
+        <w:tc>
+          <w:tcPr>
+            <w:tcW w:type="dxa" w:w="1337"/>
+          </w:tcPr>
+          <w:p>
+            <w:pPr>
+              <w:spacing w:after="0" w:before="0"/>
+              <w:jc w:val="center"/>
+            </w:pPr>
+            <w:r>
+              <w:rPr>
+                <w:sz w:val="17"/>
+              </w:rPr>
+            </w:r>
+            <w:r>
+              <w:rPr>
+                <w:sz w:val="17"/>
+              </w:rPr>
+              <w:t>0.148</w:t>
+            </w:r>
+          </w:p>
+        </w:tc>
+        <w:tc>
+          <w:tcPr>
+            <w:tcW w:type="dxa" w:w="1337"/>
+          </w:tcPr>
+          <w:p>
+            <w:pPr>
+              <w:spacing w:after="0" w:before="0"/>
+              <w:jc w:val="center"/>
+            </w:pPr>
+            <w:r>
+              <w:rPr>
+                <w:sz w:val="17"/>
+              </w:rPr>
+            </w:r>
+            <w:r>
+              <w:rPr>
+                <w:sz w:val="17"/>
+              </w:rPr>
+              <w:t>0.0110 (−18%)</w:t>
+            </w:r>
+          </w:p>
+        </w:tc>
+        <w:tc>
+          <w:tcPr>
+            <w:tcW w:type="dxa" w:w="1337"/>
+          </w:tcPr>
+          <w:p>
+            <w:pPr>
+              <w:spacing w:after="0" w:before="0"/>
+              <w:jc w:val="center"/>
+            </w:pPr>
+            <w:r>
+              <w:rPr>
+                <w:sz w:val="17"/>
+              </w:rPr>
+            </w:r>
+            <w:r>
+              <w:rPr>
+                <w:sz w:val="17"/>
+              </w:rPr>
+              <w:t>20.41</w:t>
+            </w:r>
+          </w:p>
+        </w:tc>
+        <w:tc>
+          <w:tcPr>
+            <w:tcW w:type="dxa" w:w="1337"/>
+          </w:tcPr>
+          <w:p>
+            <w:pPr>
+              <w:spacing w:after="0" w:before="0"/>
+              <w:jc w:val="center"/>
+            </w:pPr>
+            <w:r>
+              <w:rPr>
+                <w:sz w:val="17"/>
+              </w:rPr>
+            </w:r>
+            <w:r>
+              <w:rPr>
+                <w:sz w:val="17"/>
+              </w:rPr>
+              <w:t>0.0226</w:t>
+            </w:r>
+          </w:p>
+        </w:tc>
+      </w:tr>
+      <w:tr>
+        <w:tc>
+          <w:tcPr>
+            <w:tcW w:type="dxa" w:w="1337"/>
+          </w:tcPr>
+          <w:p>
+            <w:pPr>
+              <w:spacing w:after="0" w:before="0"/>
+              <w:jc w:val="left"/>
+            </w:pPr>
+            <w:r>
+              <w:rPr>
+                <w:sz w:val="17"/>
+              </w:rPr>
+            </w:r>
+            <w:r>
+              <w:rPr>
+                <w:sz w:val="17"/>
+              </w:rPr>
+              <w:t>6d step 2400</w:t>
+            </w:r>
+          </w:p>
+        </w:tc>
+        <w:tc>
+          <w:tcPr>
+            <w:tcW w:type="dxa" w:w="1337"/>
+          </w:tcPr>
+          <w:p>
+            <w:pPr>
+              <w:spacing w:after="0" w:before="0"/>
+              <w:jc w:val="center"/>
+            </w:pPr>
+            <w:r>
+              <w:rPr>
+                <w:sz w:val="17"/>
+              </w:rPr>
+            </w:r>
+            <w:r>
+              <w:rPr>
+                <w:sz w:val="17"/>
+              </w:rPr>
+              <w:t>0.095 (0.086/0.104)</w:t>
+            </w:r>
+          </w:p>
+        </w:tc>
+        <w:tc>
+          <w:tcPr>
+            <w:tcW w:type="dxa" w:w="1337"/>
+          </w:tcPr>
+          <w:p>
+            <w:pPr>
+              <w:spacing w:after="0" w:before="0"/>
+              <w:jc w:val="center"/>
+            </w:pPr>
+            <w:r>
+              <w:rPr>
+                <w:sz w:val="17"/>
+              </w:rPr>
+            </w:r>
+            <w:r>
+              <w:rPr>
+                <w:sz w:val="17"/>
+              </w:rPr>
+              <w:t>0.080 (0.079/0.081)</w:t>
+            </w:r>
+          </w:p>
+        </w:tc>
+        <w:tc>
+          <w:tcPr>
+            <w:tcW w:type="dxa" w:w="1337"/>
+          </w:tcPr>
+          <w:p>
+            <w:pPr>
+              <w:spacing w:after="0" w:before="0"/>
+              <w:jc w:val="center"/>
+            </w:pPr>
+            <w:r>
+              <w:rPr>
+                <w:sz w:val="17"/>
+              </w:rPr>
+            </w:r>
+            <w:r>
+              <w:rPr>
+                <w:sz w:val="17"/>
+              </w:rPr>
+              <w:t>0.143</w:t>
+            </w:r>
+          </w:p>
+        </w:tc>
+        <w:tc>
+          <w:tcPr>
+            <w:tcW w:type="dxa" w:w="1337"/>
+          </w:tcPr>
+          <w:p>
+            <w:pPr>
+              <w:spacing w:after="0" w:before="0"/>
+              <w:jc w:val="center"/>
+            </w:pPr>
+            <w:r>
+              <w:rPr>
+                <w:sz w:val="17"/>
+              </w:rPr>
+            </w:r>
+            <w:r>
+              <w:rPr>
+                <w:sz w:val="17"/>
+              </w:rPr>
+              <w:t>0.0117 (−13%)</w:t>
+            </w:r>
+          </w:p>
+        </w:tc>
+        <w:tc>
+          <w:tcPr>
+            <w:tcW w:type="dxa" w:w="1337"/>
+          </w:tcPr>
+          <w:p>
+            <w:pPr>
+              <w:spacing w:after="0" w:before="0"/>
+              <w:jc w:val="center"/>
+            </w:pPr>
+            <w:r>
+              <w:rPr>
+                <w:sz w:val="17"/>
+              </w:rPr>
+            </w:r>
+            <w:r>
+              <w:rPr>
+                <w:sz w:val="17"/>
+              </w:rPr>
+              <w:t>20.45</w:t>
+            </w:r>
+          </w:p>
+        </w:tc>
+        <w:tc>
+          <w:tcPr>
+            <w:tcW w:type="dxa" w:w="1337"/>
+          </w:tcPr>
+          <w:p>
+            <w:pPr>
+              <w:spacing w:after="0" w:before="0"/>
+              <w:jc w:val="center"/>
+            </w:pPr>
+            <w:r>
+              <w:rPr>
+                <w:sz w:val="17"/>
+              </w:rPr>
+            </w:r>
+            <w:r>
+              <w:rPr>
+                <w:sz w:val="17"/>
+              </w:rPr>
+              <w:t>0.0219</w:t>
+            </w:r>
+          </w:p>
+        </w:tc>
+      </w:tr>
+      <w:tr>
+        <w:tc>
+          <w:tcPr>
+            <w:tcW w:type="dxa" w:w="1337"/>
+          </w:tcPr>
+          <w:p>
+            <w:pPr>
+              <w:spacing w:after="0" w:before="0"/>
+              <w:jc w:val="left"/>
+            </w:pPr>
+            <w:r>
+              <w:rPr>
+                <w:sz w:val="17"/>
+              </w:rPr>
+            </w:r>
+            <w:r>
+              <w:rPr>
+                <w:sz w:val="17"/>
+              </w:rPr>
+              <w:t>6d step 3200</w:t>
+            </w:r>
+          </w:p>
+        </w:tc>
+        <w:tc>
+          <w:tcPr>
+            <w:tcW w:type="dxa" w:w="1337"/>
+          </w:tcPr>
+          <w:p>
+            <w:pPr>
+              <w:spacing w:after="0" w:before="0"/>
+              <w:jc w:val="center"/>
+            </w:pPr>
+            <w:r>
+              <w:rPr>
+                <w:sz w:val="17"/>
+              </w:rPr>
+            </w:r>
+            <w:r>
+              <w:rPr>
+                <w:sz w:val="17"/>
+              </w:rPr>
+              <w:t>0.098 (0.093/0.103)</w:t>
+            </w:r>
+          </w:p>
+        </w:tc>
+        <w:tc>
+          <w:tcPr>
+            <w:tcW w:type="dxa" w:w="1337"/>
+          </w:tcPr>
+          <w:p>
+            <w:pPr>
+              <w:spacing w:after="0" w:before="0"/>
+              <w:jc w:val="center"/>
+            </w:pPr>
+            <w:r>
+              <w:rPr>
+                <w:sz w:val="17"/>
+              </w:rPr>
+            </w:r>
+            <w:r>
+              <w:rPr>
+                <w:sz w:val="17"/>
+              </w:rPr>
+              <w:t>0.078 (0.076/0.080)</w:t>
+            </w:r>
+          </w:p>
+        </w:tc>
+        <w:tc>
+          <w:tcPr>
+            <w:tcW w:type="dxa" w:w="1337"/>
+          </w:tcPr>
+          <w:p>
+            <w:pPr>
+              <w:spacing w:after="0" w:before="0"/>
+              <w:jc w:val="center"/>
+            </w:pPr>
+            <w:r>
+              <w:rPr>
+                <w:sz w:val="17"/>
+              </w:rPr>
+            </w:r>
+            <w:r>
+              <w:rPr>
+                <w:sz w:val="17"/>
+              </w:rPr>
+              <w:t>0.135</w:t>
+            </w:r>
+          </w:p>
+        </w:tc>
+        <w:tc>
+          <w:tcPr>
+            <w:tcW w:type="dxa" w:w="1337"/>
+          </w:tcPr>
+          <w:p>
+            <w:pPr>
+              <w:spacing w:after="0" w:before="0"/>
+              <w:jc w:val="center"/>
+            </w:pPr>
+            <w:r>
+              <w:rPr>
+                <w:sz w:val="17"/>
+              </w:rPr>
+            </w:r>
+            <w:r>
+              <w:rPr>
+                <w:sz w:val="17"/>
+              </w:rPr>
+              <w:t>0.0135 (p=0.94)</w:t>
+            </w:r>
+          </w:p>
+        </w:tc>
+        <w:tc>
+          <w:tcPr>
+            <w:tcW w:type="dxa" w:w="1337"/>
+          </w:tcPr>
+          <w:p>
+            <w:pPr>
+              <w:spacing w:after="0" w:before="0"/>
+              <w:jc w:val="center"/>
+            </w:pPr>
+            <w:r>
+              <w:rPr>
+                <w:sz w:val="17"/>
+              </w:rPr>
+            </w:r>
+            <w:r>
+              <w:rPr>
+                <w:sz w:val="17"/>
+              </w:rPr>
+              <w:t>20.45</w:t>
+            </w:r>
+          </w:p>
+        </w:tc>
+        <w:tc>
+          <w:tcPr>
+            <w:tcW w:type="dxa" w:w="1337"/>
+          </w:tcPr>
+          <w:p>
+            <w:pPr>
+              <w:spacing w:after="0" w:before="0"/>
+              <w:jc w:val="center"/>
+            </w:pPr>
+            <w:r>
+              <w:rPr>
+                <w:sz w:val="17"/>
+              </w:rPr>
+            </w:r>
+            <w:r>
+              <w:rPr>
+                <w:sz w:val="17"/>
+              </w:rPr>
+              <w:t>0.0213</w:t>
+            </w:r>
+          </w:p>
+        </w:tc>
+      </w:tr>
+      <w:tr>
+        <w:tc>
+          <w:tcPr>
+            <w:tcW w:type="dxa" w:w="1337"/>
             <w:tcBorders>
               <w:bottom w:val="single" w:sz="8" w:color="000000"/>
             </w:tcBorders>
@@ -8003,7 +8479,7 @@
               <w:rPr>
                 <w:sz w:val="17"/>
               </w:rPr>
-              <w:t>6d step 2000</w:t>
+              <w:t>6d step 4000</w:t>
             </w:r>
           </w:p>
         </w:tc>
@@ -8028,7 +8504,7 @@
               <w:rPr>
                 <w:sz w:val="17"/>
               </w:rPr>
-              <w:t>0.102 (0.091/0.113)</w:t>
+              <w:t>0.093 (0.089/0.098)</w:t>
             </w:r>
           </w:p>
         </w:tc>
@@ -8053,7 +8529,7 @@
               <w:rPr>
                 <w:sz w:val="17"/>
               </w:rPr>
-              <w:t>0.081 (0.081/0.082)</w:t>
+              <w:t>0.079 (0.076/0.082)</w:t>
             </w:r>
           </w:p>
         </w:tc>
@@ -8078,7 +8554,7 @@
               <w:rPr>
                 <w:sz w:val="17"/>
               </w:rPr>
-              <w:t>0.148</w:t>
+              <w:t>0.135</w:t>
             </w:r>
           </w:p>
         </w:tc>
@@ -8103,7 +8579,7 @@
               <w:rPr>
                 <w:sz w:val="17"/>
               </w:rPr>
-              <w:t>0.0110 (−18%)</w:t>
+              <w:t>0.0151 (+13%)</w:t>
             </w:r>
           </w:p>
         </w:tc>
@@ -8128,7 +8604,7 @@
               <w:rPr>
                 <w:sz w:val="17"/>
               </w:rPr>
-              <w:t>20.41</w:t>
+              <w:t>20.28</w:t>
             </w:r>
           </w:p>
         </w:tc>
@@ -8153,7 +8629,7 @@
               <w:rPr>
                 <w:sz w:val="17"/>
               </w:rPr>
-              <w:t>0.0226</w:t>
+              <w:t>0.0218</w:t>
             </w:r>
           </w:p>
         </w:tc>
@@ -9105,7 +9581,7 @@
         <w:jc w:val="both"/>
       </w:pPr>
       <w:r>
-        <w:t>All measurements come from one task (PlaceAppleFromBowlIntoBin), four inference episodes, 20 samples (40 view-samples), and one RTX 5090; the absolute numbers may not transfer to other tasks or to real robot data. The 3-step student is not equal to the teacher: AbsRel is 0.015 higher (p&lt;0.001; 0.022 on the right view) and LPIPS 0.018 higher (p&lt;0.001), and the per-view anchor reduces but does not remove the right-view gap. The 1-step student halves diversity (0.0117) and raises LPIPS to 0.177, so it does not meet our quality bar. Only the quasi-static budget of 2 s is met. The humanoid (0.3-0.5 s) and dynamic (0.1 s) budgets are not, because the conditioner (0.30 s) and VAE decoders (0.33 s) form a fixed cost of 0.63 s that step reduction cannot touch, and the three UNet calls still take 0.55 s; reducing these requires quantization such as SVDQuant (Li et al., 2025) or a lower resolution, which we did not try. We have no policy-level evaluation: Geo4D's closed-loop success rates (Liu et al., 2025, Table 2) require the LBM simulator, a pose tracker, and a policy interface that are not in the released code, so the claim that a faster model enables closed-loop planning remains untested (Appendix A.6). The components we use, DMD (Yin et al., 2024a; 2024b), re-noising few-step sampling, bf16, and torch.compile, are existing techniques; what is new is the geometry-aware measurement and the anchor. A self-anchored training loss that applies the same calibration during training (run 6d, Section 4.5) removes most of the raw scale shift (0.175 to 0.102 without inference-time correction) and closes the left/right gap after anchoring, but its sharpness has not recovered at 2000 steps (18% below the teacher) and a 4000-step extension is still running. Finally, with 40 view-samples the minimal detectable AbsRel difference is 0.010, so showing equivalence at the strict 0.005 margin of Section 4.1 would need about 60 samples, which we have not run.</w:t>
+        <w:t>All measurements come from one task (PlaceAppleFromBowlIntoBin), four inference episodes, 20 samples (40 view-samples), and one RTX 5090; the absolute numbers may not transfer to other tasks or to real robot data. The 3-step student is not equal to the teacher: AbsRel is 0.015 higher (p&lt;0.001; 0.022 on the right view) and LPIPS 0.018 higher (p&lt;0.001), and the per-view anchor reduces but does not remove the right-view gap. The 1-step student halves diversity (0.0117) and raises LPIPS to 0.177, so it does not meet our quality bar. Only the quasi-static budget of 2 s is met. The humanoid (0.3-0.5 s) and dynamic (0.1 s) budgets are not, because the conditioner (0.30 s) and VAE decoders (0.33 s) form a fixed cost of 0.63 s that step reduction cannot touch, and the three UNet calls still take 0.55 s; reducing these requires quantization such as SVDQuant (Li et al., 2025) or a lower resolution, which we did not try. We have no policy-level evaluation: Geo4D's closed-loop success rates (Liu et al., 2025, Table 2) require the LBM simulator, a pose tracker, and a policy interface that are not in the released code, so the claim that a faster model enables closed-loop planning remains untested (Appendix A.6). The components we use, DMD (Yin et al., 2024a; 2024b), re-noising few-step sampling, bf16, and torch.compile, are existing techniques; what is new is the geometry-aware measurement and the anchor. A self-anchored training loss that applies the same calibration during training (run 6d, Section 4.5) fixes the raw depth scale (0.175 to 0.098) and the whole-image AbsRel gap (+0.011), but degrades the moving regions a policy reads (gripper centroid error +3.1 cm versus +2.0 cm for the main student), and a variant that excludes the robot pixels from the loss does not repair this; closing the right-view and moving-region gaps without this trade-off remains open. Finally, with 40 view-samples the minimal detectable AbsRel difference is 0.010, so showing equivalence at the strict 0.005 margin of Section 4.1 would need about 60 samples, which we have not run.</w:t>
       </w:r>
     </w:p>
     <w:p>
@@ -11185,6 +11661,14 @@
       </w:pPr>
       <w:r>
         <w:t>Two caveats apply. First, the ground-truth mask is applied to the prediction, so when the predicted arm is displaced the mask covers background pixels and the centroid jumps; the teacher's own error of about 12 cm is inflated by this mask mismatch and by the multimodal future, and only differences between methods are interpretable. Second, with 40 view-samples the minimal detectable effects are about 3 cm for the gripper centroid, 2.9 cm for the apple centroid, and 0.039 for gripper AbsRel. With these caveats, the whole-image AbsRel gap of +0.015 (Section 4.3) comes from the static background, where the student's difference is the same +0.015 (p&lt;0.001); on the gripper and apple regions the student is not statistically distinguishable from the teacher by the Wilcoxon test, but its gripper centroid error is 2.0 cm higher with a 90% confidence interval [+0.3, +3.7] that excludes zero, which sits at the practical 2 cm margin of Section 4.1 and should be read as a likely small degradation, not as equality.</w:t>
+      </w:r>
+    </w:p>
+    <w:p>
+      <w:pPr>
+        <w:jc w:val="both"/>
+      </w:pPr>
+      <w:r>
+        <w:t>The same region metrics, rerun on the self-anchored students of Section 4.5, give a gripper centroid error of +3.1 cm against the teacher (p=0.009) for run 6d at step 3200 and +4.7 cm (p&lt;0.001) for run 6e at step 3200, versus +2.0 cm (p=0.11) for the main student; this is the basis for not adopting those checkpoints.</w:t>
       </w:r>
     </w:p>
     <w:sectPr>

</xml_diff>

<commit_message>
Paper: 60-sample headline, 4.6 inference-time dial section, gripper correction
</commit_message>
<xml_diff>
--- a/paper/draft_v1.docx
+++ b/paper/draft_v1.docx
@@ -53,7 +53,7 @@
         <w:jc w:val="both"/>
       </w:pPr>
       <w:r>
-        <w:t>Multi-view RGB-D world models such as Geo4D (Liu et al., 2025) predict future pointmaps and images for several cameras but are too slow for closed-loop control: Geo4D needs 25 UNet evaluations and 21.8 s per prediction on an RTX 5090. Few-step distillation is the standard remedy for single-view video diffusion; on a multi-view RGB-D model we identify two failure modes. A training-free three-step sampler keeps depth accuracy and raises PSNR, yet seed diversity drops by 47% and four seeds produce the same image: a collapse toward the conditional mean that pixel metrics hide. Distribution matching distillation in EDM sigma space, with a re-noising three-step sampler and no classifier-free guidance, restores sharpness and diversity, but the student predicts depth about 9% too far, a global per-view scale shift; an affine fit explains 97% of the gap. Since the conditioning pointmap is a model input, we align the predicted first frame to it with a per-view scale at inference, using camera extrinsics for the second view and no ground truth. This reduces the student's AbsRel from 0.175 to 0.082 and also improves the teacher (0.072 to 0.060). In bf16 the student runs in 1.64 s (13.3x faster than the teacher) with teacher-level sharpness (p=0.95) and seed diversity (p=0.84); AbsRel rises by 0.015 and LPIPS by 0.018, both significant. We report ODE-regression initialization and a ground-truth-supervised cross-view depth loss as negative results.</w:t>
+        <w:t>Multi-view RGB-D world models such as Geo4D (Liu et al., 2025) predict future pointmaps and images for several cameras but are too slow for closed-loop control: Geo4D needs 25 UNet evaluations and 21.8 s per prediction on an RTX 5090. Few-step distillation is the standard remedy for single-view video diffusion; on a multi-view RGB-D model we identify two failure modes. A training-free three-step sampler keeps depth accuracy and raises PSNR, yet seed diversity drops by 47% and four seeds produce the same image: a collapse toward the conditional mean that pixel metrics hide. Distribution matching distillation in EDM sigma space, with a re-noising three-step sampler and no classifier-free guidance, restores sharpness and diversity, but the student predicts depth about 9% too far, a global per-view scale shift; an affine fit explains 97% of the gap. Since the conditioning pointmap is a model input, we align the predicted first frame to it with a per-view scale at inference, using camera extrinsics for the second view and no ground truth. This reduces the student's AbsRel from 0.175 to 0.082 and also improves the teacher (0.072 to 0.060). In bf16 the student runs in 1.64 s, 13.3x faster than the teacher, with sharpness within 2% and seed diversity within 5% of the teacher's on 60 samples; AbsRel rises by 0.013 and LPIPS by 0.018, both significant. Extra re-noising steps shrink the depth gap to 0.005 at five steps (2.08 s), and replacing the final step with the teacher yields depth below the teacher's at the cost of diversity: a perception-distortion dial set at inference time. We report ODE-regression initialization and a ground-truth-supervised cross-view depth loss as negative results.</w:t>
       </w:r>
     </w:p>
     <w:p>
@@ -167,7 +167,7 @@
         <w:jc w:val="both"/>
       </w:pPr>
       <w:r>
-        <w:t>On 20 samples (40 view-samples) of the PlaceAppleFromBowlIntoBin task, the three-step student runs in 1.64 s on one RTX 5090, 13.3x faster than the 21.8 s teacher, and meets the 2 s quasi-static budget (1.18 s with torch.compile, timed on 5 samples). Its sharpness (p=0.95) and seed diversity (p=0.84) are statistically indistinguishable from the teacher's, while AbsRel is higher by 0.015 (p&lt;0.001) and LPIPS by 0.018 (p&lt;0.001). The training-free three-step teacher is also fast (2.81 s in fp32) and keeps the teacher's AbsRel, but loses 47% of its seed diversity, and the one-step student halves diversity and raises LPIPS to 0.177; neither meets the quality bar. The humanoid and dynamic budgets remain open, because even with the compiled decoder 0.63 s of conditioner and decoder cost (0.98 s in the bf16 headline configuration) is independent of the number of steps. A self-anchored training loss removes most of the raw scale shift (0.175 to 0.098) and closes the whole-image gap to +0.011, but region-level evaluation shows the gain comes from the static background while gripper localization degrades, so we keep the plain student and report the loss as an instructive negative result (Section 4.5).</w:t>
+        <w:t>On 60 samples (120 view-samples) of the PlaceAppleFromBowlIntoBin task, the three-step student runs in 1.64 s on one RTX 5090, 13.3x faster than the 21.8 s teacher, and meets the 2 s quasi-static budget (1.18 s with torch.compile, timed on 5 samples). Its sharpness (+2%), seed diversity (+5% [+1, +8]), and cross-view consistency stay within their margins, while AbsRel is higher by 0.013 [+0.010, +0.017] and LPIPS by 0.018, both p&lt;0.001. The training-free three-step teacher is also fast (2.81 s in fp32) and keeps the teacher's AbsRel, but loses 47% of its seed diversity, and the one-step student halves diversity and raises LPIPS to 0.177; neither meets the quality bar. The humanoid and dynamic budgets remain open, because even with the compiled decoder 0.63 s of conditioner and decoder cost (0.98 s in the bf16 headline configuration) is independent of the number of steps. A self-anchored training loss removes most of the raw scale shift (0.175 to 0.098) and closes the whole-image gap to +0.011, but region-level evaluation shows the gain comes from the static background while gripper localization degrades, so we keep the plain student and report the loss as an instructive negative result (Section 4.5). Extra re-noising steps at inference close most of the remaining depth gap (+0.0048 at five steps on 60 samples), and replacing the final step with the teacher turns the same checkpoint into a precise readout mode with depth below the teacher's, at the cost of diversity — an inference-time dial we analyze in Section 4.6.</w:t>
       </w:r>
     </w:p>
     <w:p>
@@ -191,7 +191,7 @@
         <w:jc w:val="both"/>
       </w:pPr>
       <w:r>
-        <w:t>(2) A distillation recipe for the Geo4D generator: distribution matching distillation moved to EDM sigma space with DMD2 backward simulation, a three-sigma student sampled by predicting x₀ and re-noising to the next sigma, no classifier-free guidance (halving the cost of each UNet call), and checkpoint selection by the ratio of student to teacher latent standard deviation. In bf16 the student runs in 1.64 s on one RTX 5090, 13.3x faster than the 21.8 s teacher, with sharpness (p=0.95) and seed diversity (p=0.84) statistically indistinguishable from the teacher's and small but significant losses in AbsRel (+0.015) and LPIPS (+0.018). Two negative results are reported as such: initializing the student by regressing teacher ODE trajectories converges to the mean even with true intermediate states, and adding a cross-view depth-ratio loss to DMD (targeting the teacher's ratio in one run and the ground-truth ratio in two) reduced sharpness in all three configurations we tried.</w:t>
+        <w:t>(2) A distillation recipe for the Geo4D generator: distribution matching distillation moved to EDM sigma space with DMD2 backward simulation, a three-sigma student sampled by predicting x₀ and re-noising to the next sigma, no classifier-free guidance (halving the cost of each UNet call), and checkpoint selection by the ratio of student to teacher latent standard deviation. In bf16 the student runs in 1.64 s on one RTX 5090, 13.3x faster than the 21.8 s teacher, with sharpness and seed diversity within their equivalence margins on 60 samples and small but significant losses in AbsRel (+0.013) and LPIPS (+0.018). Two negative results are reported as such: initializing the student by regressing teacher ODE trajectories converges to the mean even with true intermediate states, and adding a cross-view depth-ratio loss to DMD (targeting the teacher's ratio in one run and the ground-truth ratio in two) reduced sharpness in all three configurations we tried.</w:t>
       </w:r>
     </w:p>
     <w:p>
@@ -1187,7 +1187,7 @@
         <w:t>Protocol.</w:t>
       </w:r>
       <w:r>
-        <w:t xml:space="preserve"> Final numbers use 20 samples, i.e. 40 view-samples, with fixed data seed 1234 and generation seed 0. Differences are tested with a paired Wilcoxon signed-rank test (Wilcoxon, 1945) over the 40 view-samples. Seed diversity is measured on the first 3 samples, each generated with seeds 0 to 3. Early sweeps used 10 samples and are marked as such.</w:t>
+        <w:t xml:space="preserve"> Final numbers use 60 samples, i.e. 120 view-samples, with fixed data seed 1234 and generation seed 0. Differences are tested with a paired Wilcoxon signed-rank test (Wilcoxon, 1945) over the view-samples. Seed diversity is measured on 20 samples, each generated with seeds 0 to 3. The development experiments in Sections 4.3 and 4.5 used 20 samples (40 view-samples, diversity on 3 samples) and are marked as such; early sweeps used 10 samples.</w:t>
       </w:r>
     </w:p>
     <w:p>
@@ -1210,7 +1210,7 @@
         <w:t>[-δ, +δ]</w:t>
       </w:r>
       <w:r>
-        <w:t xml:space="preserve"> (two one-sided tests, TOST). For a robot world model the criterion that matters is whether a policy driven by the student succeeds as often as one driven by the teacher; few-step video distillation papers instead report differences against the teacher together with human preference, where a win rate near 50% serves as the de facto parity criterion (Yin et al., 2025; Huang et al., 2025). Because we cannot yet run the policy-level evaluation (Appendix A.6), the margins below stand in for it: they are our choice, grounded in sensor specifications, grasp tolerances, and perceptual studies as follows: PSNR 0.5 dB (a common significance threshold, about half of one just-noticeable difference); AbsRel 0.005 strict (about one generation of progress on KITTI and NYU in Depth Anything V2; Yang et al., 2024) and 0.010 practical (half of the ±2% specification of a RealSense D435, about 1 cm at 1 m, the depth noise a closed-loop grasp tolerates); LPIPS 0.05 perceptual (a difference below 0.05 gives about 52% human agreement; Hou et al., 2022) and 0.01 strict; sharpness ±5% (half of the 11% loss of the training-free 3-step teacher); diversity ±10%; CV-Chamfer one-sided, not worse; gripper centroid error +1 cm strict (the 3 to 10 mm noise of current 6-DoF pose trackers) and +2 cm practical (a pose error above 2 cm fails a grasp with a 4 cm stroke; Tremblay et al., 2020). With 40 view-samples the minimal detectable paired effects are 0.26 dB PSNR, 0.010 AbsRel, 0.004 LPIPS, 0.0004 sharpness, 0.0042 diversity (n=6 view-samples), and 0.034 CV-Chamfer (n=20 samples). Under these margins the main 3-step student passes PSNR, sharpness, CV-Chamfer, and the perceptual LPIPS margin, fails AbsRel and the strict LPIPS margin, passes diversity only provisionally because its interval is wider than the margin, and is borderline on the practical gripper-centroid margin (Section 4.3, Appendix A.6).</w:t>
+        <w:t xml:space="preserve"> (two one-sided tests, TOST). For a robot world model the criterion that matters is whether a policy driven by the student succeeds as often as one driven by the teacher; few-step video distillation papers instead report differences against the teacher together with human preference, where a win rate near 50% serves as the de facto parity criterion (Yin et al., 2025; Huang et al., 2025). Because we cannot yet run the policy-level evaluation (Appendix A.6), the margins below stand in for it: they are our choice, grounded in sensor specifications, grasp tolerances, and perceptual studies as follows: PSNR 0.5 dB (a common significance threshold, about half of one just-noticeable difference); AbsRel 0.005 strict (about one generation of progress on KITTI and NYU in Depth Anything V2; Yang et al., 2024) and 0.010 practical (half of the ±2% specification of a RealSense D435, about 1 cm at 1 m, the depth noise a closed-loop grasp tolerates); LPIPS 0.05 perceptual (a difference below 0.05 gives about 52% human agreement; Hou et al., 2022) and 0.01 strict; sharpness ±5% (half of the 11% loss of the training-free 3-step teacher); diversity ±10%; CV-Chamfer one-sided, not worse; gripper centroid error +1 cm strict (the 3 to 10 mm noise of current 6-DoF pose trackers) and +2 cm practical (a pose error above 2 cm fails a grasp with a 4 cm stroke; Tremblay et al., 2020). With 120 view-samples the minimal detectable paired effects are about 0.006 AbsRel, 0.003 LPIPS, 0.15 dB PSNR, and 7% of diversity (n=40 view-samples). Under these margins the main 3-step student passes PSNR, sharpness, diversity (+5% [+1, +8]), CV-Chamfer, the perceptual LPIPS margin, and the practical 2 cm gripper-centroid margin (+0.66 cm [−0.62, +1.94]), and fails the practical AbsRel margin (+0.0133 [+0.0097, +0.0168]); the 5-step configuration of Section 4.6 passes the practical AbsRel margin with its whole interval (+0.0048 [+0.0011, +0.0085]); the strict LPIPS margin fails for every configuration (best +0.0109).</w:t>
       </w:r>
     </w:p>
     <w:p>
@@ -4227,7 +4227,7 @@
         <w:t>Anchored student versus teacher.</w:t>
       </w:r>
       <w:r>
-        <w:t xml:space="preserve"> Paired over the 40 view-samples, the 3-step student differs from the 25-step teacher by −0.19 dB PSNR (p=0.026), +0.015 AbsRel (p&lt;0.001; left +0.008, right +0.022), and +0.018 LPIPS (p&lt;0.001). Sharpness (+0.0001, p=0.95) and diversity (−0.0004, p=0.84) are indistinguishable from the teacher, and CV-Chamfer is lower by 0.034 (p=0.006). The 90% confidence intervals of the paired differences are AbsRel +0.0155 [+0.010, +0.021], LPIPS +0.018 [+0.015, +0.020], PSNR −0.19 dB [−0.34, −0.04], sharpness +0.0002 [−0.0000, +0.0005], and diversity −0.0003 [−0.0027, +0.0021], which under the margins of Section 4.1 means that AbsRel is not preserved, LPIPS is preserved only at the perceptual margin, and PSNR and sharpness are preserved.</w:t>
+        <w:t xml:space="preserve"> Paired over the 40 view-samples, the 3-step student differs from the 25-step teacher by −0.19 dB PSNR (p=0.026), +0.015 AbsRel (p&lt;0.001; left +0.008, right +0.022), and +0.018 LPIPS (p&lt;0.001). Sharpness (+0.0001, p=0.95) and diversity (−0.0004, p=0.84) are indistinguishable from the teacher, and CV-Chamfer is lower by 0.034 (p=0.006). The 90% confidence intervals of the paired differences are AbsRel +0.0155 [+0.010, +0.021], LPIPS +0.018 [+0.015, +0.020], PSNR −0.19 dB [−0.34, −0.04], sharpness +0.0002 [−0.0000, +0.0005], and diversity −0.0003 [−0.0027, +0.0021], which under the margins of Section 4.1 means that AbsRel is not preserved, LPIPS is preserved only at the perceptual margin, and PSNR and sharpness are preserved. On the full 60-sample protocol the corresponding differences are AbsRel +0.0133 [+0.0097, +0.0168], LPIPS +0.0180, PSNR −0.15 [−0.25, −0.05], sharpness +2%, diversity +5% [+1, +8] (Section 4.6, Table 9).</w:t>
       </w:r>
     </w:p>
     <w:p>
@@ -9570,10 +9570,10 @@
     </w:p>
     <w:p>
       <w:pPr>
-        <w:pStyle w:val="Heading1"/>
+        <w:pStyle w:val="Heading2"/>
       </w:pPr>
       <w:r>
-        <w:t>5 Limitation</w:t>
+        <w:t>4.6 An Inference-Time Perception-Distortion Dial</w:t>
       </w:r>
     </w:p>
     <w:p>
@@ -9581,7 +9581,1181 @@
         <w:jc w:val="both"/>
       </w:pPr>
       <w:r>
-        <w:t>All measurements come from one task (PlaceAppleFromBowlIntoBin), four inference episodes, 20 samples (40 view-samples), and one RTX 5090; the absolute numbers may not transfer to other tasks or to real robot data. The 3-step student is not equal to the teacher: AbsRel is 0.015 higher (p&lt;0.001; 0.022 on the right view) and LPIPS 0.018 higher (p&lt;0.001), and the per-view anchor reduces but does not remove the right-view gap. The 1-step student halves diversity (0.0117) and raises LPIPS to 0.177, so it does not meet our quality bar. Only the quasi-static budget of 2 s is met. The humanoid (0.3-0.5 s) and dynamic (0.1 s) budgets are not, because the conditioner (0.30 s) and VAE decoders (0.33 s) form a fixed cost of 0.63 s that step reduction cannot touch, and the three UNet calls still take 0.55 s; reducing these requires quantization such as SVDQuant (Li et al., 2025) or a lower resolution, which we did not try. We have no policy-level evaluation: Geo4D's closed-loop success rates (Liu et al., 2025, Table 2) require the LBM simulator, a pose tracker, and a policy interface that are not in the released code, so the claim that a faster model enables closed-loop planning remains untested (Appendix A.6). The components we use, DMD (Yin et al., 2024a; 2024b), re-noising few-step sampling, bf16, and torch.compile, are existing techniques; what is new is the geometry-aware measurement and the anchor. A self-anchored training loss that applies the same calibration during training (run 6d, Section 4.5) fixes the raw depth scale (0.175 to 0.098) and the whole-image AbsRel gap (+0.011), but degrades the moving regions a policy reads (gripper centroid error +3.1 cm versus +2.0 cm for the main student), and a variant that excludes the robot pixels from the loss does not repair this; closing the right-view and moving-region gaps without this trade-off remains open. Finally, with 40 view-samples the minimal detectable AbsRel difference is 0.010, so showing equivalence at the strict 0.005 margin of Section 4.1 would need about 60 samples, which we have not run.</w:t>
+        <w:t>The student was trained on three sigmas, but nothing prevents repeating them at inference. With 4 steps the schedule is [700, 70.5, 2.3, 2.3], and 5 steps adds a second 70.5; no retraining is involved. Table 9 evaluates these schedules on the 60-sample protocol. The extra low-sigma refinement closes the depth gap: AbsRel against the teacher falls from +0.0133 at 3 steps to +0.0066 at 4 and +0.0048 at 5, the last passing the practical margin with its whole interval, at about 0.2 s per extra call. The cost is mild over-dispersion: each re-noise injects fresh noise, so repeated sigmas widen the sampled distribution, and seed diversity rises by 8% at 4 steps and 10% at 5 steps, where the interval [+6, +14] exceeds the 10% margin; the accompanying PSNR drop stays inside the 0.5 dB margin.</w:t>
+      </w:r>
+    </w:p>
+    <w:p>
+      <w:pPr>
+        <w:jc w:val="both"/>
+      </w:pPr>
+      <w:r>
+        <w:t>The mechanism sits in the last step. The final sigma of 2.3 exceeds the latent scale, so much of the seed-to-seed diversity is created by sampling at the final step; the teacher denoiser is a mean predictor at every sigma, while the DMD student was trained to emit samples there. Replacing the final step with the teacher (hybrid H) or averaging two x₀ predictions (A) therefore trades diversity and sharpness for depth and PSNR. The hybrid 4-call configuration reaches an AbsRel of 0.0663, below the teacher's 0.0725 (difference −0.0062 [−0.0084, −0.0040]), and the best LPIPS of any configuration (+0.0109), while losing 33% of diversity and 8% of sharpness. The perception-distortion trade-off of Section 4.2 lives inside the sampler's last step and can be set at inference time without retraining.</w:t>
+      </w:r>
+    </w:p>
+    <w:p>
+      <w:pPr>
+        <w:jc w:val="both"/>
+      </w:pPr>
+      <w:r>
+        <w:t>Table 9: The inference-time dial (60 samples, 120 view-samples; diversity 20 samples × 4 seeds; differences vs teacher with 90% CIs). S3b is the main student of Table 1; S4b and S5b repeat trained sigmas; H4b replaces the final step with one teacher call (precise mode). Gripper centroid is the region metric of Appendix A.6, in cm.</w:t>
+      </w:r>
+    </w:p>
+    <w:p>
+      <w:pPr>
+        <w:jc w:val="center"/>
+      </w:pPr>
+    </w:p>
+    <w:tbl>
+      <w:tblPr>
+        <w:tblStyle w:val="TableGrid"/>
+        <w:tblW w:type="auto" w:w="0"/>
+        <w:jc w:val="center"/>
+        <w:tblLook w:firstColumn="1" w:firstRow="1" w:lastColumn="0" w:lastRow="0" w:noHBand="0" w:noVBand="1" w:val="04A0"/>
+        <w:tblBorders>
+          <w:top w:val="nil"/>
+          <w:left w:val="nil"/>
+          <w:bottom w:val="nil"/>
+          <w:right w:val="nil"/>
+          <w:insideH w:val="nil"/>
+          <w:insideV w:val="nil"/>
+        </w:tblBorders>
+      </w:tblPr>
+      <w:tblGrid>
+        <w:gridCol w:w="1040"/>
+        <w:gridCol w:w="1040"/>
+        <w:gridCol w:w="1040"/>
+        <w:gridCol w:w="1040"/>
+        <w:gridCol w:w="1040"/>
+        <w:gridCol w:w="1040"/>
+        <w:gridCol w:w="1040"/>
+        <w:gridCol w:w="1040"/>
+        <w:gridCol w:w="1040"/>
+      </w:tblGrid>
+      <w:tr>
+        <w:tc>
+          <w:tcPr>
+            <w:tcW w:type="dxa" w:w="1040"/>
+            <w:tcBorders>
+              <w:top w:val="single" w:sz="8" w:color="000000"/>
+              <w:bottom w:val="single" w:sz="4" w:color="000000"/>
+            </w:tcBorders>
+          </w:tcPr>
+          <w:p>
+            <w:pPr>
+              <w:spacing w:after="0" w:before="0"/>
+              <w:jc w:val="left"/>
+            </w:pPr>
+            <w:r>
+              <w:rPr>
+                <w:b/>
+                <w:sz w:val="17"/>
+              </w:rPr>
+            </w:r>
+            <w:r>
+              <w:rPr>
+                <w:b/>
+                <w:sz w:val="17"/>
+              </w:rPr>
+              <w:t>config</w:t>
+            </w:r>
+          </w:p>
+        </w:tc>
+        <w:tc>
+          <w:tcPr>
+            <w:tcW w:type="dxa" w:w="1040"/>
+            <w:tcBorders>
+              <w:top w:val="single" w:sz="8" w:color="000000"/>
+              <w:bottom w:val="single" w:sz="4" w:color="000000"/>
+            </w:tcBorders>
+          </w:tcPr>
+          <w:p>
+            <w:pPr>
+              <w:spacing w:after="0" w:before="0"/>
+              <w:jc w:val="center"/>
+            </w:pPr>
+            <w:r>
+              <w:rPr>
+                <w:b/>
+                <w:sz w:val="17"/>
+              </w:rPr>
+            </w:r>
+            <w:r>
+              <w:rPr>
+                <w:b/>
+                <w:sz w:val="17"/>
+              </w:rPr>
+              <w:t>calls</w:t>
+            </w:r>
+          </w:p>
+        </w:tc>
+        <w:tc>
+          <w:tcPr>
+            <w:tcW w:type="dxa" w:w="1040"/>
+            <w:tcBorders>
+              <w:top w:val="single" w:sz="8" w:color="000000"/>
+              <w:bottom w:val="single" w:sz="4" w:color="000000"/>
+            </w:tcBorders>
+          </w:tcPr>
+          <w:p>
+            <w:pPr>
+              <w:spacing w:after="0" w:before="0"/>
+              <w:jc w:val="center"/>
+            </w:pPr>
+            <w:r>
+              <w:rPr>
+                <w:b/>
+                <w:sz w:val="17"/>
+              </w:rPr>
+            </w:r>
+            <w:r>
+              <w:rPr>
+                <w:b/>
+                <w:sz w:val="17"/>
+              </w:rPr>
+              <w:t>time</w:t>
+            </w:r>
+          </w:p>
+        </w:tc>
+        <w:tc>
+          <w:tcPr>
+            <w:tcW w:type="dxa" w:w="1040"/>
+            <w:tcBorders>
+              <w:top w:val="single" w:sz="8" w:color="000000"/>
+              <w:bottom w:val="single" w:sz="4" w:color="000000"/>
+            </w:tcBorders>
+          </w:tcPr>
+          <w:p>
+            <w:pPr>
+              <w:spacing w:after="0" w:before="0"/>
+              <w:jc w:val="center"/>
+            </w:pPr>
+            <w:r>
+              <w:rPr>
+                <w:b/>
+                <w:sz w:val="17"/>
+              </w:rPr>
+            </w:r>
+            <w:r>
+              <w:rPr>
+                <w:b/>
+                <w:sz w:val="17"/>
+              </w:rPr>
+              <w:t>AbsRel diff</w:t>
+            </w:r>
+          </w:p>
+        </w:tc>
+        <w:tc>
+          <w:tcPr>
+            <w:tcW w:type="dxa" w:w="1040"/>
+            <w:tcBorders>
+              <w:top w:val="single" w:sz="8" w:color="000000"/>
+              <w:bottom w:val="single" w:sz="4" w:color="000000"/>
+            </w:tcBorders>
+          </w:tcPr>
+          <w:p>
+            <w:pPr>
+              <w:spacing w:after="0" w:before="0"/>
+              <w:jc w:val="center"/>
+            </w:pPr>
+            <w:r>
+              <w:rPr>
+                <w:b/>
+                <w:sz w:val="17"/>
+              </w:rPr>
+            </w:r>
+            <w:r>
+              <w:rPr>
+                <w:b/>
+                <w:sz w:val="17"/>
+              </w:rPr>
+              <w:t>LPIPS diff</w:t>
+            </w:r>
+          </w:p>
+        </w:tc>
+        <w:tc>
+          <w:tcPr>
+            <w:tcW w:type="dxa" w:w="1040"/>
+            <w:tcBorders>
+              <w:top w:val="single" w:sz="8" w:color="000000"/>
+              <w:bottom w:val="single" w:sz="4" w:color="000000"/>
+            </w:tcBorders>
+          </w:tcPr>
+          <w:p>
+            <w:pPr>
+              <w:spacing w:after="0" w:before="0"/>
+              <w:jc w:val="center"/>
+            </w:pPr>
+            <w:r>
+              <w:rPr>
+                <w:b/>
+                <w:sz w:val="17"/>
+              </w:rPr>
+            </w:r>
+            <w:r>
+              <w:rPr>
+                <w:b/>
+                <w:sz w:val="17"/>
+              </w:rPr>
+              <w:t>PSNR diff (dB)</w:t>
+            </w:r>
+          </w:p>
+        </w:tc>
+        <w:tc>
+          <w:tcPr>
+            <w:tcW w:type="dxa" w:w="1040"/>
+            <w:tcBorders>
+              <w:top w:val="single" w:sz="8" w:color="000000"/>
+              <w:bottom w:val="single" w:sz="4" w:color="000000"/>
+            </w:tcBorders>
+          </w:tcPr>
+          <w:p>
+            <w:pPr>
+              <w:spacing w:after="0" w:before="0"/>
+              <w:jc w:val="center"/>
+            </w:pPr>
+            <w:r>
+              <w:rPr>
+                <w:b/>
+                <w:sz w:val="17"/>
+              </w:rPr>
+            </w:r>
+            <w:r>
+              <w:rPr>
+                <w:b/>
+                <w:sz w:val="17"/>
+              </w:rPr>
+              <w:t>sharpness</w:t>
+            </w:r>
+          </w:p>
+        </w:tc>
+        <w:tc>
+          <w:tcPr>
+            <w:tcW w:type="dxa" w:w="1040"/>
+            <w:tcBorders>
+              <w:top w:val="single" w:sz="8" w:color="000000"/>
+              <w:bottom w:val="single" w:sz="4" w:color="000000"/>
+            </w:tcBorders>
+          </w:tcPr>
+          <w:p>
+            <w:pPr>
+              <w:spacing w:after="0" w:before="0"/>
+              <w:jc w:val="center"/>
+            </w:pPr>
+            <w:r>
+              <w:rPr>
+                <w:b/>
+                <w:sz w:val="17"/>
+              </w:rPr>
+            </w:r>
+            <w:r>
+              <w:rPr>
+                <w:b/>
+                <w:sz w:val="17"/>
+              </w:rPr>
+              <w:t>diversity</w:t>
+            </w:r>
+          </w:p>
+        </w:tc>
+        <w:tc>
+          <w:tcPr>
+            <w:tcW w:type="dxa" w:w="1040"/>
+            <w:tcBorders>
+              <w:top w:val="single" w:sz="8" w:color="000000"/>
+              <w:bottom w:val="single" w:sz="4" w:color="000000"/>
+            </w:tcBorders>
+          </w:tcPr>
+          <w:p>
+            <w:pPr>
+              <w:spacing w:after="0" w:before="0"/>
+              <w:jc w:val="center"/>
+            </w:pPr>
+            <w:r>
+              <w:rPr>
+                <w:b/>
+                <w:sz w:val="17"/>
+              </w:rPr>
+            </w:r>
+            <w:r>
+              <w:rPr>
+                <w:b/>
+                <w:sz w:val="17"/>
+              </w:rPr>
+              <w:t>gripper centroid (cm)</w:t>
+            </w:r>
+          </w:p>
+        </w:tc>
+      </w:tr>
+      <w:tr>
+        <w:tc>
+          <w:tcPr>
+            <w:tcW w:type="dxa" w:w="1040"/>
+          </w:tcPr>
+          <w:p>
+            <w:pPr>
+              <w:spacing w:after="0" w:before="0"/>
+              <w:jc w:val="left"/>
+            </w:pPr>
+            <w:r>
+              <w:rPr>
+                <w:sz w:val="17"/>
+              </w:rPr>
+            </w:r>
+            <w:r>
+              <w:rPr>
+                <w:sz w:val="17"/>
+              </w:rPr>
+              <w:t>S3b (main)</w:t>
+            </w:r>
+          </w:p>
+        </w:tc>
+        <w:tc>
+          <w:tcPr>
+            <w:tcW w:type="dxa" w:w="1040"/>
+          </w:tcPr>
+          <w:p>
+            <w:pPr>
+              <w:spacing w:after="0" w:before="0"/>
+              <w:jc w:val="center"/>
+            </w:pPr>
+            <w:r>
+              <w:rPr>
+                <w:sz w:val="17"/>
+              </w:rPr>
+            </w:r>
+            <w:r>
+              <w:rPr>
+                <w:sz w:val="17"/>
+              </w:rPr>
+              <w:t>3</w:t>
+            </w:r>
+          </w:p>
+        </w:tc>
+        <w:tc>
+          <w:tcPr>
+            <w:tcW w:type="dxa" w:w="1040"/>
+          </w:tcPr>
+          <w:p>
+            <w:pPr>
+              <w:spacing w:after="0" w:before="0"/>
+              <w:jc w:val="center"/>
+            </w:pPr>
+            <w:r>
+              <w:rPr>
+                <w:sz w:val="17"/>
+              </w:rPr>
+            </w:r>
+            <w:r>
+              <w:rPr>
+                <w:sz w:val="17"/>
+              </w:rPr>
+              <w:t>1.64 s</w:t>
+            </w:r>
+          </w:p>
+        </w:tc>
+        <w:tc>
+          <w:tcPr>
+            <w:tcW w:type="dxa" w:w="1040"/>
+          </w:tcPr>
+          <w:p>
+            <w:pPr>
+              <w:spacing w:after="0" w:before="0"/>
+              <w:jc w:val="center"/>
+            </w:pPr>
+            <w:r>
+              <w:rPr>
+                <w:sz w:val="17"/>
+              </w:rPr>
+            </w:r>
+            <w:r>
+              <w:rPr>
+                <w:sz w:val="17"/>
+              </w:rPr>
+              <w:t>+0.0133 [+0.0097, +0.0168]</w:t>
+            </w:r>
+          </w:p>
+        </w:tc>
+        <w:tc>
+          <w:tcPr>
+            <w:tcW w:type="dxa" w:w="1040"/>
+          </w:tcPr>
+          <w:p>
+            <w:pPr>
+              <w:spacing w:after="0" w:before="0"/>
+              <w:jc w:val="center"/>
+            </w:pPr>
+            <w:r>
+              <w:rPr>
+                <w:sz w:val="17"/>
+              </w:rPr>
+            </w:r>
+            <w:r>
+              <w:rPr>
+                <w:sz w:val="17"/>
+              </w:rPr>
+              <w:t>+0.0180</w:t>
+            </w:r>
+          </w:p>
+        </w:tc>
+        <w:tc>
+          <w:tcPr>
+            <w:tcW w:type="dxa" w:w="1040"/>
+          </w:tcPr>
+          <w:p>
+            <w:pPr>
+              <w:spacing w:after="0" w:before="0"/>
+              <w:jc w:val="center"/>
+            </w:pPr>
+            <w:r>
+              <w:rPr>
+                <w:sz w:val="17"/>
+              </w:rPr>
+            </w:r>
+            <w:r>
+              <w:rPr>
+                <w:sz w:val="17"/>
+              </w:rPr>
+              <w:t>−0.149 [−0.246, −0.053]</w:t>
+            </w:r>
+          </w:p>
+        </w:tc>
+        <w:tc>
+          <w:tcPr>
+            <w:tcW w:type="dxa" w:w="1040"/>
+          </w:tcPr>
+          <w:p>
+            <w:pPr>
+              <w:spacing w:after="0" w:before="0"/>
+              <w:jc w:val="center"/>
+            </w:pPr>
+            <w:r>
+              <w:rPr>
+                <w:sz w:val="17"/>
+              </w:rPr>
+            </w:r>
+            <w:r>
+              <w:rPr>
+                <w:sz w:val="17"/>
+              </w:rPr>
+              <w:t>+2%</w:t>
+            </w:r>
+          </w:p>
+        </w:tc>
+        <w:tc>
+          <w:tcPr>
+            <w:tcW w:type="dxa" w:w="1040"/>
+          </w:tcPr>
+          <w:p>
+            <w:pPr>
+              <w:spacing w:after="0" w:before="0"/>
+              <w:jc w:val="center"/>
+            </w:pPr>
+            <w:r>
+              <w:rPr>
+                <w:sz w:val="17"/>
+              </w:rPr>
+            </w:r>
+            <w:r>
+              <w:rPr>
+                <w:sz w:val="17"/>
+              </w:rPr>
+              <w:t>+5% [+1, +8]</w:t>
+            </w:r>
+          </w:p>
+        </w:tc>
+        <w:tc>
+          <w:tcPr>
+            <w:tcW w:type="dxa" w:w="1040"/>
+          </w:tcPr>
+          <w:p>
+            <w:pPr>
+              <w:spacing w:after="0" w:before="0"/>
+              <w:jc w:val="center"/>
+            </w:pPr>
+            <w:r>
+              <w:rPr>
+                <w:sz w:val="17"/>
+              </w:rPr>
+            </w:r>
+            <w:r>
+              <w:rPr>
+                <w:sz w:val="17"/>
+              </w:rPr>
+              <w:t>+0.66 [−0.62, +1.94]</w:t>
+            </w:r>
+          </w:p>
+        </w:tc>
+      </w:tr>
+      <w:tr>
+        <w:tc>
+          <w:tcPr>
+            <w:tcW w:type="dxa" w:w="1040"/>
+          </w:tcPr>
+          <w:p>
+            <w:pPr>
+              <w:spacing w:after="0" w:before="0"/>
+              <w:jc w:val="left"/>
+            </w:pPr>
+            <w:r>
+              <w:rPr>
+                <w:sz w:val="17"/>
+              </w:rPr>
+            </w:r>
+            <w:r>
+              <w:rPr>
+                <w:sz w:val="17"/>
+              </w:rPr>
+              <w:t>S4b</w:t>
+            </w:r>
+          </w:p>
+        </w:tc>
+        <w:tc>
+          <w:tcPr>
+            <w:tcW w:type="dxa" w:w="1040"/>
+          </w:tcPr>
+          <w:p>
+            <w:pPr>
+              <w:spacing w:after="0" w:before="0"/>
+              <w:jc w:val="center"/>
+            </w:pPr>
+            <w:r>
+              <w:rPr>
+                <w:sz w:val="17"/>
+              </w:rPr>
+            </w:r>
+            <w:r>
+              <w:rPr>
+                <w:sz w:val="17"/>
+              </w:rPr>
+              <w:t>4</w:t>
+            </w:r>
+          </w:p>
+        </w:tc>
+        <w:tc>
+          <w:tcPr>
+            <w:tcW w:type="dxa" w:w="1040"/>
+          </w:tcPr>
+          <w:p>
+            <w:pPr>
+              <w:spacing w:after="0" w:before="0"/>
+              <w:jc w:val="center"/>
+            </w:pPr>
+            <w:r>
+              <w:rPr>
+                <w:sz w:val="17"/>
+              </w:rPr>
+            </w:r>
+            <w:r>
+              <w:rPr>
+                <w:sz w:val="17"/>
+              </w:rPr>
+              <w:t>1.86 s</w:t>
+            </w:r>
+          </w:p>
+        </w:tc>
+        <w:tc>
+          <w:tcPr>
+            <w:tcW w:type="dxa" w:w="1040"/>
+          </w:tcPr>
+          <w:p>
+            <w:pPr>
+              <w:spacing w:after="0" w:before="0"/>
+              <w:jc w:val="center"/>
+            </w:pPr>
+            <w:r>
+              <w:rPr>
+                <w:sz w:val="17"/>
+              </w:rPr>
+            </w:r>
+            <w:r>
+              <w:rPr>
+                <w:sz w:val="17"/>
+              </w:rPr>
+              <w:t>+0.0066 [+0.0029, +0.0102]</w:t>
+            </w:r>
+          </w:p>
+        </w:tc>
+        <w:tc>
+          <w:tcPr>
+            <w:tcW w:type="dxa" w:w="1040"/>
+          </w:tcPr>
+          <w:p>
+            <w:pPr>
+              <w:spacing w:after="0" w:before="0"/>
+              <w:jc w:val="center"/>
+            </w:pPr>
+            <w:r>
+              <w:rPr>
+                <w:sz w:val="17"/>
+              </w:rPr>
+            </w:r>
+            <w:r>
+              <w:rPr>
+                <w:sz w:val="17"/>
+              </w:rPr>
+              <w:t>+0.0146</w:t>
+            </w:r>
+          </w:p>
+        </w:tc>
+        <w:tc>
+          <w:tcPr>
+            <w:tcW w:type="dxa" w:w="1040"/>
+          </w:tcPr>
+          <w:p>
+            <w:pPr>
+              <w:spacing w:after="0" w:before="0"/>
+              <w:jc w:val="center"/>
+            </w:pPr>
+            <w:r>
+              <w:rPr>
+                <w:sz w:val="17"/>
+              </w:rPr>
+            </w:r>
+            <w:r>
+              <w:rPr>
+                <w:sz w:val="17"/>
+              </w:rPr>
+              <w:t>−0.364</w:t>
+            </w:r>
+          </w:p>
+        </w:tc>
+        <w:tc>
+          <w:tcPr>
+            <w:tcW w:type="dxa" w:w="1040"/>
+          </w:tcPr>
+          <w:p>
+            <w:pPr>
+              <w:spacing w:after="0" w:before="0"/>
+              <w:jc w:val="center"/>
+            </w:pPr>
+            <w:r>
+              <w:rPr>
+                <w:sz w:val="17"/>
+              </w:rPr>
+            </w:r>
+            <w:r>
+              <w:rPr>
+                <w:sz w:val="17"/>
+              </w:rPr>
+              <w:t>within ±5%</w:t>
+            </w:r>
+          </w:p>
+        </w:tc>
+        <w:tc>
+          <w:tcPr>
+            <w:tcW w:type="dxa" w:w="1040"/>
+          </w:tcPr>
+          <w:p>
+            <w:pPr>
+              <w:spacing w:after="0" w:before="0"/>
+              <w:jc w:val="center"/>
+            </w:pPr>
+            <w:r>
+              <w:rPr>
+                <w:sz w:val="17"/>
+              </w:rPr>
+            </w:r>
+            <w:r>
+              <w:rPr>
+                <w:sz w:val="17"/>
+              </w:rPr>
+              <w:t>+8% [+4, +11]</w:t>
+            </w:r>
+          </w:p>
+        </w:tc>
+        <w:tc>
+          <w:tcPr>
+            <w:tcW w:type="dxa" w:w="1040"/>
+          </w:tcPr>
+          <w:p>
+            <w:pPr>
+              <w:spacing w:after="0" w:before="0"/>
+              <w:jc w:val="center"/>
+            </w:pPr>
+            <w:r>
+              <w:rPr>
+                <w:sz w:val="17"/>
+              </w:rPr>
+            </w:r>
+            <w:r>
+              <w:rPr>
+                <w:sz w:val="17"/>
+              </w:rPr>
+              <w:t>—</w:t>
+            </w:r>
+          </w:p>
+        </w:tc>
+      </w:tr>
+      <w:tr>
+        <w:tc>
+          <w:tcPr>
+            <w:tcW w:type="dxa" w:w="1040"/>
+          </w:tcPr>
+          <w:p>
+            <w:pPr>
+              <w:spacing w:after="0" w:before="0"/>
+              <w:jc w:val="left"/>
+            </w:pPr>
+            <w:r>
+              <w:rPr>
+                <w:sz w:val="17"/>
+              </w:rPr>
+            </w:r>
+            <w:r>
+              <w:rPr>
+                <w:sz w:val="17"/>
+              </w:rPr>
+              <w:t>S5b</w:t>
+            </w:r>
+          </w:p>
+        </w:tc>
+        <w:tc>
+          <w:tcPr>
+            <w:tcW w:type="dxa" w:w="1040"/>
+          </w:tcPr>
+          <w:p>
+            <w:pPr>
+              <w:spacing w:after="0" w:before="0"/>
+              <w:jc w:val="center"/>
+            </w:pPr>
+            <w:r>
+              <w:rPr>
+                <w:sz w:val="17"/>
+              </w:rPr>
+            </w:r>
+            <w:r>
+              <w:rPr>
+                <w:sz w:val="17"/>
+              </w:rPr>
+              <w:t>5</w:t>
+            </w:r>
+          </w:p>
+        </w:tc>
+        <w:tc>
+          <w:tcPr>
+            <w:tcW w:type="dxa" w:w="1040"/>
+          </w:tcPr>
+          <w:p>
+            <w:pPr>
+              <w:spacing w:after="0" w:before="0"/>
+              <w:jc w:val="center"/>
+            </w:pPr>
+            <w:r>
+              <w:rPr>
+                <w:sz w:val="17"/>
+              </w:rPr>
+            </w:r>
+            <w:r>
+              <w:rPr>
+                <w:sz w:val="17"/>
+              </w:rPr>
+              <w:t>2.08 s</w:t>
+            </w:r>
+          </w:p>
+        </w:tc>
+        <w:tc>
+          <w:tcPr>
+            <w:tcW w:type="dxa" w:w="1040"/>
+          </w:tcPr>
+          <w:p>
+            <w:pPr>
+              <w:spacing w:after="0" w:before="0"/>
+              <w:jc w:val="center"/>
+            </w:pPr>
+            <w:r>
+              <w:rPr>
+                <w:sz w:val="17"/>
+              </w:rPr>
+            </w:r>
+            <w:r>
+              <w:rPr>
+                <w:sz w:val="17"/>
+              </w:rPr>
+              <w:t>+0.0048 [+0.0011, +0.0085]</w:t>
+            </w:r>
+          </w:p>
+        </w:tc>
+        <w:tc>
+          <w:tcPr>
+            <w:tcW w:type="dxa" w:w="1040"/>
+          </w:tcPr>
+          <w:p>
+            <w:pPr>
+              <w:spacing w:after="0" w:before="0"/>
+              <w:jc w:val="center"/>
+            </w:pPr>
+            <w:r>
+              <w:rPr>
+                <w:sz w:val="17"/>
+              </w:rPr>
+            </w:r>
+            <w:r>
+              <w:rPr>
+                <w:sz w:val="17"/>
+              </w:rPr>
+              <w:t>+0.0151</w:t>
+            </w:r>
+          </w:p>
+        </w:tc>
+        <w:tc>
+          <w:tcPr>
+            <w:tcW w:type="dxa" w:w="1040"/>
+          </w:tcPr>
+          <w:p>
+            <w:pPr>
+              <w:spacing w:after="0" w:before="0"/>
+              <w:jc w:val="center"/>
+            </w:pPr>
+            <w:r>
+              <w:rPr>
+                <w:sz w:val="17"/>
+              </w:rPr>
+            </w:r>
+            <w:r>
+              <w:rPr>
+                <w:sz w:val="17"/>
+              </w:rPr>
+              <w:t>−0.311 [−0.397, −0.225]</w:t>
+            </w:r>
+          </w:p>
+        </w:tc>
+        <w:tc>
+          <w:tcPr>
+            <w:tcW w:type="dxa" w:w="1040"/>
+          </w:tcPr>
+          <w:p>
+            <w:pPr>
+              <w:spacing w:after="0" w:before="0"/>
+              <w:jc w:val="center"/>
+            </w:pPr>
+            <w:r>
+              <w:rPr>
+                <w:sz w:val="17"/>
+              </w:rPr>
+            </w:r>
+            <w:r>
+              <w:rPr>
+                <w:sz w:val="17"/>
+              </w:rPr>
+              <w:t>within ±5%</w:t>
+            </w:r>
+          </w:p>
+        </w:tc>
+        <w:tc>
+          <w:tcPr>
+            <w:tcW w:type="dxa" w:w="1040"/>
+          </w:tcPr>
+          <w:p>
+            <w:pPr>
+              <w:spacing w:after="0" w:before="0"/>
+              <w:jc w:val="center"/>
+            </w:pPr>
+            <w:r>
+              <w:rPr>
+                <w:sz w:val="17"/>
+              </w:rPr>
+            </w:r>
+            <w:r>
+              <w:rPr>
+                <w:sz w:val="17"/>
+              </w:rPr>
+              <w:t>+10% [+6, +14]</w:t>
+            </w:r>
+          </w:p>
+        </w:tc>
+        <w:tc>
+          <w:tcPr>
+            <w:tcW w:type="dxa" w:w="1040"/>
+          </w:tcPr>
+          <w:p>
+            <w:pPr>
+              <w:spacing w:after="0" w:before="0"/>
+              <w:jc w:val="center"/>
+            </w:pPr>
+            <w:r>
+              <w:rPr>
+                <w:sz w:val="17"/>
+              </w:rPr>
+            </w:r>
+            <w:r>
+              <w:rPr>
+                <w:sz w:val="17"/>
+              </w:rPr>
+              <w:t>−0.75 [−2.25, +0.75]</w:t>
+            </w:r>
+          </w:p>
+        </w:tc>
+      </w:tr>
+      <w:tr>
+        <w:tc>
+          <w:tcPr>
+            <w:tcW w:type="dxa" w:w="1040"/>
+            <w:tcBorders>
+              <w:bottom w:val="single" w:sz="8" w:color="000000"/>
+            </w:tcBorders>
+          </w:tcPr>
+          <w:p>
+            <w:pPr>
+              <w:spacing w:after="0" w:before="0"/>
+              <w:jc w:val="left"/>
+            </w:pPr>
+            <w:r>
+              <w:rPr>
+                <w:sz w:val="17"/>
+              </w:rPr>
+            </w:r>
+            <w:r>
+              <w:rPr>
+                <w:sz w:val="17"/>
+              </w:rPr>
+              <w:t>H4b (precise mode)</w:t>
+            </w:r>
+          </w:p>
+        </w:tc>
+        <w:tc>
+          <w:tcPr>
+            <w:tcW w:type="dxa" w:w="1040"/>
+            <w:tcBorders>
+              <w:bottom w:val="single" w:sz="8" w:color="000000"/>
+            </w:tcBorders>
+          </w:tcPr>
+          <w:p>
+            <w:pPr>
+              <w:spacing w:after="0" w:before="0"/>
+              <w:jc w:val="center"/>
+            </w:pPr>
+            <w:r>
+              <w:rPr>
+                <w:sz w:val="17"/>
+              </w:rPr>
+            </w:r>
+            <w:r>
+              <w:rPr>
+                <w:sz w:val="17"/>
+              </w:rPr>
+              <w:t>4</w:t>
+            </w:r>
+          </w:p>
+        </w:tc>
+        <w:tc>
+          <w:tcPr>
+            <w:tcW w:type="dxa" w:w="1040"/>
+            <w:tcBorders>
+              <w:bottom w:val="single" w:sz="8" w:color="000000"/>
+            </w:tcBorders>
+          </w:tcPr>
+          <w:p>
+            <w:pPr>
+              <w:spacing w:after="0" w:before="0"/>
+              <w:jc w:val="center"/>
+            </w:pPr>
+            <w:r>
+              <w:rPr>
+                <w:sz w:val="17"/>
+              </w:rPr>
+            </w:r>
+            <w:r>
+              <w:rPr>
+                <w:sz w:val="17"/>
+              </w:rPr>
+              <w:t>~1.9 s</w:t>
+            </w:r>
+          </w:p>
+        </w:tc>
+        <w:tc>
+          <w:tcPr>
+            <w:tcW w:type="dxa" w:w="1040"/>
+            <w:tcBorders>
+              <w:bottom w:val="single" w:sz="8" w:color="000000"/>
+            </w:tcBorders>
+          </w:tcPr>
+          <w:p>
+            <w:pPr>
+              <w:spacing w:after="0" w:before="0"/>
+              <w:jc w:val="center"/>
+            </w:pPr>
+            <w:r>
+              <w:rPr>
+                <w:sz w:val="17"/>
+              </w:rPr>
+            </w:r>
+            <w:r>
+              <w:rPr>
+                <w:sz w:val="17"/>
+              </w:rPr>
+              <w:t>−0.0062 [−0.0084, −0.0040]</w:t>
+            </w:r>
+          </w:p>
+        </w:tc>
+        <w:tc>
+          <w:tcPr>
+            <w:tcW w:type="dxa" w:w="1040"/>
+            <w:tcBorders>
+              <w:bottom w:val="single" w:sz="8" w:color="000000"/>
+            </w:tcBorders>
+          </w:tcPr>
+          <w:p>
+            <w:pPr>
+              <w:spacing w:after="0" w:before="0"/>
+              <w:jc w:val="center"/>
+            </w:pPr>
+            <w:r>
+              <w:rPr>
+                <w:sz w:val="17"/>
+              </w:rPr>
+            </w:r>
+            <w:r>
+              <w:rPr>
+                <w:sz w:val="17"/>
+              </w:rPr>
+              <w:t>+0.0109</w:t>
+            </w:r>
+          </w:p>
+        </w:tc>
+        <w:tc>
+          <w:tcPr>
+            <w:tcW w:type="dxa" w:w="1040"/>
+            <w:tcBorders>
+              <w:bottom w:val="single" w:sz="8" w:color="000000"/>
+            </w:tcBorders>
+          </w:tcPr>
+          <w:p>
+            <w:pPr>
+              <w:spacing w:after="0" w:before="0"/>
+              <w:jc w:val="center"/>
+            </w:pPr>
+            <w:r>
+              <w:rPr>
+                <w:sz w:val="17"/>
+              </w:rPr>
+            </w:r>
+            <w:r>
+              <w:rPr>
+                <w:sz w:val="17"/>
+              </w:rPr>
+              <w:t>+0.469 [+0.377, +0.562]</w:t>
+            </w:r>
+          </w:p>
+        </w:tc>
+        <w:tc>
+          <w:tcPr>
+            <w:tcW w:type="dxa" w:w="1040"/>
+            <w:tcBorders>
+              <w:bottom w:val="single" w:sz="8" w:color="000000"/>
+            </w:tcBorders>
+          </w:tcPr>
+          <w:p>
+            <w:pPr>
+              <w:spacing w:after="0" w:before="0"/>
+              <w:jc w:val="center"/>
+            </w:pPr>
+            <w:r>
+              <w:rPr>
+                <w:sz w:val="17"/>
+              </w:rPr>
+            </w:r>
+            <w:r>
+              <w:rPr>
+                <w:sz w:val="17"/>
+              </w:rPr>
+              <w:t>−8%</w:t>
+            </w:r>
+          </w:p>
+        </w:tc>
+        <w:tc>
+          <w:tcPr>
+            <w:tcW w:type="dxa" w:w="1040"/>
+            <w:tcBorders>
+              <w:bottom w:val="single" w:sz="8" w:color="000000"/>
+            </w:tcBorders>
+          </w:tcPr>
+          <w:p>
+            <w:pPr>
+              <w:spacing w:after="0" w:before="0"/>
+              <w:jc w:val="center"/>
+            </w:pPr>
+            <w:r>
+              <w:rPr>
+                <w:sz w:val="17"/>
+              </w:rPr>
+            </w:r>
+            <w:r>
+              <w:rPr>
+                <w:sz w:val="17"/>
+              </w:rPr>
+              <w:t>−33%</w:t>
+            </w:r>
+          </w:p>
+        </w:tc>
+        <w:tc>
+          <w:tcPr>
+            <w:tcW w:type="dxa" w:w="1040"/>
+            <w:tcBorders>
+              <w:bottom w:val="single" w:sz="8" w:color="000000"/>
+            </w:tcBorders>
+          </w:tcPr>
+          <w:p>
+            <w:pPr>
+              <w:spacing w:after="0" w:before="0"/>
+              <w:jc w:val="center"/>
+            </w:pPr>
+            <w:r>
+              <w:rPr>
+                <w:sz w:val="17"/>
+              </w:rPr>
+            </w:r>
+            <w:r>
+              <w:rPr>
+                <w:sz w:val="17"/>
+              </w:rPr>
+              <w:t>+1.00 [+0.12, +1.89]</w:t>
+            </w:r>
+          </w:p>
+        </w:tc>
+      </w:tr>
+    </w:tbl>
+    <w:p>
+      <w:pPr>
+        <w:spacing w:after="40"/>
+      </w:pPr>
+    </w:p>
+    <w:p>
+      <w:pPr>
+        <w:jc w:val="both"/>
+      </w:pPr>
+      <w:r>
+        <w:t>No configuration passes every strict margin; the study yields a dial instead. The 3-step student is the mode for sampling futures: all perceptual and diversity margins pass, at 1.64 s. The 5-step schedule is the mode for sensor-level depth, at 2.08 s. The hybrid is a precise readout mode whose depth is below the teacher's, at the price of keeping the teacher UNet in memory. Our proposed use is to plan with the diverse mode and then apply one teacher step to the selected future for metric depth, at about +0.2 s.</w:t>
+      </w:r>
+    </w:p>
+    <w:p>
+      <w:pPr>
+        <w:jc w:val="both"/>
+      </w:pPr>
+      <w:r>
+        <w:t>For context, three training seeds of the recipe span 0.003 AbsRel and 0.7 cm of gripper centroid error, so training-side differences below that scale are not interpretable from single runs; the inference-side comparisons above reuse one checkpoint and are unaffected.</w:t>
+      </w:r>
+    </w:p>
+    <w:p>
+      <w:pPr>
+        <w:jc w:val="both"/>
+      </w:pPr>
+      <w:r>
+        <w:t>As a correction to an earlier estimate: with 120 view-samples the gripper centroid difference of the main student is +0.66 cm [−0.62, +1.94], and the 20-sample interval reported in Appendix A.6 (+2.0 [+0.3, +3.7]) did not replicate; we keep both numbers as a caution on small-sample region metrics.</w:t>
+      </w:r>
+    </w:p>
+    <w:p>
+      <w:pPr>
+        <w:pStyle w:val="Heading1"/>
+      </w:pPr>
+      <w:r>
+        <w:t>5 Limitation</w:t>
+      </w:r>
+    </w:p>
+    <w:p>
+      <w:pPr>
+        <w:jc w:val="both"/>
+      </w:pPr>
+      <w:r>
+        <w:t>All measurements come from one task (PlaceAppleFromBowlIntoBin), four inference episodes, 60 samples (120 view-samples) for the final numbers, and one RTX 5090; the absolute numbers may not transfer to other tasks or to real robot data. The 3-step student is not equal to the teacher: its remaining gaps are AbsRel +0.0133 (the 5-step configuration of Section 4.6 passes the practical margin, at 2.08 s) and the strict LPIPS margin (+0.011 to +0.018 across configurations, below the perceptual threshold), and the per-view anchor reduces but does not remove the right-view gap. The 1-step student halves diversity (0.0117) and raises LPIPS to 0.177, so it does not meet our quality bar. Only the quasi-static budget of 2 s is met. The humanoid (0.3-0.5 s) and dynamic (0.1 s) budgets are not, because the conditioner (0.30 s) and VAE decoders (0.33 s) form a fixed cost of 0.63 s that step reduction cannot touch, and the three UNet calls still take 0.55 s; reducing these requires quantization such as SVDQuant (Li et al., 2025) or a lower resolution, which we did not try. We have no policy-level evaluation: Geo4D's closed-loop success rates (Liu et al., 2025, Table 2) require the LBM simulator, a pose tracker, and a policy interface that are not in the released code, so the claim that a faster model enables closed-loop planning remains untested (Appendix A.6). The components we use, DMD (Yin et al., 2024a; 2024b), re-noising few-step sampling, bf16, and torch.compile, are existing techniques; what is new is the geometry-aware measurement and the anchor. A self-anchored training loss that applies the same calibration during training (run 6d, Section 4.5) fixes the raw depth scale (0.175 to 0.098) and the whole-image AbsRel gap (+0.011), but degrades the moving regions a policy reads (gripper centroid error +3.1 cm against the teacher on the 20-sample protocol, p=0.009, whereas the main student passes the practical 2 cm margin on 60 samples), and a variant that excludes the robot pixels from the loss does not repair this; closing the right-view and moving-region gaps without this trade-off remains open. Finally, the 60-sample protocol (120 view-samples) was run for the final numbers; its minimal detectable AbsRel difference of about 0.006 still exceeds the strict 0.005 margin of Section 4.1, so showing equivalence at that margin would need a still larger sample, which we have not run.</w:t>
       </w:r>
     </w:p>
     <w:p>
@@ -11660,7 +12834,7 @@
         <w:jc w:val="both"/>
       </w:pPr>
       <w:r>
-        <w:t>Two caveats apply. First, the ground-truth mask is applied to the prediction, so when the predicted arm is displaced the mask covers background pixels and the centroid jumps; the teacher's own error of about 12 cm is inflated by this mask mismatch and by the multimodal future, and only differences between methods are interpretable. Second, with 40 view-samples the minimal detectable effects are about 3 cm for the gripper centroid, 2.9 cm for the apple centroid, and 0.039 for gripper AbsRel. With these caveats, the whole-image AbsRel gap of +0.015 (Section 4.3) comes from the static background, where the student's difference is the same +0.015 (p&lt;0.001); on the gripper and apple regions the student is not statistically distinguishable from the teacher by the Wilcoxon test, but its gripper centroid error is 2.0 cm higher with a 90% confidence interval [+0.3, +3.7] that excludes zero, which sits at the practical 2 cm margin of Section 4.1 and should be read as a likely small degradation, not as equality.</w:t>
+        <w:t>Two caveats apply. First, the ground-truth mask is applied to the prediction, so when the predicted arm is displaced the mask covers background pixels and the centroid jumps; the teacher's own error of about 12 cm is inflated by this mask mismatch and by the multimodal future, and only differences between methods are interpretable. Second, with 40 view-samples the minimal detectable effects are about 3 cm for the gripper centroid, 2.9 cm for the apple centroid, and 0.039 for gripper AbsRel. With these caveats, the whole-image AbsRel gap of +0.015 (Section 4.3) comes from the static background, where the student's difference is the same +0.015 (p&lt;0.001); on the gripper and apple regions the student is not statistically distinguishable from the teacher by the Wilcoxon test, but its gripper centroid error is 2.0 cm higher with a 90% confidence interval [+0.3, +3.7] that excludes zero, which sits at the practical 2 cm margin of Section 4.1 and should be read as a likely small degradation, not as equality. On the 60-sample rerun of Section 4.6, however, the main student's gripper centroid difference is +0.66 cm [−0.62, +1.94] and the 5-step configuration's is −0.75 cm [−2.25, +0.75]; the 20-sample degradation above did not replicate, underscoring the small-sample caveat.</w:t>
       </w:r>
     </w:p>
     <w:p>

</xml_diff>